<commit_message>
[FIX] synchronize thesis table of contents page numbers
</commit_message>
<xml_diff>
--- a/khoa-luan.docx
+++ b/khoa-luan.docx
@@ -1501,7 +1501,7 @@
                 <w:noProof/>
                 <w:webHidden/>
               </w:rPr>
-              <w:t>iv</w:t>
+              <w:t>viii</w:t>
             </w:r>
             <w:r>
               <w:rPr>
@@ -1572,7 +1572,7 @@
                 <w:noProof/>
                 <w:webHidden/>
               </w:rPr>
-              <w:t>iv</w:t>
+              <w:t>viii</w:t>
             </w:r>
             <w:r>
               <w:rPr>
@@ -1643,7 +1643,7 @@
                 <w:noProof/>
                 <w:webHidden/>
               </w:rPr>
-              <w:t>vi</w:t>
+              <w:t>x</w:t>
             </w:r>
             <w:r>
               <w:rPr>
@@ -4989,7 +4989,7 @@
                 <w:noProof/>
                 <w:webHidden/>
               </w:rPr>
-              <w:t>20</w:t>
+              <w:t>19</w:t>
             </w:r>
             <w:r>
               <w:rPr>
@@ -6551,7 +6551,7 @@
                 <w:noProof/>
                 <w:webHidden/>
               </w:rPr>
-              <w:t>29</w:t>
+              <w:t>30</w:t>
             </w:r>
             <w:r>
               <w:rPr>
@@ -6622,7 +6622,7 @@
                 <w:noProof/>
                 <w:webHidden/>
               </w:rPr>
-              <w:t>29</w:t>
+              <w:t>30</w:t>
             </w:r>
             <w:r>
               <w:rPr>
@@ -6693,7 +6693,7 @@
                 <w:noProof/>
                 <w:webHidden/>
               </w:rPr>
-              <w:t>29</w:t>
+              <w:t>30</w:t>
             </w:r>
             <w:r>
               <w:rPr>
@@ -6764,7 +6764,7 @@
                 <w:noProof/>
                 <w:webHidden/>
               </w:rPr>
-              <w:t>29</w:t>
+              <w:t>30</w:t>
             </w:r>
             <w:r>
               <w:rPr>
@@ -6835,7 +6835,7 @@
                 <w:noProof/>
                 <w:webHidden/>
               </w:rPr>
-              <w:t>30</w:t>
+              <w:t>31</w:t>
             </w:r>
             <w:r>
               <w:rPr>
@@ -6906,7 +6906,7 @@
                 <w:noProof/>
                 <w:webHidden/>
               </w:rPr>
-              <w:t>31</w:t>
+              <w:t>32</w:t>
             </w:r>
             <w:r>
               <w:rPr>
@@ -6977,7 +6977,7 @@
                 <w:noProof/>
                 <w:webHidden/>
               </w:rPr>
-              <w:t>32</w:t>
+              <w:t>33</w:t>
             </w:r>
             <w:r>
               <w:rPr>
@@ -7048,7 +7048,7 @@
                 <w:noProof/>
                 <w:webHidden/>
               </w:rPr>
-              <w:t>32</w:t>
+              <w:t>33</w:t>
             </w:r>
             <w:r>
               <w:rPr>
@@ -7119,7 +7119,7 @@
                 <w:noProof/>
                 <w:webHidden/>
               </w:rPr>
-              <w:t>32</w:t>
+              <w:t>33</w:t>
             </w:r>
             <w:r>
               <w:rPr>
@@ -7190,7 +7190,7 @@
                 <w:noProof/>
                 <w:webHidden/>
               </w:rPr>
-              <w:t>33</w:t>
+              <w:t>34</w:t>
             </w:r>
             <w:r>
               <w:rPr>
@@ -7261,7 +7261,7 @@
                 <w:noProof/>
                 <w:webHidden/>
               </w:rPr>
-              <w:t>33</w:t>
+              <w:t>34</w:t>
             </w:r>
             <w:r>
               <w:rPr>
@@ -7332,7 +7332,7 @@
                 <w:noProof/>
                 <w:webHidden/>
               </w:rPr>
-              <w:t>33</w:t>
+              <w:t>34</w:t>
             </w:r>
             <w:r>
               <w:rPr>
@@ -7403,7 +7403,7 @@
                 <w:noProof/>
                 <w:webHidden/>
               </w:rPr>
-              <w:t>36</w:t>
+              <w:t>37</w:t>
             </w:r>
             <w:r>
               <w:rPr>
@@ -7474,7 +7474,7 @@
                 <w:noProof/>
                 <w:webHidden/>
               </w:rPr>
-              <w:t>36</w:t>
+              <w:t>37</w:t>
             </w:r>
             <w:r>
               <w:rPr>
@@ -7545,7 +7545,7 @@
                 <w:noProof/>
                 <w:webHidden/>
               </w:rPr>
-              <w:t>36</w:t>
+              <w:t>37</w:t>
             </w:r>
             <w:r>
               <w:rPr>
@@ -7616,7 +7616,7 @@
                 <w:noProof/>
                 <w:webHidden/>
               </w:rPr>
-              <w:t>37</w:t>
+              <w:t>38</w:t>
             </w:r>
             <w:r>
               <w:rPr>
@@ -7687,7 +7687,7 @@
                 <w:noProof/>
                 <w:webHidden/>
               </w:rPr>
-              <w:t>39</w:t>
+              <w:t>40</w:t>
             </w:r>
             <w:r>
               <w:rPr>
@@ -7758,7 +7758,7 @@
                 <w:noProof/>
                 <w:webHidden/>
               </w:rPr>
-              <w:t>40</w:t>
+              <w:t>41</w:t>
             </w:r>
             <w:r>
               <w:rPr>
@@ -7829,7 +7829,7 @@
                 <w:noProof/>
                 <w:webHidden/>
               </w:rPr>
-              <w:t>40</w:t>
+              <w:t>41</w:t>
             </w:r>
             <w:r>
               <w:rPr>
@@ -7900,7 +7900,7 @@
                 <w:noProof/>
                 <w:webHidden/>
               </w:rPr>
-              <w:t>41</w:t>
+              <w:t>42</w:t>
             </w:r>
             <w:r>
               <w:rPr>
@@ -7971,7 +7971,7 @@
                 <w:noProof/>
                 <w:webHidden/>
               </w:rPr>
-              <w:t>42</w:t>
+              <w:t>43</w:t>
             </w:r>
             <w:r>
               <w:rPr>
@@ -8255,7 +8255,7 @@
                 <w:noProof/>
                 <w:webHidden/>
               </w:rPr>
-              <w:t>43</w:t>
+              <w:t>44</w:t>
             </w:r>
             <w:r>
               <w:rPr>
@@ -8326,7 +8326,7 @@
                 <w:noProof/>
                 <w:webHidden/>
               </w:rPr>
-              <w:t>43</w:t>
+              <w:t>44</w:t>
             </w:r>
             <w:r>
               <w:rPr>
@@ -8397,7 +8397,7 @@
                 <w:noProof/>
                 <w:webHidden/>
               </w:rPr>
-              <w:t>43</w:t>
+              <w:t>44</w:t>
             </w:r>
             <w:r>
               <w:rPr>
@@ -8681,7 +8681,7 @@
                 <w:noProof/>
                 <w:webHidden/>
               </w:rPr>
-              <w:t>44</w:t>
+              <w:t>45</w:t>
             </w:r>
             <w:r>
               <w:rPr>
@@ -8752,7 +8752,7 @@
                 <w:noProof/>
                 <w:webHidden/>
               </w:rPr>
-              <w:t>44</w:t>
+              <w:t>45</w:t>
             </w:r>
             <w:r>
               <w:rPr>
@@ -8823,7 +8823,7 @@
                 <w:noProof/>
                 <w:webHidden/>
               </w:rPr>
-              <w:t>44</w:t>
+              <w:t>45</w:t>
             </w:r>
             <w:r>
               <w:rPr>
@@ -9107,7 +9107,7 @@
                 <w:noProof/>
                 <w:webHidden/>
               </w:rPr>
-              <w:t>45</w:t>
+              <w:t>46</w:t>
             </w:r>
             <w:r>
               <w:rPr>
@@ -9249,7 +9249,7 @@
                 <w:noProof/>
                 <w:webHidden/>
               </w:rPr>
-              <w:t>47</w:t>
+              <w:t>48</w:t>
             </w:r>
             <w:r>
               <w:rPr>
@@ -9320,7 +9320,7 @@
                 <w:noProof/>
                 <w:webHidden/>
               </w:rPr>
-              <w:t>47</w:t>
+              <w:t>48</w:t>
             </w:r>
             <w:r>
               <w:rPr>
@@ -9391,7 +9391,7 @@
                 <w:noProof/>
                 <w:webHidden/>
               </w:rPr>
-              <w:t>48</w:t>
+              <w:t>49</w:t>
             </w:r>
             <w:r>
               <w:rPr>
@@ -9462,7 +9462,7 @@
                 <w:noProof/>
                 <w:webHidden/>
               </w:rPr>
-              <w:t>48</w:t>
+              <w:t>49</w:t>
             </w:r>
             <w:r>
               <w:rPr>
@@ -9533,7 +9533,7 @@
                 <w:noProof/>
                 <w:webHidden/>
               </w:rPr>
-              <w:t>48</w:t>
+              <w:t>49</w:t>
             </w:r>
             <w:r>
               <w:rPr>
@@ -9604,7 +9604,7 @@
                 <w:noProof/>
                 <w:webHidden/>
               </w:rPr>
-              <w:t>49</w:t>
+              <w:t>50</w:t>
             </w:r>
             <w:r>
               <w:rPr>
@@ -9675,7 +9675,7 @@
                 <w:noProof/>
                 <w:webHidden/>
               </w:rPr>
-              <w:t>50</w:t>
+              <w:t>51</w:t>
             </w:r>
             <w:r>
               <w:rPr>
@@ -9746,7 +9746,7 @@
                 <w:noProof/>
                 <w:webHidden/>
               </w:rPr>
-              <w:t>51</w:t>
+              <w:t>52</w:t>
             </w:r>
             <w:r>
               <w:rPr>

</xml_diff>

<commit_message>
[FIX] normalize figure and table captions
</commit_message>
<xml_diff>
--- a/khoa-luan.docx
+++ b/khoa-luan.docx
@@ -5841,7 +5841,7 @@
                 <w:noProof/>
                 <w:webHidden/>
               </w:rPr>
-              <w:t>26</w:t>
+              <w:t>25</w:t>
             </w:r>
             <w:r>
               <w:rPr>
@@ -14296,7 +14296,7 @@
       </w:r>
       <w:r>
         <w:tab/>
-        <w:t>31</w:t>
+        <w:t>30</w:t>
       </w:r>
     </w:p>
     <w:p>
@@ -14332,7 +14332,7 @@
       </w:r>
       <w:r>
         <w:tab/>
-        <w:t>35</w:t>
+        <w:t>34</w:t>
       </w:r>
     </w:p>
     <w:p>
@@ -16354,21 +16354,6 @@
     </w:tbl>
     <w:p>
       <w:pPr>
-        <w:pStyle w:val="Caption"/>
-        <w:keepNext/>
-        <w:spacing w:before="60" w:after="120"/>
-        <w:ind w:firstLine="0"/>
-        <w:jc w:val="center"/>
-        <w:rPr>
-          <w:bCs w:val="0"/>
-          <w:iCs/>
-          <w:color w:val="auto"/>
-          <w:szCs w:val="26"/>
-        </w:rPr>
-      </w:pPr>
-    </w:p>
-    <w:p>
-      <w:pPr>
         <w:pStyle w:val="Heading3"/>
         <w:spacing w:line="276" w:lineRule="auto"/>
         <w:rPr>
@@ -17370,15 +17355,14 @@
     </w:p>
     <w:p>
       <w:pPr>
-        <w:pStyle w:val="ListBullet"/>
-        <w:numPr>
-          <w:ilvl w:val="0"/>
-          <w:numId w:val="0"/>
-        </w:numPr>
+        <w:pStyle w:val="Caption"/>
+        <w:spacing w:before="60" w:after="120" w:line="240" w:lineRule="auto"/>
+        <w:ind w:firstLine="0"/>
         <w:jc w:val="center"/>
         <w:rPr>
           <w:lang w:val="vi-VN"/>
         </w:rPr>
+        <w:keepNext/>
       </w:pPr>
       <w:r>
         <w:rPr>
@@ -18884,21 +18868,6 @@
     </w:p>
     <w:p>
       <w:pPr>
-        <w:pStyle w:val="Caption"/>
-        <w:keepNext/>
-        <w:spacing w:before="60" w:after="120"/>
-        <w:ind w:firstLine="0"/>
-        <w:jc w:val="center"/>
-        <w:rPr>
-          <w:bCs w:val="0"/>
-          <w:iCs/>
-          <w:color w:val="auto"/>
-          <w:szCs w:val="26"/>
-        </w:rPr>
-      </w:pPr>
-    </w:p>
-    <w:p>
-      <w:pPr>
         <w:pStyle w:val="Heading3"/>
         <w:spacing w:line="276" w:lineRule="auto"/>
         <w:rPr>
@@ -20188,21 +20157,6 @@
         <w:t>Bảng 6. Các phiên ground truth được sử dụng</w:t>
       </w:r>
     </w:p>
-    <w:p>
-      <w:pPr>
-        <w:pStyle w:val="Caption"/>
-        <w:keepNext/>
-        <w:spacing w:before="60" w:after="120"/>
-        <w:ind w:firstLine="0"/>
-        <w:jc w:val="center"/>
-        <w:rPr>
-          <w:bCs w:val="0"/>
-          <w:iCs/>
-          <w:color w:val="auto"/>
-          <w:szCs w:val="26"/>
-        </w:rPr>
-      </w:pPr>
-    </w:p>
     <w:tbl>
       <w:tblPr>
         <w:tblStyle w:val="TableGrid"/>
@@ -25929,17 +25883,8 @@
     </w:p>
     <w:p>
       <w:pPr>
-        <w:pStyle w:val="Caption"/>
         <w:keepNext/>
-        <w:spacing w:before="60" w:after="120"/>
-        <w:ind w:firstLine="0"/>
-        <w:jc w:val="center"/>
-      </w:pPr>
-    </w:p>
-    <w:p>
-      <w:pPr>
-        <w:pStyle w:val="Caption"/>
-        <w:keepNext/>
+        <w:spacing w:before="0" w:after="0"/>
         <w:ind w:firstLine="0"/>
         <w:jc w:val="center"/>
         <w:rPr>

</xml_diff>

<commit_message>
[STYLE] normalize thesis paragraph formatting
</commit_message>
<xml_diff>
--- a/khoa-luan.docx
+++ b/khoa-luan.docx
@@ -4350,7 +4350,7 @@
                 <w:noProof/>
                 <w:webHidden/>
               </w:rPr>
-              <w:t>13</w:t>
+              <w:t>14</w:t>
             </w:r>
             <w:r>
               <w:rPr>
@@ -4421,7 +4421,7 @@
                 <w:noProof/>
                 <w:webHidden/>
               </w:rPr>
-              <w:t>13</w:t>
+              <w:t>14</w:t>
             </w:r>
             <w:r>
               <w:rPr>
@@ -14540,7 +14540,9 @@
     </w:p>
     <w:p>
       <w:pPr>
-        <w:ind w:firstLine="567"/>
+        <w:spacing w:line="360" w:lineRule="auto" w:before="0" w:after="0"/>
+        <w:ind w:firstLine="720"/>
+        <w:jc w:val="both"/>
       </w:pPr>
       <w:r>
         <w:t>Bệnh viện muốn biết bệnh nhân đang ở phòng nào. Kho muốn theo dõi xe nâng, dụng cụ. Nhà dưỡng lão muốn phát hiện người cao tuổi té ngã hay đi lạc. Ba ví dụ trên đều cần định vị trong nhà; các hệ thống BLE đã được nghiên cứu cho cả theo dõi chăm sóc người cao tuổi và y tế [6], [7].</w:t>
@@ -14548,7 +14550,9 @@
     </w:p>
     <w:p>
       <w:pPr>
-        <w:ind w:firstLine="567"/>
+        <w:spacing w:line="360" w:lineRule="auto" w:before="0" w:after="0"/>
+        <w:ind w:firstLine="720"/>
+        <w:jc w:val="both"/>
       </w:pPr>
       <w:r>
         <w:t>GPS không giải quyết được. Tín hiệu vệ tinh bị suy hao khi xuyên qua tường bê tông và mái kim loại; ngay cả khi thu được, sai số trong nhà lên tới hàng chục mét, không phân biệt được phòng.</w:t>
@@ -14556,7 +14560,9 @@
     </w:p>
     <w:p>
       <w:pPr>
-        <w:ind w:firstLine="567"/>
+        <w:spacing w:line="360" w:lineRule="auto" w:before="0" w:after="0"/>
+        <w:ind w:firstLine="720"/>
+        <w:jc w:val="both"/>
         <w:rPr>
           <w:lang w:val="vi-VN"/>
         </w:rPr>
@@ -14599,7 +14605,9 @@
     </w:p>
     <w:p>
       <w:pPr>
-        <w:ind w:firstLine="567"/>
+        <w:spacing w:line="360" w:lineRule="auto" w:before="0" w:after="0"/>
+        <w:ind w:firstLine="720"/>
+        <w:jc w:val="both"/>
       </w:pPr>
       <w:r>
         <w:t>Trong bốn lựa chọn, BLE beacon cân bằng nhất giữa giá và độ khả thi. BLE cũng có sẵn trên smartphone, để ngỏ hướng dùng điện thoại làm thẻ hoặc đầu đọc.</w:t>
@@ -14607,7 +14615,9 @@
     </w:p>
     <w:p>
       <w:pPr>
-        <w:ind w:firstLine="567"/>
+        <w:spacing w:line="360" w:lineRule="auto" w:before="0" w:after="0"/>
+        <w:ind w:firstLine="720"/>
+        <w:jc w:val="both"/>
       </w:pPr>
       <w:r>
         <w:t>Điểm yếu của BLE beacon truyền thống là một scanner đơn chỉ phủ một vùng hữu hạn trong nhà có tường. Muốn phủ nhiều phòng, phải triển khai nhiều scanner và có cách phối hợp dữ liệu giữa chúng. Đề tài chọn BLE Mesh để các scanner tạo mạng nhiều hop tới gateway; độ tin cậy, độ trễ và khả năng mở rộng của cơ chế relay/flooding đã được phân tích trong [1], [2], [3].</w:t>
@@ -14638,7 +14648,9 @@
     </w:p>
     <w:p>
       <w:pPr>
-        <w:ind w:firstLine="567"/>
+        <w:spacing w:line="360" w:lineRule="auto" w:before="0" w:after="0"/>
+        <w:ind w:firstLine="720"/>
+        <w:jc w:val="both"/>
       </w:pPr>
       <w:r>
         <w:t>Trong phạm vi nghiên cứu, đề tài đặt các mục tiêu sau:</w:t>
@@ -14721,7 +14733,9 @@
     </w:p>
     <w:p>
       <w:pPr>
-        <w:ind w:firstLine="567"/>
+        <w:spacing w:line="360" w:lineRule="auto" w:before="0" w:after="0"/>
+        <w:ind w:firstLine="720"/>
+        <w:jc w:val="both"/>
       </w:pPr>
       <w:r>
         <w:t>Ranh giới đề tài:</w:t>
@@ -14778,11 +14792,21 @@
       <w:bookmarkEnd w:id="41"/>
     </w:p>
     <w:p>
+      <w:pPr>
+        <w:spacing w:line="360" w:lineRule="auto" w:before="0" w:after="0"/>
+        <w:ind w:firstLine="720"/>
+        <w:jc w:val="both"/>
+      </w:pPr>
       <w:r>
         <w:t>Đề tài tập trung xây dựng tuyến thu nhận và xử lý dữ liệu từ mạng BLE Mesh, qua Gateway, đến máy chủ IoT ThingsBoard.</w:t>
       </w:r>
     </w:p>
     <w:p>
+      <w:pPr>
+        <w:spacing w:line="360" w:lineRule="auto" w:before="0" w:after="0"/>
+        <w:ind w:firstLine="720"/>
+        <w:jc w:val="both"/>
+      </w:pPr>
       <w:r>
         <w:t>Các nội dung triển khai và trình bày gồm:</w:t>
       </w:r>
@@ -14829,6 +14853,11 @@
       </w:r>
     </w:p>
     <w:p>
+      <w:pPr>
+        <w:spacing w:line="360" w:lineRule="auto" w:before="0" w:after="0"/>
+        <w:ind w:firstLine="720"/>
+        <w:jc w:val="both"/>
+      </w:pPr>
       <w:r>
         <w:t>Firmware chi tiết của Tag/Scanner và cơ chế OTA không thuộc phần triển khai cá nhân B; chúng chỉ được nhắc khi cần mô tả giao diện tích hợp hoặc kết quả chung của toàn hệ thống.</w:t>
       </w:r>
@@ -14872,7 +14901,9 @@
     </w:p>
     <w:p>
       <w:pPr>
-        <w:ind w:firstLine="567"/>
+        <w:spacing w:line="360" w:lineRule="auto" w:before="0" w:after="0"/>
+        <w:ind w:firstLine="720"/>
+        <w:jc w:val="both"/>
       </w:pPr>
       <w:r>
         <w:t>Đề tài dùng hai toolchain song song cho hai họ chip khác nhau.</w:t>
@@ -14880,7 +14911,9 @@
     </w:p>
     <w:p>
       <w:pPr>
-        <w:ind w:firstLine="567"/>
+        <w:spacing w:line="360" w:lineRule="auto" w:before="0" w:after="0"/>
+        <w:ind w:firstLine="720"/>
+        <w:jc w:val="both"/>
       </w:pPr>
       <w:r>
         <w:t>ESP-IDF là bộ công cụ phát triển chính thức của Espressif cho Scanner, Relay và Gateway, cung cấp:</w:t>
@@ -14928,7 +14961,9 @@
     </w:p>
     <w:p>
       <w:pPr>
-        <w:ind w:firstLine="567"/>
+        <w:spacing w:line="360" w:lineRule="auto" w:before="0" w:after="0"/>
+        <w:ind w:firstLine="720"/>
+        <w:jc w:val="both"/>
       </w:pPr>
       <w:r>
         <w:t>Đề tài sử dụng ESP-IDF v6.0.1 để môi trường biên dịch, FreeRTOS, Wi-Fi, TLS và API BLE Mesh nhất quán trong quá trình triển khai Gateway.</w:t>
@@ -14959,7 +14994,9 @@
     </w:p>
     <w:p>
       <w:pPr>
-        <w:ind w:firstLine="567"/>
+        <w:spacing w:line="360" w:lineRule="auto" w:before="0" w:after="0"/>
+        <w:ind w:firstLine="720"/>
+        <w:jc w:val="both"/>
       </w:pPr>
       <w:r>
         <w:t>Bảng tương ứng liệt kê phần cứng dùng trong đề tài.</w:t>
@@ -15309,7 +15346,9 @@
     </w:p>
     <w:p>
       <w:pPr>
-        <w:ind w:firstLine="567"/>
+        <w:spacing w:line="360" w:lineRule="auto" w:before="0" w:after="0"/>
+        <w:ind w:firstLine="720"/>
+        <w:jc w:val="both"/>
       </w:pPr>
       <w:r>
         <w:t>ThingsBoard Community Edition là nền tảng IoT mã nguồn mở, cung cấp:</w:t>
@@ -15357,7 +15396,9 @@
     </w:p>
     <w:p>
       <w:pPr>
-        <w:ind w:firstLine="567"/>
+        <w:spacing w:line="360" w:lineRule="auto" w:before="0" w:after="0"/>
+        <w:ind w:firstLine="720"/>
+        <w:jc w:val="both"/>
       </w:pPr>
       <w:r>
         <w:t>Đề tài tự host ThingsBoard bằng Docker Compose (thay vì dùng ThingsBoard Cloud) để có toàn quyền kiểm soát chứng chỉ TLS và cấu hình.</w:t>
@@ -15450,7 +15491,9 @@
     </w:p>
     <w:p>
       <w:pPr>
-        <w:ind w:firstLine="567"/>
+        <w:spacing w:line="360" w:lineRule="auto" w:before="0" w:after="0"/>
+        <w:ind w:firstLine="720"/>
+        <w:jc w:val="both"/>
       </w:pPr>
       <w:r>
         <w:t>Sáu chương, đi từ bối cảnh, lý thuyết đến triển khai và đánh giá:</w:t>
@@ -15506,7 +15549,9 @@
     </w:p>
     <w:p>
       <w:pPr>
-        <w:ind w:firstLine="567"/>
+        <w:spacing w:line="360" w:lineRule="auto" w:before="0" w:after="0"/>
+        <w:ind w:firstLine="720"/>
+        <w:jc w:val="both"/>
       </w:pPr>
       <w:r>
         <w:t>Kèm theo phần chính là Tóm tắt (Việt + Anh), Danh mục hình vẽ, Danh mục bảng, Danh mục viết tắt, và Tài liệu tham khảo ở cuối tài liệu.</w:t>
@@ -15562,7 +15607,9 @@
     </w:p>
     <w:p>
       <w:pPr>
-        <w:ind w:firstLine="567"/>
+        <w:spacing w:line="360" w:lineRule="auto" w:before="0" w:after="0"/>
+        <w:ind w:firstLine="720"/>
+        <w:jc w:val="both"/>
       </w:pPr>
       <w:r>
         <w:t>Định vị trong nhà đã được nghiên cứu hơn hai thập kỷ. Bốn hướng chính:</w:t>
@@ -15593,7 +15640,9 @@
     </w:p>
     <w:p>
       <w:pPr>
-        <w:ind w:firstLine="567"/>
+        <w:spacing w:line="360" w:lineRule="auto" w:before="0" w:after="0"/>
+        <w:ind w:firstLine="720"/>
+        <w:jc w:val="both"/>
       </w:pPr>
       <w:r>
         <w:t>Kỹ thuật này gồm hai pha. Ở pha ngoại tuyến, người đo khảo sát toàn bộ không gian và ghi vector RSSI từ các điểm truy cập tại từng điểm tham chiếu để xây dựng cơ sở dữ liệu “vân tay” (fingerprint) gắn với tọa độ. Ở pha trực tuyến, thiết bị đo RSSI hiện tại và so khớp với cơ sở dữ liệu, chẳng hạn bằng k-nearest neighbors, để suy ra vị trí.</w:t>
@@ -15601,7 +15650,9 @@
     </w:p>
     <w:p>
       <w:pPr>
-        <w:ind w:firstLine="567"/>
+        <w:spacing w:line="360" w:lineRule="auto" w:before="0" w:after="0"/>
+        <w:ind w:firstLine="720"/>
+        <w:jc w:val="both"/>
       </w:pPr>
       <w:r>
         <w:t>Ưu: tận dụng hạ tầng Wi-Fi sẵn có. Nhược: fingerprint xuống cấp nhanh khi bố trí AP thay đổi, sửa chữa hay thay mùa; phải khảo sát lại. Sai số trung bình 3–5 m, khó xuống mức phòng nếu phòng nhỏ.</w:t>
@@ -15632,7 +15683,9 @@
     </w:p>
     <w:p>
       <w:pPr>
-        <w:ind w:firstLine="567"/>
+        <w:spacing w:line="360" w:lineRule="auto" w:before="0" w:after="0"/>
+        <w:ind w:firstLine="720"/>
+        <w:jc w:val="both"/>
       </w:pPr>
       <w:r>
         <w:t>Tag phát advertisement định kỳ. Hai chuẩn phổ biến là iBeacon (Apple) và Eddystone (Google). Đầu quét đọc RSSI, ước lượng khoảng cách bằng log-distance path loss:</w:t>
@@ -15760,6 +15813,11 @@
       </m:oMathPara>
     </w:p>
     <w:p>
+      <w:pPr>
+        <w:spacing w:line="360" w:lineRule="auto" w:before="0" w:after="0"/>
+        <w:ind w:firstLine="720"/>
+        <w:jc w:val="both"/>
+      </w:pPr>
       <m:oMath>
         <m:sSub>
           <m:sSubPr>
@@ -15823,7 +15881,9 @@
     </w:p>
     <w:p>
       <w:pPr>
-        <w:ind w:firstLine="567"/>
+        <w:spacing w:line="360" w:lineRule="auto" w:before="0" w:after="0"/>
+        <w:ind w:firstLine="720"/>
+        <w:jc w:val="both"/>
       </w:pPr>
       <w:r>
         <w:t>Ưu điểm của BLE beacon là chi phí thấp và tiêu thụ năng lượng nhỏ. Nhược điểm là RSSI biến động do đa đường truyền, che khuất và hướng anten, do đó thường cần bộ lọc và hiệu chỉnh theo môi trường; một scanner đơn cũng khó phủ nhiều phòng cách nhau bởi tường [4], [10].</w:t>
@@ -15854,7 +15914,9 @@
     </w:p>
     <w:p>
       <w:pPr>
-        <w:ind w:firstLine="567"/>
+        <w:spacing w:line="360" w:lineRule="auto" w:before="0" w:after="0"/>
+        <w:ind w:firstLine="720"/>
+        <w:jc w:val="both"/>
       </w:pPr>
       <w:r>
         <w:t>UWB sử dụng xung có băng thông trên 500 MHz trong dải 3,1–10,6 GHz. Xung ngắn cho phép đo thời gian truyền với độ chính xác cao, nhờ đó sai số định vị có thể đạt mức centimet.</w:t>
@@ -15862,7 +15924,9 @@
     </w:p>
     <w:p>
       <w:pPr>
-        <w:ind w:firstLine="567"/>
+        <w:spacing w:line="360" w:lineRule="auto" w:before="0" w:after="0"/>
+        <w:ind w:firstLine="720"/>
+        <w:jc w:val="both"/>
       </w:pPr>
       <w:r>
         <w:t>Chip tiêu biểu: DW1000/DW3000 của DecaWave (Qorvo), U1 của Apple (AirTag), Nordic nRF9161. Định vị bằng Time Difference of Arrival (TDoA) với ít nhất 3 anchor cố định, cho tọa độ (x, y) hoặc (x, y, z).</w:t>
@@ -15870,7 +15934,9 @@
     </w:p>
     <w:p>
       <w:pPr>
-        <w:ind w:firstLine="567"/>
+        <w:spacing w:line="360" w:lineRule="auto" w:before="0" w:after="0"/>
+        <w:ind w:firstLine="720"/>
+        <w:jc w:val="both"/>
       </w:pPr>
       <w:r>
         <w:t>Ưu: độ chính xác vượt trội. Nhược: thẻ 30–50 USD, anchor 50–100 USD, phải lắp anchor riêng. Tiêu thụ pin cao hơn BLE.</w:t>
@@ -15902,7 +15968,9 @@
     </w:p>
     <w:p>
       <w:pPr>
-        <w:ind w:firstLine="567"/>
+        <w:spacing w:line="360" w:lineRule="auto" w:before="0" w:after="0"/>
+        <w:ind w:firstLine="720"/>
+        <w:jc w:val="both"/>
       </w:pPr>
       <w:r>
         <w:t>Kết hợp nhiều nguồn để bù nhược của từng loại. Ví dụ: BLE RSSI cho định vị thô, IMU cho track chuyển động ngắn giữa các beacon, Wi-Fi cho fallback. Google Fused Location Provider trên Android là hybrid ở mức phần mềm.</w:t>
@@ -15910,7 +15978,9 @@
     </w:p>
     <w:p>
       <w:pPr>
-        <w:ind w:firstLine="567"/>
+        <w:spacing w:line="360" w:lineRule="auto" w:before="0" w:after="0"/>
+        <w:ind w:firstLine="720"/>
+        <w:jc w:val="both"/>
       </w:pPr>
       <w:r>
         <w:t>Ưu: độ tin cậy cao. Nhược: phức tạp triển khai, chi phí phát triển và bảo trì lớn.</w:t>
@@ -15941,7 +16011,9 @@
     </w:p>
     <w:p>
       <w:pPr>
-        <w:ind w:firstLine="567"/>
+        <w:spacing w:line="360" w:lineRule="auto" w:before="0" w:after="0"/>
+        <w:ind w:firstLine="720"/>
+        <w:jc w:val="both"/>
       </w:pPr>
       <w:r>
         <w:t>Bảng tương ứng so sánh ba đại diện phổ biến trên thị trường.</w:t>
@@ -16377,7 +16449,9 @@
     </w:p>
     <w:p>
       <w:pPr>
-        <w:ind w:firstLine="567"/>
+        <w:spacing w:line="360" w:lineRule="auto" w:before="0" w:after="0"/>
+        <w:ind w:firstLine="720"/>
+        <w:jc w:val="both"/>
       </w:pPr>
       <w:r>
         <w:t>Ra mắt 2013, thương hiệu beacon BLE tiên phong. Sản phẩm mới (Estimote UWB Beacon) kết hợp BLE và UWB, độ chính xác cấp mét. Đi kèm SDK iOS/Android và cloud dashboard. Nhược: khóa vào cloud Estimote, không tự host, giá thẻ cao.</w:t>
@@ -16408,7 +16482,9 @@
     </w:p>
     <w:p>
       <w:pPr>
-        <w:ind w:firstLine="567"/>
+        <w:spacing w:line="360" w:lineRule="auto" w:before="0" w:after="0"/>
+        <w:ind w:firstLine="720"/>
+        <w:jc w:val="both"/>
       </w:pPr>
       <w:r>
         <w:t>Chuyên hệ thống Real-Time Location System (RTLS) cho bệnh viện và kho. Dùng BLE beacon và anchor Wi-Fi. API tích hợp với hệ thống EMR (electronic medical records). Nhược: đóng nguồn, license theo số node/tháng.</w:t>
@@ -16439,7 +16515,9 @@
     </w:p>
     <w:p>
       <w:pPr>
-        <w:ind w:firstLine="567"/>
+        <w:spacing w:line="360" w:lineRule="auto" w:before="0" w:after="0"/>
+        <w:ind w:firstLine="720"/>
+        <w:jc w:val="both"/>
       </w:pPr>
       <w:r>
         <w:t>Giải pháp cấp doanh nghiệp của HPE Aruba. Tận dụng access point Aruba làm beacon, kết hợp app smartphone. Nhược: cần AP Aruba (chi phí cao), chỉ hợp với doanh nghiệp lớn.</w:t>
@@ -16447,7 +16525,9 @@
     </w:p>
     <w:p>
       <w:pPr>
-        <w:ind w:firstLine="567"/>
+        <w:spacing w:line="360" w:lineRule="auto" w:before="0" w:after="0"/>
+        <w:ind w:firstLine="720"/>
+        <w:jc w:val="both"/>
       </w:pPr>
       <w:r>
         <w:t>Cả ba đều đóng nguồn, khóa vào hệ sinh thái riêng, license đắt khi scale. Người dùng không thể sửa thuật toán quyết định vị trí. Với ứng dụng cần tùy biến sâu (ngưỡng nhạy từng phòng, tích hợp hệ thống nội bộ), mã nguồn mở là lựa chọn phù hợp hơn.</w:t>
@@ -16493,7 +16573,9 @@
     </w:p>
     <w:p>
       <w:pPr>
-        <w:ind w:firstLine="567"/>
+        <w:spacing w:line="360" w:lineRule="auto" w:before="0" w:after="0"/>
+        <w:ind w:firstLine="720"/>
+        <w:jc w:val="both"/>
       </w:pPr>
       <w:r>
         <w:t>Bluetooth Mesh chuyển BLE từ liên kết điểm–điểm sang mạng publish/subscribe nhiều hop, dùng relay và managed flooding. Các nghiên cứu phân tích chuẩn cũng chỉ ra rằng tham số advertising/scanning và số lần relay ảnh hưởng trực tiếp đến reliability, delay và scalability [1], [3].</w:t>
@@ -16501,7 +16583,9 @@
     </w:p>
     <w:p>
       <w:pPr>
-        <w:ind w:firstLine="567"/>
+        <w:spacing w:line="360" w:lineRule="auto" w:before="0" w:after="0"/>
+        <w:ind w:firstLine="720"/>
+        <w:jc w:val="both"/>
       </w:pPr>
       <w:r>
         <w:t>Các đánh giá định lượng và thực nghiệm Bluetooth Mesh cho thấy độ trễ phụ thuộc số hop, mật độ node, chu kỳ quét và tham số retransmission; đây là cơ sở để đề tài chỉ dùng mesh cho telemetry tần suất thấp và đo lại độ trễ trên hệ thống thực [1], [2].</w:t>
@@ -16531,11 +16615,21 @@
       <w:bookmarkEnd w:id="110"/>
     </w:p>
     <w:p>
+      <w:pPr>
+        <w:spacing w:line="360" w:lineRule="auto" w:before="0" w:after="0"/>
+        <w:ind w:firstLine="720"/>
+        <w:jc w:val="both"/>
+      </w:pPr>
       <w:r>
         <w:t>Các hệ thống thương mại thường đóng kín logic server, còn nhiều mô hình thử nghiệm đặt quyết định vị trí ngay trên firmware. Cách này làm việc thay đổi ánh xạ phòng, ngưỡng hoặc thuật toán phụ thuộc vào việc biên dịch và nạp lại thiết bị.</w:t>
       </w:r>
     </w:p>
     <w:p>
+      <w:pPr>
+        <w:spacing w:line="360" w:lineRule="auto" w:before="0" w:after="0"/>
+        <w:ind w:firstLine="720"/>
+        <w:jc w:val="both"/>
+      </w:pPr>
       <w:r>
         <w:t>Khoảng trống đề tài tập trung xử lý là một Gateway tự host có ranh giới trách nhiệm rõ ràng: firmware chỉ thu nhận và chuyển telemetry; ThingsBoard chịu trách nhiệm xác định phòng, lưu trạng thái và hiển thị. Hệ thống đồng thời cần xử lý nhiều Tag độc lập và phục hồi hợp lý khi BLE Mesh, Wi-Fi hoặc MQTT gián đoạn.</w:t>
       </w:r>
@@ -16581,7 +16675,9 @@
     </w:p>
     <w:p>
       <w:pPr>
-        <w:ind w:firstLine="567"/>
+        <w:spacing w:line="360" w:lineRule="auto" w:before="0" w:after="0"/>
+        <w:ind w:firstLine="720"/>
+        <w:jc w:val="both"/>
       </w:pPr>
       <w:r>
         <w:t>BLE Mesh (chuẩn Bluetooth SIG 2017, bản 1.0.1 năm 2019) cho phép thiết bị BLE tạo mạng lưới, trong đó thông điệp có thể đi qua nhiều hop tới đích. Cơ chế này chỉ áp dụng cho tầng Scanner/Relay/Gateway; Tag không tham gia mesh, không bật chế độ thu và chỉ phát ADV một chiều để tối ưu năng lượng. [12]</w:t>
@@ -16603,7 +16699,9 @@
     </w:p>
     <w:p>
       <w:pPr>
-        <w:ind w:firstLine="567"/>
+        <w:spacing w:line="360" w:lineRule="auto" w:before="0" w:after="0"/>
+        <w:ind w:firstLine="720"/>
+        <w:jc w:val="both"/>
       </w:pPr>
       <w:r>
         <w:t>Mạng mesh gồm hai vai trò chính:</w:t>
@@ -16627,7 +16725,9 @@
     </w:p>
     <w:p>
       <w:pPr>
-        <w:ind w:firstLine="567"/>
+        <w:spacing w:line="360" w:lineRule="auto" w:before="0" w:after="0"/>
+        <w:ind w:firstLine="720"/>
+        <w:jc w:val="both"/>
       </w:pPr>
       <w:r>
         <w:t>Chuẩn định nghĩa bốn tính năng optional cho Node: Relay (forward gói của node khác), Proxy (bridge BLE Mesh sang smartphone qua GATT), Friend (đóng vai trò cache cho node LPN), Low Power Node – LPN (tiết kiệm pin cực đại). Đề tài không dùng Friend/LPN vì mọi node mesh (Scanner/Relay/Gateway) đều cắm điện; Relay được bật trên tất cả node để tăng khả năng phủ; Proxy để mặc định cho tiện debug.</w:t>
@@ -16649,7 +16749,9 @@
     </w:p>
     <w:p>
       <w:pPr>
-        <w:ind w:firstLine="567"/>
+        <w:spacing w:line="360" w:lineRule="auto" w:before="0" w:after="0"/>
+        <w:ind w:firstLine="720"/>
+        <w:jc w:val="both"/>
       </w:pPr>
       <w:r>
         <w:t>Hai lớp mã hóa độc lập:</w:t>
@@ -16673,7 +16775,9 @@
     </w:p>
     <w:p>
       <w:pPr>
-        <w:ind w:firstLine="567"/>
+        <w:spacing w:line="360" w:lineRule="auto" w:before="0" w:after="0"/>
+        <w:ind w:firstLine="720"/>
+        <w:jc w:val="both"/>
       </w:pPr>
       <w:r>
         <w:t>Đề tài dùng 1 NetKey và 1 AppKey mỗi mạng, sinh ngẫu nhiên bằng esp_fill_random() khi Gateway boot lần đầu, lưu NVS.</w:t>
@@ -16695,7 +16799,9 @@
     </w:p>
     <w:p>
       <w:pPr>
-        <w:ind w:firstLine="567"/>
+        <w:spacing w:line="360" w:lineRule="auto" w:before="0" w:after="0"/>
+        <w:ind w:firstLine="720"/>
+        <w:jc w:val="both"/>
       </w:pPr>
       <w:r>
         <w:t>Quá trình Provisioner thêm một thiết bị unprovisioned vào mạng, chuẩn Mesh định nghĩa 5 bước:</w:t>
@@ -16764,7 +16870,9 @@
     </w:p>
     <w:p>
       <w:pPr>
-        <w:ind w:firstLine="567"/>
+        <w:spacing w:line="360" w:lineRule="auto" w:before="0" w:after="0"/>
+        <w:ind w:firstLine="720"/>
+        <w:jc w:val="both"/>
       </w:pPr>
       <w:r>
         <w:t>Đề tài dùng Static OOB: Provisioner và Node cùng biết trước 16 byte bí mật hardcode trong firmware. Node lạ không có giá trị này sẽ fail ở bước 4. Đây là cách đơn giản nhất chặn thiết bị lạ tự join mạng, hợp với triển khai closed-fleet.</w:t>
@@ -16772,7 +16880,9 @@
     </w:p>
     <w:p>
       <w:pPr>
-        <w:ind w:firstLine="567"/>
+        <w:spacing w:line="360" w:lineRule="auto" w:before="0" w:after="0"/>
+        <w:ind w:firstLine="720"/>
+        <w:jc w:val="both"/>
       </w:pPr>
       <w:r>
         <w:t>Năm bước trên là quy trình chuẩn Bluetooth Mesh, áp dụng cho mọi node (Scanner/Relay). Cách Gateway của đề tài vận hành cụ thể quy trình này – nhận diện loại node qua UUID prefix, và hai bước cấu hình bổ sung sau khi provisioning xong (AppKey Add, Model App Bind) – được trình bày chi tiết ở Chương 4, mục firmware Gateway.</w:t>
@@ -16794,7 +16904,9 @@
     </w:p>
     <w:p>
       <w:pPr>
-        <w:ind w:firstLine="567"/>
+        <w:spacing w:line="360" w:lineRule="auto" w:before="0" w:after="0"/>
+        <w:ind w:firstLine="720"/>
+        <w:jc w:val="both"/>
       </w:pPr>
       <w:r>
         <w:t>Bluetooth SIG định nghĩa các model chuẩn (đèn on/off, cảm biến nhiệt độ,) nhưng cho phép mỗi vendor định nghĩa Vendor Model riêng, nhận biết bằng cặp (Company ID, Model ID).</w:t>
@@ -16802,7 +16914,9 @@
     </w:p>
     <w:p>
       <w:pPr>
-        <w:ind w:firstLine="567"/>
+        <w:spacing w:line="360" w:lineRule="auto" w:before="0" w:after="0"/>
+        <w:ind w:firstLine="720"/>
+        <w:jc w:val="both"/>
       </w:pPr>
       <w:r>
         <w:t>Đề tài dùng một Vendor Model duy nhất: Company ID 0x02E5, Model ID 0x0000. Bảng tương ứng liệt kê 5 opcode 3-byte.</w:t>
@@ -17036,7 +17150,9 @@
     </w:p>
     <w:p>
       <w:pPr>
-        <w:ind w:firstLine="567"/>
+        <w:spacing w:line="360" w:lineRule="auto" w:before="0" w:after="0"/>
+        <w:ind w:firstLine="720"/>
+        <w:jc w:val="both"/>
       </w:pPr>
       <w:r>
         <w:t>Node bật Relay forward gói mesh ở Network Layer, không cần giải mã nội dung. Đề tài dùng Relay làm cầu nối chính, đồng thời bật Relay trên Scanner để tăng vùng phủ khi hai Scanner xa nhau nhưng gần Relay.</w:t>
@@ -17044,7 +17160,9 @@
     </w:p>
     <w:p>
       <w:pPr>
-        <w:ind w:firstLine="567"/>
+        <w:spacing w:line="360" w:lineRule="auto" w:before="0" w:after="0"/>
+        <w:ind w:firstLine="720"/>
+        <w:jc w:val="both"/>
       </w:pPr>
       <w:r>
         <w:t>TTL mặc định là 7, đủ cho mạng 5–10 hop.</w:t>
@@ -17066,7 +17184,9 @@
     </w:p>
     <w:p>
       <w:pPr>
-        <w:ind w:firstLine="567"/>
+        <w:spacing w:line="360" w:lineRule="auto" w:before="0" w:after="0"/>
+        <w:ind w:firstLine="720"/>
+        <w:jc w:val="both"/>
       </w:pPr>
       <w:r>
         <w:t xml:space="preserve">Thuật toán chạy trên server (Rule Chain ThingsBoard), không trên firmware. Nhờ đó Tag không cần bật chế độ thu: Tag chỉ phát ADV một chiều, không nhận lệnh hoặc dữ liệu </w:t>
@@ -17092,7 +17212,9 @@
     </w:p>
     <w:p>
       <w:pPr>
-        <w:ind w:firstLine="567"/>
+        <w:spacing w:line="360" w:lineRule="auto" w:before="0" w:after="0"/>
+        <w:ind w:firstLine="720"/>
+        <w:jc w:val="both"/>
       </w:pPr>
       <w:r>
         <w:t>Máy chủ lưu RSSI mới nhất của từng Scanner. Ứng viên phòng là phòng của Scanner có RSSI lớn nhất trong cửa sổ dữ liệu tươi; cấu hình Rule Chain hiện tại dùng SCANNER_VALID_MS = 10 000 ms. Scanner có dữ liệu cũ hơn ngưỡng bị loại khỏi phép so sánh. Nếu một phòng có nhiều Scanner, thuật toán lấy giá trị mạnh nhất của phòng đó rồi so sánh với các phòng còn lại.</w:t>
@@ -17114,7 +17236,9 @@
     </w:p>
     <w:p>
       <w:pPr>
-        <w:ind w:firstLine="567"/>
+        <w:spacing w:line="360" w:lineRule="auto" w:before="0" w:after="0"/>
+        <w:ind w:firstLine="720"/>
+        <w:jc w:val="both"/>
       </w:pPr>
       <w:r>
         <w:t>Tag đứng ở biên giữa hai phòng, RSSI hai scanner tương đương, sẽ đảo qua đảo lại; zone nhảy liên tục, dashboard nhấp nháy.</w:t>
@@ -17122,7 +17246,9 @@
     </w:p>
     <w:p>
       <w:pPr>
-        <w:ind w:firstLine="567"/>
+        <w:spacing w:line="360" w:lineRule="auto" w:before="0" w:after="0"/>
+        <w:ind w:firstLine="720"/>
+        <w:jc w:val="both"/>
       </w:pPr>
       <w:r>
         <w:t>Hysteresis chỉ cho phép chuyển phòng khi RSSI của Scanner ứng viên mạnh hơn giá trị tốt nhất của phòng hiện tại ít nhất HYSTERESIS_DBM. Cấu hình hiện tại sử dụng HYSTERESIS_DBM = 5 dB nhằm cân bằng độ ổn định và khả năng phản hồi.</w:t>
@@ -17144,7 +17270,9 @@
     </w:p>
     <w:p>
       <w:pPr>
-        <w:ind w:firstLine="567"/>
+        <w:spacing w:line="360" w:lineRule="auto" w:before="0" w:after="0"/>
+        <w:ind w:firstLine="720"/>
+        <w:jc w:val="both"/>
       </w:pPr>
       <w:r>
         <w:t>Hysteresis chưa loại bỏ hoàn toàn các đột biến RSSI ngắn hạn vượt ngưỡng. Vì vậy, hệ thống bổ sung debounce kiểu leaky-bucket:</w:t>
@@ -17184,7 +17312,9 @@
     </w:p>
     <w:p>
       <w:pPr>
-        <w:ind w:firstLine="567"/>
+        <w:spacing w:line="360" w:lineRule="auto" w:before="0" w:after="0"/>
+        <w:ind w:firstLine="720"/>
+        <w:jc w:val="both"/>
       </w:pPr>
       <w:r>
         <w:t>Hysteresis và debounce chạy trong cùng một node của ThingsBoard Rule Chain. Mỗi Scanner gửi báo cáo không đều, trung bình khoảng 0,67 lần/giây do luân phiên quét 800 ms và publish mesh 700 ms. Vì vậy, độ trễ chuyển phòng phải được đo trực tiếp, không thể suy ra đơn giản từ DEBOUNCE_COUNT hoặc giả định mỗi báo cáo cách nhau đúng 1 giây.</w:t>
@@ -17220,7 +17350,9 @@
     </w:p>
     <w:p>
       <w:pPr>
-        <w:ind w:firstLine="567"/>
+        <w:spacing w:line="360" w:lineRule="auto" w:before="0" w:after="0"/>
+        <w:ind w:firstLine="720"/>
+        <w:jc w:val="both"/>
       </w:pPr>
       <w:r>
         <w:t>MQTT là giao thức publish/subscribe nhẹ chạy trên TCP. OASIS chuẩn hóa MQTT 3.1.1 năm 2014 và MQTT 5.0 năm 2019; đề tài sử dụng phiên bản 3.1.1.</w:t>
@@ -17228,7 +17360,9 @@
     </w:p>
     <w:p>
       <w:pPr>
-        <w:ind w:firstLine="567"/>
+        <w:spacing w:line="360" w:lineRule="auto" w:before="0" w:after="0"/>
+        <w:ind w:firstLine="720"/>
+        <w:jc w:val="both"/>
       </w:pPr>
       <w:r>
         <w:lastRenderedPageBreak/>
@@ -17253,7 +17387,9 @@
     </w:p>
     <w:p>
       <w:pPr>
-        <w:ind w:firstLine="567"/>
+        <w:spacing w:line="360" w:lineRule="auto" w:before="0" w:after="0"/>
+        <w:ind w:firstLine="720"/>
+        <w:jc w:val="both"/>
       </w:pPr>
       <w:r>
         <w:t>Topic có cấu trúc phân cấp, ví dụ v1/gateway/telemetry, dấu / phân tách các cấp. MQTT hỗ trợ ba mức QoS:</w:t>
@@ -17285,7 +17421,9 @@
     </w:p>
     <w:p>
       <w:pPr>
-        <w:ind w:firstLine="567"/>
+        <w:spacing w:line="360" w:lineRule="auto" w:before="0" w:after="0"/>
+        <w:ind w:firstLine="720"/>
+        <w:jc w:val="both"/>
       </w:pPr>
       <w:r>
         <w:t>Source dùng QoS 0 cho telemetry RSSI liên tục. Các bản tin connect/disconnect child device, attributes, trạng thái node, trạng thái out_of_range và thông tin online của Gateway dùng QoS 1 để nhận PUBACK; QoS 2 không được sử dụng.</w:t>
@@ -17293,7 +17431,9 @@
     </w:p>
     <w:p>
       <w:pPr>
-        <w:ind w:firstLine="567"/>
+        <w:spacing w:line="360" w:lineRule="auto" w:before="0" w:after="0"/>
+        <w:ind w:firstLine="720"/>
+        <w:jc w:val="both"/>
       </w:pPr>
       <w:r>
         <w:t>MQTT còn có retained message (broker giữ thông điệp cuối trên topic, subscriber mới nhận ngay) và Last Will and Testament (broker tự publish khi client mất kết nối đột ngột). Đề tài chưa dùng cả hai.</w:t>
@@ -17301,7 +17441,9 @@
     </w:p>
     <w:p>
       <w:pPr>
-        <w:ind w:firstLine="567"/>
+        <w:spacing w:line="360" w:lineRule="auto" w:before="0" w:after="0"/>
+        <w:ind w:firstLine="720"/>
+        <w:jc w:val="both"/>
       </w:pPr>
       <w:r>
         <w:t>MQTT phù hợp với telemetry liên tục vì giữ kết nối TCP/TLS bền và có overhead nhỏ hơn HTTP polling lặp lại. Tuy nhiên TLS làm tăng chi phí handshake và tài nguyên, nên cần đánh giá đồng thời bảo mật và hiệu năng trên thiết bị IoT [8], [9].</w:t>
@@ -17323,7 +17465,9 @@
     </w:p>
     <w:p>
       <w:pPr>
-        <w:ind w:firstLine="567"/>
+        <w:spacing w:line="360" w:lineRule="auto" w:before="0" w:after="0"/>
+        <w:ind w:firstLine="720"/>
+        <w:jc w:val="both"/>
       </w:pPr>
       <w:r>
         <w:t>TLS là giao thức bảo vệ kênh truyền; các phiên bản được sử dụng phổ biến hiện nay là TLS 1.2 và TLS 1.3. TLS cung cấp:</w:t>
@@ -17451,7 +17595,9 @@
     </w:p>
     <w:p>
       <w:pPr>
-        <w:ind w:firstLine="567"/>
+        <w:spacing w:line="360" w:lineRule="auto" w:before="0" w:after="0"/>
+        <w:ind w:firstLine="720"/>
+        <w:jc w:val="both"/>
       </w:pPr>
       <w:r>
         <w:t>Handshake TLS 1.2:</w:t>
@@ -17622,7 +17768,9 @@
     </w:p>
     <w:p>
       <w:pPr>
-        <w:ind w:firstLine="567"/>
+        <w:spacing w:line="360" w:lineRule="auto" w:before="0" w:after="0"/>
+        <w:ind w:firstLine="720"/>
+        <w:jc w:val="both"/>
       </w:pPr>
       <w:r>
         <w:t>Chứng chỉ X.509 ràng buộc khóa công khai với một danh tính. Cert được ký bởi Certificate Authority (CA). Client tin cert nếu tin CA đã ký nó.</w:t>
@@ -17630,7 +17778,9 @@
     </w:p>
     <w:p>
       <w:pPr>
-        <w:ind w:firstLine="567"/>
+        <w:spacing w:line="360" w:lineRule="auto" w:before="0" w:after="0"/>
+        <w:ind w:firstLine="720"/>
+        <w:jc w:val="both"/>
       </w:pPr>
       <w:r>
         <w:t>Đề tài tự host trong mạng nội bộ, dùng self-signed CA: tự tạo CA private key + cert, dùng CA đó ký cert server. CA cert được embed vào firmware để node tin.</w:t>
@@ -17638,7 +17788,9 @@
     </w:p>
     <w:p>
       <w:pPr>
-        <w:ind w:firstLine="567"/>
+        <w:spacing w:line="360" w:lineRule="auto" w:before="0" w:after="0"/>
+        <w:ind w:firstLine="720"/>
+        <w:jc w:val="both"/>
       </w:pPr>
       <w:r>
         <w:t>CN và SAN. TLS hiện đại ưu tiên Subject Alternative Name (SAN) để xác minh hostname hoặc địa chỉ IP; Common Name (CN) chủ yếu được giữ vì lý do tương thích.</w:t>
@@ -17646,7 +17798,9 @@
     </w:p>
     <w:p>
       <w:pPr>
-        <w:ind w:firstLine="567"/>
+        <w:spacing w:line="360" w:lineRule="auto" w:before="0" w:after="0"/>
+        <w:ind w:firstLine="720"/>
+        <w:jc w:val="both"/>
       </w:pPr>
       <w:r>
         <w:t xml:space="preserve">Trong prototype, firmware kết nối tới địa chỉ IP nhưng cấu hình tên kỳ vọng cố định "bmt-tb.local" qua tùy chọn common_name của TLS client và tin cậy CA nội bộ. Đây là </w:t>
@@ -17672,7 +17826,9 @@
     </w:p>
     <w:p>
       <w:pPr>
-        <w:ind w:firstLine="567"/>
+        <w:spacing w:line="360" w:lineRule="auto" w:before="0" w:after="0"/>
+        <w:ind w:firstLine="720"/>
+        <w:jc w:val="both"/>
       </w:pPr>
       <w:r>
         <w:t>ThingsBoard cung cấp Gateway API qua MQTT cho thiết bị đóng vai trò gateway cho nhiều sub-device – như Gateway của đề tài đại diện cho toàn bộ Scanner, Relay và Tag trên mesh.</w:t>
@@ -17694,7 +17850,9 @@
     </w:p>
     <w:p>
       <w:pPr>
-        <w:ind w:firstLine="567"/>
+        <w:spacing w:line="360" w:lineRule="auto" w:before="0" w:after="0"/>
+        <w:ind w:firstLine="720"/>
+        <w:jc w:val="both"/>
       </w:pPr>
       <w:r>
         <w:t>Gateway đăng ký như device thường nhưng bật cờ Is Gateway. Sau đó tự tạo và quản lý sub-device (không cần đăng ký trước) bằng cách publish tới các topic đặc biệt.</w:t>
@@ -17702,7 +17860,9 @@
     </w:p>
     <w:p>
       <w:pPr>
-        <w:ind w:firstLine="567"/>
+        <w:spacing w:line="360" w:lineRule="auto" w:before="0" w:after="0"/>
+        <w:ind w:firstLine="720"/>
+        <w:jc w:val="both"/>
       </w:pPr>
       <w:r>
         <w:t>Các child device dùng Device Profile theo vai trò: ble_tag cho Tag và ble_mesh_node cho Scanner/Relay. Gateway là device cha được xác thực bằng access token, không được tạo lại như một child device thuộc profile ble_mesh_node.</w:t>
@@ -17724,7 +17884,9 @@
     </w:p>
     <w:p>
       <w:pPr>
-        <w:ind w:firstLine="567"/>
+        <w:spacing w:line="360" w:lineRule="auto" w:before="0" w:after="0"/>
+        <w:ind w:firstLine="720"/>
+        <w:jc w:val="both"/>
       </w:pPr>
       <w:r>
         <w:t>Bảng tương ứng liệt kê các topic đề tài sử dụng.</w:t>
@@ -18102,7 +18264,9 @@
     </w:tbl>
     <w:p>
       <w:pPr>
-        <w:ind w:firstLine="567"/>
+        <w:spacing w:line="360" w:lineRule="auto" w:before="0" w:after="0"/>
+        <w:ind w:firstLine="720"/>
+        <w:jc w:val="both"/>
       </w:pPr>
       <w:r>
         <w:t>Payload luôn là JSON. Ví dụ báo cáo RSSI của tag (giá trị minh hoạ):</w:t>
@@ -18110,7 +18274,9 @@
     </w:p>
     <w:p>
       <w:pPr>
-        <w:ind w:firstLine="567"/>
+        <w:spacing w:line="360" w:lineRule="auto" w:before="0" w:after="0"/>
+        <w:ind w:firstLine="720"/>
+        <w:jc w:val="both"/>
       </w:pPr>
       <w:r>
         <w:t>{"bmt_tag_0x0001":[{"ts":1732345678000,"values":{"scanner_id":"125ba3077000","rssi":-47,"battery":82}}]}</w:t>
@@ -18132,7 +18298,9 @@
     </w:p>
     <w:p>
       <w:pPr>
-        <w:ind w:firstLine="567"/>
+        <w:spacing w:line="360" w:lineRule="auto" w:before="0" w:after="0"/>
+        <w:ind w:firstLine="720"/>
+        <w:jc w:val="both"/>
       </w:pPr>
       <w:r>
         <w:t>Rule Chain là DAG các rule node xử lý message. Mỗi node có input, chạy logic và định tuyến ra output theo relation type (Success, Failure, True, False,).</w:t>
@@ -18140,7 +18308,9 @@
     </w:p>
     <w:p>
       <w:pPr>
-        <w:ind w:firstLine="567"/>
+        <w:spacing w:line="360" w:lineRule="auto" w:before="0" w:after="0"/>
+        <w:ind w:firstLine="720"/>
+        <w:jc w:val="both"/>
       </w:pPr>
       <w:r>
         <w:t>Các loại rule node hay dùng:</w:t>
@@ -18189,7 +18359,9 @@
     </w:p>
     <w:p>
       <w:pPr>
-        <w:ind w:firstLine="567"/>
+        <w:spacing w:line="360" w:lineRule="auto" w:before="0" w:after="0"/>
+        <w:ind w:firstLine="720"/>
+        <w:jc w:val="both"/>
       </w:pPr>
       <w:r>
         <w:t>Phân biệt Timeseries/Attributes quan trọng khi cần phân tích lại dữ liệu quá khứ (ví dụ đo latency chuyển phòng ở Chương 5): chỉ trường nào được ghi dạng timeseries mới truy vấn lại được theo mốc thời gian cụ thể.</w:t>
@@ -18197,7 +18369,9 @@
     </w:p>
     <w:p>
       <w:pPr>
-        <w:ind w:firstLine="567"/>
+        <w:spacing w:line="360" w:lineRule="auto" w:before="0" w:after="0"/>
+        <w:ind w:firstLine="720"/>
+        <w:jc w:val="both"/>
       </w:pPr>
       <w:r>
         <w:t>Đề tài dùng Rule Chain ble_tag_zone_detection cho profile ble_tag, thực hiện ánh xạ Scanner–phòng, kiểm tra độ tươi, hysteresis và debounce. Chi tiết bảy node và hai nhánh ghi attributes/timeseries được trình bày ở Chương 4.</w:t>
@@ -18253,7 +18427,9 @@
     </w:p>
     <w:p>
       <w:pPr>
-        <w:ind w:firstLine="567"/>
+        <w:spacing w:line="360" w:lineRule="auto" w:before="0" w:after="0"/>
+        <w:ind w:firstLine="720"/>
+        <w:jc w:val="both"/>
       </w:pPr>
       <w:r>
         <w:t>Hệ thống chia thành bốn tầng, xếp từ thiết bị đầu cuối đến người dùng cuối:</w:t>
@@ -18293,7 +18469,9 @@
     </w:p>
     <w:p>
       <w:pPr>
-        <w:ind w:firstLine="567"/>
+        <w:spacing w:line="360" w:lineRule="auto" w:before="0" w:after="0"/>
+        <w:ind w:firstLine="720"/>
+        <w:jc w:val="both"/>
       </w:pPr>
       <w:r>
         <w:t>Nguyên tắc thiết kế: firmware chỉ chuyển dữ liệu thô, mọi xử lý được đẩy về server. Cụ thể, các scanner không quyết định tag đang ở phòng nào; chúng gửi cặp (tag_id, rssi_filtered, scanner_id) lên gateway, gateway đẩy lên ThingsBoard, rule chain trên server áp dụng hysteresis và debounce rồi ghi thuộc tính current_zone cho tag. Cách này cho phép sửa ngưỡng bất cứ lúc nào qua UI mà không phải flash lại firmware, giảm chi phí bảo trì hiện trường. Mapping scanner cũng chỉ nằm ở rule chain (biến ZONE_MAP) chứ không hardcode trong firmware gateway — thêm/bớt/đổi phòng của một scanner là việc sửa server, không cần build lại firmware.</w:t>
@@ -18301,7 +18479,9 @@
     </w:p>
     <w:p>
       <w:pPr>
-        <w:ind w:firstLine="567"/>
+        <w:spacing w:line="360" w:lineRule="auto" w:before="0" w:after="0"/>
+        <w:ind w:firstLine="720"/>
+        <w:jc w:val="both"/>
       </w:pPr>
       <w:r>
         <w:t>Mô hình các tầng phần cứng, đường truyền và thành phần xử lý phía máy chủ được trình bày ở Hình tương ứng.</w:t>
@@ -18389,7 +18569,9 @@
     </w:p>
     <w:p>
       <w:pPr>
-        <w:ind w:firstLine="567"/>
+        <w:spacing w:line="360" w:lineRule="auto" w:before="0" w:after="0"/>
+        <w:ind w:firstLine="720"/>
+        <w:jc w:val="both"/>
       </w:pPr>
       <w:r>
         <w:t>Relay là node "câm": không có logic ứng dụng riêng, chỉ forward mesh network layer. Đặt giữa các scanner ở xa và Gateway để mở rộng vùng phủ mesh.</w:t>
@@ -18411,7 +18593,9 @@
     </w:p>
     <w:p>
       <w:pPr>
-        <w:ind w:firstLine="567"/>
+        <w:spacing w:line="360" w:lineRule="auto" w:before="0" w:after="0"/>
+        <w:ind w:firstLine="720"/>
+        <w:jc w:val="both"/>
       </w:pPr>
       <w:r>
         <w:t>Relay được bật thông qua esp_ble_mesh_set_relay(true). Ở lớp mạng, node này nhận mọi gói mesh, giảm TTL đi 1, và forward lại nếu TTL còn &gt;0 và gói chưa qua node này. Đây là hành vi mặc định của BLE Mesh, không cần code ứng dụng.</w:t>
@@ -18433,7 +18617,9 @@
     </w:p>
     <w:p>
       <w:pPr>
-        <w:ind w:firstLine="567"/>
+        <w:spacing w:line="360" w:lineRule="auto" w:before="0" w:after="0"/>
+        <w:ind w:firstLine="720"/>
+        <w:jc w:val="both"/>
       </w:pPr>
       <w:r>
         <w:t>Relay bind AppKey với vendor model để nhận các lệnh cấp ứng dụng dùng chung, trong đó có RESET_CMD phục vụ tự phục hồi. Nếu không bind AppKey, opcode không được chuyển lên access layer của Relay.</w:t>
@@ -18455,7 +18641,9 @@
     </w:p>
     <w:p>
       <w:pPr>
-        <w:ind w:firstLine="567"/>
+        <w:spacing w:line="360" w:lineRule="auto" w:before="0" w:after="0"/>
+        <w:ind w:firstLine="720"/>
+        <w:jc w:val="both"/>
       </w:pPr>
       <w:r>
         <w:t>Gateway (ESP32-S3) là cầu nối giữa mạng BLE Mesh và ThingsBoard: vừa provision các node, vừa nhận TAG_STATUS, tách xử lý bằng hàng đợi FreeRTOS và truyền telemetry qua MQTTS. Đây là khối trung tâm của tuyến thu nhận và chuyển tiếp dữ liệu.</w:t>
@@ -18477,7 +18665,9 @@
     </w:p>
     <w:p>
       <w:pPr>
-        <w:ind w:firstLine="567"/>
+        <w:spacing w:line="360" w:lineRule="auto" w:before="0" w:after="0"/>
+        <w:ind w:firstLine="720"/>
+        <w:jc w:val="both"/>
       </w:pPr>
       <w:r>
         <w:t>Khi phát hiện unprovisioned beacon, Gateway tự nhận diện kiểu node và provision, không cần thao tác thủ công. Node table được persist vào NVS sau mỗi lần provision/drop – mất điện gateway không cần re-provision toàn mesh.</w:t>
@@ -18566,7 +18756,9 @@
     </w:p>
     <w:p>
       <w:pPr>
-        <w:ind w:firstLine="567"/>
+        <w:spacing w:line="360" w:lineRule="auto" w:before="0" w:after="0"/>
+        <w:ind w:firstLine="720"/>
+        <w:jc w:val="both"/>
       </w:pPr>
       <w:r>
         <w:t xml:space="preserve">Callback của BLE Mesh chỉ kiểm tra độ dài payload, sao chép TAG_STATUS, ánh xạ địa chỉ nguồn sang MAC của Scanner rồi đưa report vào hàng đợi FreeRTOS có 64 phần tử. Callback không gọi MQTT trực tiếp vì thao tác publish qua TLS có thể block. Một MQTT worker độc lập lấy từng report, dựng JSON theo ThingsBoard Gateway API </w:t>
@@ -18592,7 +18784,9 @@
     </w:p>
     <w:p>
       <w:pPr>
-        <w:ind w:firstLine="567"/>
+        <w:spacing w:line="360" w:lineRule="auto" w:before="0" w:after="0"/>
+        <w:ind w:firstLine="720"/>
+        <w:jc w:val="both"/>
       </w:pPr>
       <w:r>
         <w:t>Gateway theo dõi Scanner và Relay trong suốt thời gian chạy bằng cơ chế chủ động thăm dò, không yêu cầu node tự phát heartbeat. Sau thời gian ổn định ban đầu, Gateway dùng Config Client gửi DEFAULT_TTL_GET tới từng node theo chu kỳ 20 giây. Phản hồi hợp lệ cập nhật last_seen và trạng thái online; TAG_STATUS nhận từ Scanner cũng được tính là hoạt động mesh. Node được đánh dấu offline nếu quá 60 giây không nhận được phản hồi hoặc dữ liệu hợp lệ. Data watchdog chờ ổn định 15 giây rồi giám sát bộ đếm traffic theo từng cửa sổ 300 giây. Nếu toàn tuyến im lặng, Gateway phát RESET_CMD tối đa 5 lần, cách nhau 1,5 giây; sau khi có ít nhất một lần gửi thành công, nó chờ node 12 giây, xoá state mesh/node/Tag và reboot để auto-provision lại.</w:t>
@@ -18614,7 +18808,9 @@
     </w:p>
     <w:p>
       <w:pPr>
-        <w:ind w:firstLine="567"/>
+        <w:spacing w:line="360" w:lineRule="auto" w:before="0" w:after="0"/>
+        <w:ind w:firstLine="720"/>
+        <w:jc w:val="both"/>
       </w:pPr>
       <w:r>
         <w:t>Gateway hoạt động ở chế độ Wi-Fi STA. bmt_wifi_init chờ tối đa 15 giây để nhận địa chỉ IP; sau đó app_main vẫn khởi tạo MQTT dù Wi-Fi đã sẵn sàng hay vừa timeout. MQTT dùng URI mqtts:// trên cổng 8883, CA nhúng, common name bmt-tb.local và access token làm username. Network timeout được đặt 500 ms, còn reconnect timeout là 5 giây; Wi-Fi tiếp tục reconnect ở nền nếu kết nối đến muộn hoặc bị gián đoạn.</w:t>
@@ -18631,11 +18827,21 @@
       <w:bookmarkEnd w:id="148"/>
     </w:p>
     <w:p>
+      <w:pPr>
+        <w:spacing w:line="360" w:lineRule="auto" w:before="0" w:after="0"/>
+        <w:ind w:firstLine="720"/>
+        <w:jc w:val="both"/>
+      </w:pPr>
       <w:r>
         <w:t>Gateway chạy zone_timeout_task theo chu kỳ 1 giây và duy trì last_any_report_ms riêng cho từng Tag. Khi quá BMT_TAG_OUT_OF_RANGE_MS = 10 000 ms không nhận TAG_STATUS hợp lệ, Gateway đặt marker cục bộ về BMT_ZONE_UNKNOWN, xoá các cờ Scanner hợp lệ và publish current_zone = out_of_range cùng current_zone_num = 0 lên v1/gateway/attributes với QoS 1. Đây là trạng thái timeout do Gateway phát hiện, không phải kết quả của thuật toán so sánh RSSI trên Rule Chain.</w:t>
       </w:r>
     </w:p>
     <w:p>
+      <w:pPr>
+        <w:spacing w:line="360" w:lineRule="auto" w:before="0" w:after="0"/>
+        <w:ind w:firstLine="720"/>
+        <w:jc w:val="both"/>
+      </w:pPr>
       <w:r>
         <w:t>Gateway còn khai báo BMT_SCANNER_VALID_MS = 3 500 ms để phân loại mẫu RSSI của từng Scanner là FRESH hoặc STALE trong bảng trạng thái cục bộ và log chẩn đoán. Ngưỡng 3,5 giây này không tham gia thuật toán quyết định phòng trên ThingsBoard và cũng không phải timeout out_of_range của Tag.</w:t>
       </w:r>
@@ -18652,6 +18858,11 @@
       <w:bookmarkEnd w:id="149"/>
     </w:p>
     <w:p>
+      <w:pPr>
+        <w:spacing w:line="360" w:lineRule="auto" w:before="0" w:after="0"/>
+        <w:ind w:firstLine="720"/>
+        <w:jc w:val="both"/>
+      </w:pPr>
       <w:r>
         <w:t>Nếu publish out_of_range không thực hiện được vì MQTT đang ngắt, Gateway đặt cờ out_of_range_pending cho đúng Tag. Khi nhận MQTT_EVENT_CONNECTED, Gateway khai báo lại các node/Tag đã biết rồi phát lại trạng thái pending; TAG_STATUS mới đến trước reconnect sẽ xoá pending cũ. Hàng đợi RSSI có 64 phần tử, xQueueSend dùng thời gian chờ bằng 0 và không phải bộ đệm bền vững. Khi hàng đợi đầy, report mới bị bỏ; khi MQTT đang ngắt, worker vẫn lấy report khỏi queue nhưng bmt_thingsboard không publish, vì vậy report đó cũng không được giữ để gửi lại. Chỉ out_of_range có cơ chế pending/replay riêng.</w:t>
       </w:r>
@@ -18672,7 +18883,9 @@
     </w:p>
     <w:p>
       <w:pPr>
-        <w:ind w:firstLine="567"/>
+        <w:spacing w:line="360" w:lineRule="auto" w:before="0" w:after="0"/>
+        <w:ind w:firstLine="720"/>
+        <w:jc w:val="both"/>
       </w:pPr>
       <w:r>
         <w:t>Server chạy ThingsBoard CE bằng Docker Compose. Gateway chịu trách nhiệm tiếp nhận và chuyển telemetry, quản lý vòng đời child device, công bố trạng thái node và phát hiện timeout out_of_range. ThingsBoard chịu trách nhiệm chạy thuật toán xác định phòng chính thức, lưu attributes/timeseries và trình bày nhiều Tag. Ranh giới này cho phép thay đổi ánh xạ phòng, hysteresis hoặc debounce mà không biên dịch lại firmware.</w:t>
@@ -18694,7 +18907,9 @@
     </w:p>
     <w:p>
       <w:pPr>
-        <w:ind w:firstLine="567"/>
+        <w:spacing w:line="360" w:lineRule="auto" w:before="0" w:after="0"/>
+        <w:ind w:firstLine="720"/>
+        <w:jc w:val="both"/>
       </w:pPr>
       <w:r>
         <w:t>Đây là bộ não phía server, gồm đúng 7 node. Sau Apply hysteresis, luồng rẽ thành hai nhánh độc lập để ghi attributes và timeseries:</w:t>
@@ -18783,7 +18998,9 @@
     </w:p>
     <w:p>
       <w:pPr>
-        <w:ind w:firstLine="567"/>
+        <w:spacing w:line="360" w:lineRule="auto" w:before="0" w:after="0"/>
+        <w:ind w:firstLine="720"/>
+        <w:jc w:val="both"/>
       </w:pPr>
       <w:r>
         <w:t>Các tham số hysteresis, debounce và SCANNER_VALID_MS được khai báo trong script của Rule Chain và có thể sửa qua giao diện ThingsBoard mà không cần biên dịch lại firmware. Cấu hình vận hành hiện tại lần lượt là 5 dB, hai lần xác nhận và 10 000 ms. Đây là cửa sổ độ tươi dùng khi so sánh RSSI giữa các Scanner, không phải BMT_SCANNER_VALID_MS = 3 500 ms dùng cho chẩn đoán cục bộ trên Gateway và không phải BMT_TAG_OUT_OF_RANGE_MS = 10 000 ms dùng để phát hiện Tag ngừng report.</w:t>
@@ -18791,7 +19008,9 @@
     </w:p>
     <w:p>
       <w:pPr>
-        <w:ind w:firstLine="567"/>
+        <w:spacing w:line="360" w:lineRule="auto" w:before="0" w:after="0"/>
+        <w:ind w:firstLine="720"/>
+        <w:jc w:val="both"/>
       </w:pPr>
       <w:r>
         <w:t>Luồng xử lý từ lúc Tag tạo beacon đến khi Rule Chain giữ hoặc cập nhật phòng được trình bày ở Hình tương ứng.</w:t>
@@ -18883,7 +19102,9 @@
     </w:p>
     <w:p>
       <w:pPr>
-        <w:ind w:firstLine="567"/>
+        <w:spacing w:line="360" w:lineRule="auto" w:before="0" w:after="0"/>
+        <w:ind w:firstLine="720"/>
+        <w:jc w:val="both"/>
       </w:pPr>
       <w:r>
         <w:t>Dashboard hỗ trợ nhiều Tag bằng hai entity alias. All Tags cấp dữ liệu cho bảng tổng quan, còn Selected Tag lấy Tag hiện hành từ dashboard state để cấp dữ liệu cho các widget chi tiết. Nhãn hiển thị của Scanner, chẳng hạn “Room 1 (Living Room)”, chỉ là bí danh quản trị và không tham gia vào logic định vị.</w:t>
@@ -18891,7 +19112,9 @@
     </w:p>
     <w:p>
       <w:pPr>
-        <w:ind w:firstLine="567"/>
+        <w:spacing w:line="360" w:lineRule="auto" w:before="0" w:after="0"/>
+        <w:ind w:firstLine="720"/>
+        <w:jc w:val="both"/>
       </w:pPr>
       <w:r>
         <w:t>Bảng Tracked Tags hiển thị đồng thời các Tag và phòng hiện tại. Khi người dùng chọn một hàng, dashboard cập nhật state sang Tag tương ứng; thẻ Current Zone, sơ đồ mặt bằng, RSSI và lịch sử phòng đổi theo Tag đã chọn. Cách này tránh nhân bản dashboard khi số Tag tăng.</w:t>
@@ -18972,6 +19195,11 @@
       <w:bookmarkEnd w:id="153"/>
     </w:p>
     <w:p>
+      <w:pPr>
+        <w:spacing w:line="360" w:lineRule="auto" w:before="0" w:after="0"/>
+        <w:ind w:firstLine="720"/>
+        <w:jc w:val="both"/>
+      </w:pPr>
       <w:r>
         <w:t>Mỗi Tag là một child device tên bmt_tag_0x%04x, profile ble_tag và role tag; Scanner/Relay dùng tên bmt_node_&lt;12 ký tự MAC&gt;, profile ble_mesh_node cùng role scan hoặc relay. Với report thông thường, Rule Chain ghi SERVER_SCOPE attributes và timeseries theo đúng child device. Timeout out_of_range được Gateway publish trực tiếp lên attributes với current_zone = out_of_range và current_zone_num = 0, không đi qua nhánh timeseries. Việc tách entity bảo đảm state của các Tag không ghi đè lẫn nhau.</w:t>
       </w:r>
@@ -19059,7 +19287,9 @@
     </w:p>
     <w:p>
       <w:pPr>
-        <w:ind w:firstLine="567"/>
+        <w:spacing w:line="360" w:lineRule="auto" w:before="0" w:after="0"/>
+        <w:ind w:firstLine="720"/>
+        <w:jc w:val="both"/>
       </w:pPr>
       <w:r>
         <w:t>Luồng xử lý không gắn telemetry vào một Tag cố định. Gateway, ThingsBoard Gateway API, Rule Chain và Dashboard đều giữ định danh Tag xuyên suốt để các Tag được xử lý độc lập.</w:t>
@@ -19081,7 +19311,9 @@
     </w:p>
     <w:p>
       <w:pPr>
-        <w:ind w:firstLine="567"/>
+        <w:spacing w:line="360" w:lineRule="auto" w:before="0" w:after="0"/>
+        <w:ind w:firstLine="720"/>
+        <w:jc w:val="both"/>
       </w:pPr>
       <w:r>
         <w:t>Gateway trích tag_id từ TAG_STATUS và dùng khóa này để cập nhật đúng slot trạng thái. Mỗi Tag có last_any_report_ms, marker current_zone_id cục bộ và cờ out_of_range_pending riêng; các trường này chỉ phục vụ quản lý timeout và replay, không thay thế current_zone do Rule Chain quyết định. Vì vậy một Tag mất tín hiệu không làm thay đổi state của Tag khác. Cấu hình hiện tại hỗ trợ tối đa 16 Tag.</w:t>
@@ -19103,7 +19335,9 @@
     </w:p>
     <w:p>
       <w:pPr>
-        <w:ind w:firstLine="567"/>
+        <w:spacing w:line="360" w:lineRule="auto" w:before="0" w:after="0"/>
+        <w:ind w:firstLine="720"/>
+        <w:jc w:val="both"/>
       </w:pPr>
       <w:r>
         <w:t>Gateway API gắn telemetry với tên child device của Tag. Rule Chain đọc và ghi attributes trên chính originator đó, nên RSSI, timestamp, zone hiện tại và bộ đếm debounce của các Tag không ghi đè lẫn nhau.</w:t>
@@ -19125,7 +19359,9 @@
     </w:p>
     <w:p>
       <w:pPr>
-        <w:ind w:firstLine="567"/>
+        <w:spacing w:line="360" w:lineRule="auto" w:before="0" w:after="0"/>
+        <w:ind w:firstLine="720"/>
+        <w:jc w:val="both"/>
       </w:pPr>
       <w:r>
         <w:t>Bảng All Tags phục vụ quan sát toàn hệ thống; thao tác chọn một hàng chuyển dashboard state sang Selected Tag. Các widget chi tiết sử dụng alias này, tạo một giao diện thống nhất cho một hoặc nhiều Tag mà không cần cấu hình thủ công từng widget theo từng thiết bị.</w:t>
@@ -19148,7 +19384,9 @@
     </w:p>
     <w:p>
       <w:pPr>
-        <w:ind w:firstLine="567"/>
+        <w:spacing w:line="360" w:lineRule="auto" w:before="0" w:after="0"/>
+        <w:ind w:firstLine="720"/>
+        <w:jc w:val="both"/>
       </w:pPr>
       <w:r>
         <w:t>Repo tổ chức theo hướng mono-repo:</w:t>
@@ -19170,7 +19408,9 @@
     </w:p>
     <w:p>
       <w:pPr>
-        <w:ind w:firstLine="567"/>
+        <w:spacing w:line="360" w:lineRule="auto" w:before="0" w:after="0"/>
+        <w:ind w:firstLine="720"/>
+        <w:jc w:val="both"/>
       </w:pPr>
       <w:r>
         <w:t>Mã nguồn Gateway tập trung tại apps/gateway. bmt_mesh nhận BLE Mesh message, provision và ping node; bmt_wifi quản lý Wi-Fi STA; bmt_mqtt triển khai queue, worker và MQTTS; bmt_thingsboard đóng gói Gateway API, child device và out_of_range; bmt_zone giữ bảng tối đa 16 Tag; bmt_watchdog giám sát traffic mesh; bmt_node_table lưu tối đa 10 node trong NVS. Firmware Tag/Scanner cung cấp dữ liệu đầu vào cho giao diện tích hợp.</w:t>
@@ -19192,7 +19432,9 @@
     </w:p>
     <w:p>
       <w:pPr>
-        <w:ind w:firstLine="567"/>
+        <w:spacing w:line="360" w:lineRule="auto" w:before="0" w:after="0"/>
+        <w:ind w:firstLine="720"/>
+        <w:jc w:val="both"/>
       </w:pPr>
       <w:r>
         <w:t>Định dạng TAG_STATUS và các opcode vendor là hợp đồng giao tiếp giữa firmware edge và Gateway. Việc giám sát node được thực hiện bằng Config Client DEFAULT_TTL_GET của BLE Mesh, không dùng một opcode heartbeat riêng. Sau khi nhận dữ liệu, Gateway xác thực cấu trúc và xếp hàng message để chuyển lên máy chủ.</w:t>
@@ -19214,7 +19456,9 @@
     </w:p>
     <w:p>
       <w:pPr>
-        <w:ind w:firstLine="567"/>
+        <w:spacing w:line="360" w:lineRule="auto" w:before="0" w:after="0"/>
+        <w:ind w:firstLine="720"/>
+        <w:jc w:val="both"/>
       </w:pPr>
       <w:r>
         <w:t>Server assets gồm docker-compose.yml, rulechain/ble_tag_zone_detection.json và dashboard/indoor_tracking.json. Rule Chain chứa ánh xạ Scanner–phòng, SCANNER_VALID_MS = 10 000 ms, hysteresis 5 dB và debounce hai lần; dashboard export chứa alias All Tags, Selected Tag và hành động chọn Tag từ bảng. Hằng số cùng tên ở Gateway có giá trị 3 500 ms nhưng chỉ phục vụ log chẩn đoán, nên hai giá trị phải được đọc theo đúng lớp xử lý.</w:t>
@@ -19493,7 +19737,9 @@
     </w:p>
     <w:p>
       <w:pPr>
-        <w:ind w:firstLine="567"/>
+        <w:spacing w:line="360" w:lineRule="auto" w:before="0" w:after="0"/>
+        <w:ind w:firstLine="720"/>
+        <w:jc w:val="both"/>
       </w:pPr>
       <w:r>
         <w:t>Ba Scanner được gán cố định theo quan hệ một–một với ba phòng như Bảng 7. Cách bố trí này tạo quan hệ trực tiếp giữa nhãn phòng và nguồn RSSI, đồng thời tránh biến số do nhiều Scanner cùng đại diện một phòng.</w:t>
@@ -19889,8 +20135,9 @@
     </w:tbl>
     <w:p>
       <w:pPr>
-        <w:spacing w:before="120"/>
-        <w:ind w:firstLine="567"/>
+        <w:spacing w:before="0" w:line="360" w:lineRule="auto" w:after="0"/>
+        <w:ind w:firstLine="720"/>
+        <w:jc w:val="both"/>
       </w:pPr>
       <w:r>
         <w:t>Trong phép đo, Scanner 01 đặt trên tủ lạnh ở độ cao khoảng 2,0 m; Scanner 02 đặt gần máy tính ở độ cao khoảng 1,75 m; Scanner 03 đặt trên nóc tủ ở độ cao khoảng 1,5 m. Gateway đặt gần router Wi-Fi và Relay đặt tại hành lang. Tọa độ, độ cao, hướng anten, vật cản và bề mặt kim loại được xem là biến thiết kế vì chúng ảnh hưởng rõ rệt đến RSSI trong nhà [4], [5], [10]. Sự không đồng nhất về độ cao là một giới hạn của phép đo hiện tại.</w:t>
@@ -19922,7 +20169,9 @@
     </w:p>
     <w:p>
       <w:pPr>
-        <w:ind w:firstLine="567"/>
+        <w:spacing w:line="360" w:lineRule="auto" w:before="0" w:after="0"/>
+        <w:ind w:firstLine="720"/>
+        <w:jc w:val="both"/>
       </w:pPr>
       <w:r>
         <w:t>Hai nguồn dữ liệu được thu thập độc lập. Nguồn thứ nhất là ground truth do ứng dụng Python ghi khi người đo chọn phòng, gồm thời điểm dạng mili giây, thời gian ISO và mã phòng. Nguồn thứ hai là chuỗi telemetry current_zone_num do ThingsBoard lưu cho tag. Việc tách riêng hai nguồn ngăn việc sử dụng chính dự đoán của hệ thống làm nhãn đúng.</w:t>
@@ -19930,7 +20179,9 @@
     </w:p>
     <w:p>
       <w:pPr>
-        <w:ind w:firstLine="567"/>
+        <w:spacing w:line="360" w:lineRule="auto" w:before="0" w:after="0"/>
+        <w:ind w:firstLine="720"/>
+        <w:jc w:val="both"/>
       </w:pPr>
       <w:r>
         <w:t>Ngay khi bước qua ranh giới của một phòng, người đo nhấn phím 1, 2 hoặc 3 tương ứng. Ứng dụng ghi mốc chuyển ground truth tᵢ, bắt đầu đếm Grace 30 giây và yêu cầu người đo giữ tag đứng yên. Khi Grace kết thúc, ứng dụng phát âm báo để người đo đi lại trong phạm vi phòng trong đúng 60 giây. Sau đó người đo di chuyển sang phòng kế tiếp và chỉ ghi mốc mới khi đã qua ranh giới phòng.</w:t>
@@ -19938,7 +20189,9 @@
     </w:p>
     <w:p>
       <w:pPr>
-        <w:ind w:firstLine="567"/>
+        <w:spacing w:line="360" w:lineRule="auto" w:before="0" w:after="0"/>
+        <w:ind w:firstLine="720"/>
+        <w:jc w:val="both"/>
       </w:pPr>
       <w:r>
         <w:t>Grace 30 giây là tham số của giao thức thực nghiệm, được chọn từ quan sát sơ bộ để bao quát thời gian hội tụ của chuỗi xử lý RSSI, chu kỳ báo cáo BLE Mesh và cơ chế hysteresis/debounce. Khoảng Grace không được dùng để tính các chỉ số phân loại, nhưng vẫn được giữ khi đánh giá độ trễ chuyển phòng.</w:t>
@@ -20050,7 +20303,9 @@
     </w:p>
     <w:p>
       <w:pPr>
-        <w:ind w:firstLine="567"/>
+        <w:spacing w:line="360" w:lineRule="auto" w:before="0" w:after="0"/>
+        <w:ind w:firstLine="720"/>
+        <w:jc w:val="both"/>
       </w:pPr>
       <w:r>
         <w:t>Với hai mốc liên tiếp tᵢ và tᵢ₊₁, khoảng ground truth của phòng rᵢ được định nghĩa là Iᵢ = [tᵢ, tᵢ₊₁). Khoảng Grace là Gᵢ = [tᵢ, min(tᵢ + 30 s, tᵢ₊₁)). Cửa sổ dùng để chấm điểm phân loại được giới hạn thành Eᵢ = [tᵢ + 30 s, min(tᵢ + 90 s, tᵢ₊₁)). Như vậy, mỗi lần vào phòng đóng góp tối đa 60 giây sau Grace; thời gian di chuyển sang phòng kế tiếp không bị tính nhầm vào phòng trước.</w:t>
@@ -20058,7 +20313,9 @@
     </w:p>
     <w:p>
       <w:pPr>
-        <w:ind w:firstLine="567"/>
+        <w:spacing w:line="360" w:lineRule="auto" w:before="0" w:after="0"/>
+        <w:ind w:firstLine="720"/>
+        <w:jc w:val="both"/>
       </w:pPr>
       <w:r>
         <w:t>Timestamp của ground truth và ThingsBoard được đưa về cùng múi giờ và đơn vị mili giây. Chuỗi current_zone_num được tái lấy mẫu trên lưới 1 giây; dự đoán gần nhất chỉ được giữ tối đa 10 giây, sau đó được đánh dấu thiếu telemetry. Đây là ngưỡng freshness của phép ghép ngoại tuyến, không phải SCANNER_VALID_MS. Metadata của ba phiên ghi SCANNER_VALID_MS = 5 000 ms, hysteresis 5 dB và debounce bằng 2.</w:t>
@@ -20066,7 +20323,9 @@
     </w:p>
     <w:p>
       <w:pPr>
-        <w:ind w:firstLine="567"/>
+        <w:spacing w:line="360" w:lineRule="auto" w:before="0" w:after="0"/>
+        <w:ind w:firstLine="720"/>
+        <w:jc w:val="both"/>
       </w:pPr>
       <w:r>
         <w:rPr>
@@ -20133,7 +20392,9 @@
     </w:p>
     <w:p>
       <w:pPr>
-        <w:ind w:firstLine="567"/>
+        <w:spacing w:line="360" w:lineRule="auto" w:before="0" w:after="0"/>
+        <w:ind w:firstLine="720"/>
+        <w:jc w:val="both"/>
       </w:pPr>
       <w:r>
         <w:t>Tập đánh giá gồm ba phiên độc lập thực hiện trong ngày 29/07/2026. Mỗi phiên có 12 khoảng đánh giá, tương ứng bốn vòng qua ba phòng, và một mốc đóng cuối phiên để khép kín khoảng thứ 12. Tổng cộng có 36 cửa sổ phòng được xử lý bằng cùng giao thức Grace 30 giây, đi lại 60 giây và cùng quy tắc lấy mẫu telemetry.</w:t>
@@ -20623,7 +20884,9 @@
     </w:p>
     <w:p>
       <w:pPr>
-        <w:ind w:firstLine="567"/>
+        <w:spacing w:line="360" w:lineRule="auto" w:before="0" w:after="0"/>
+        <w:ind w:firstLine="720"/>
+        <w:jc w:val="both"/>
       </w:pPr>
       <w:r>
         <w:t>Do mỗi phòng xuất hiện bốn lần trong mỗi phiên, thiết kế tạo 12 cửa sổ đánh giá cho mỗi lớp. Mỗi cửa sổ đóng góp đúng 60 giây sau Grace, tương đương 720 thời điểm đủ điều kiện trên lưới 1 giây cho mỗi phòng và 2160 thời điểm cho toàn bộ ba phiên.</w:t>
@@ -21444,8 +21707,9 @@
     <w:p/>
     <w:p>
       <w:pPr>
-        <w:spacing w:before="120"/>
-        <w:ind w:firstLine="567"/>
+        <w:spacing w:before="0" w:line="360" w:lineRule="auto" w:after="0"/>
+        <w:ind w:firstLine="720"/>
+        <w:jc w:val="both"/>
       </w:pPr>
       <w:r>
         <w:t>Thiết kế cân bằng tạo 720 thời điểm đủ điều kiện cho mỗi phòng. Phòng 1 quan sát được 715/720 thời điểm, Phòng 2 quan sát đủ 720/720 và Phòng 3 quan sát được 718/720. Tổng coverage đạt 2 153/2 160 = 99,68%; vì vậy chênh lệch số mẫu quan sát giữa các lớp là nhỏ.</w:t>
@@ -21475,7 +21739,9 @@
     </w:p>
     <w:p>
       <w:pPr>
-        <w:ind w:firstLine="567"/>
+        <w:spacing w:line="360" w:lineRule="auto" w:before="0" w:after="0"/>
+        <w:ind w:firstLine="720"/>
+        <w:jc w:val="both"/>
       </w:pPr>
       <w:r>
         <w:t>Ground truth cung cấp nhãn phòng và cửa sổ đánh giá; current_zone_num cung cấp dự đoán của hệ thống. Sau khi ghép theo timestamp, báo cáo sử dụng độ chính xác (accuracy), ma trận nhầm lẫn, precision, recall, macro-F1, balanced accuracy và coverage để mô tả kết quả, đồng thời báo riêng số thời điểm thiếu telemetry.</w:t>
@@ -21483,7 +21749,9 @@
     </w:p>
     <w:p>
       <w:pPr>
-        <w:ind w:firstLine="567"/>
+        <w:spacing w:line="360" w:lineRule="auto" w:before="0" w:after="0"/>
+        <w:ind w:firstLine="720"/>
+        <w:jc w:val="both"/>
         <w:rPr>
           <w:lang w:val="vi-VN"/>
         </w:rPr>
@@ -21536,7 +21804,9 @@
     </w:p>
     <w:p>
       <w:pPr>
-        <w:ind w:firstLine="567"/>
+        <w:spacing w:line="360" w:lineRule="auto" w:before="0" w:after="0"/>
+        <w:ind w:firstLine="720"/>
+        <w:jc w:val="both"/>
       </w:pPr>
       <w:r>
         <w:t>Tag được đặt cố định lần lượt tại Phòng 2, Phòng 3 và Phòng 1 để mô tả mức phân tách RSSI. Các cửa sổ ổn định tương ứng là 21:19:42–21:20:42, 21:54:45–21:55:46 và 21:57:35–21:58:32 ngày 29/07/2026. Đây là phép đo chẩn đoán vị trí đặt Scanner và không được gộp vào ba phiên ground truth dùng để tính độ chính xác tại Mục 5.5.</w:t>
@@ -21544,7 +21814,9 @@
     </w:p>
     <w:p>
       <w:pPr>
-        <w:ind w:firstLine="567"/>
+        <w:spacing w:line="360" w:lineRule="auto" w:before="0" w:after="0"/>
+        <w:ind w:firstLine="720"/>
+        <w:jc w:val="both"/>
       </w:pPr>
       <w:r>
         <w:t>Dashboard giữ giá trị RSSI gần nhất nên một đoạn nằm ngang chưa chắc tương ứng với báo cáo mới. Thống kê chỉ nhận mẫu khi timestamp ts_scan_01, ts_scan_02 hoặc ts_scan_03 của Scanner tương ứng được cập nhật; cách lọc này tránh mang tiếp giá trị cũ. Tại thời điểm đo RSSI riêng, Rule Chain dùng hysteresis 5 dB, debounce bằng 2 và SCANNER_VALID_MS = 10 000 ms.</w:t>
@@ -23215,7 +23487,9 @@
     </w:p>
     <w:p>
       <w:pPr>
-        <w:ind w:firstLine="567"/>
+        <w:spacing w:line="360" w:lineRule="auto" w:before="0" w:after="0"/>
+        <w:ind w:firstLine="720"/>
+        <w:jc w:val="both"/>
       </w:pPr>
       <w:r>
         <w:t>Kết quả cho thấy scanner đặt trong phòng thực tế đều tạo RSSI trung bình lớn nhất. Tại Phòng 2, Scanner 02 đạt -69,77 dBm và cao hơn Scanner 03 khoảng 6,78 dB; đây là trường hợp có biên phân tách nhỏ nhất. Tại Phòng 3, Scanner 03 đạt -52,89 dBm và cao hơn đối thủ gần nhất khoảng 23,36 dB. Tại Phòng 1, Scanner 01 đạt -66,27 dBm, cao hơn Scanner 03 khoảng 21,43 dB; Scanner 02 không phát sinh report mới trong cửa sổ nên không dùng giá trị -84 dBm được giữ trên đồ thị để tính thống kê.</w:t>
@@ -23425,7 +23699,9 @@
     </w:p>
     <w:p>
       <w:pPr>
-        <w:ind w:firstLine="567"/>
+        <w:spacing w:line="360" w:lineRule="auto" w:before="0" w:after="0"/>
+        <w:ind w:firstLine="720"/>
+        <w:jc w:val="both"/>
       </w:pPr>
       <w:r>
         <w:lastRenderedPageBreak/>
@@ -23455,7 +23731,9 @@
     </w:p>
     <w:p>
       <w:pPr>
-        <w:ind w:firstLine="567"/>
+        <w:spacing w:line="360" w:lineRule="auto" w:before="0" w:after="0"/>
+        <w:ind w:firstLine="720"/>
+        <w:jc w:val="both"/>
       </w:pPr>
       <w:r>
         <w:t>Phép thử đo thời gian từ lúc cấp nguồn đến khi Tag đầu tiên xuất hiện trên dashboard. ThingsBoard được khởi động trước; sau đó lần lượt cấp nguồn cho Gateway, Relay, ba Scanner và Tag.</w:t>
@@ -23463,7 +23741,9 @@
     </w:p>
     <w:p>
       <w:pPr>
-        <w:ind w:firstLine="567"/>
+        <w:spacing w:line="360" w:lineRule="auto" w:before="0" w:after="0"/>
+        <w:ind w:firstLine="720"/>
+        <w:jc w:val="both"/>
       </w:pPr>
       <w:r>
         <w:t>Bảng 11 trình bày giá trị trung bình và độ lệch chuẩn của năm lần đo.</w:t>
@@ -23746,7 +24026,9 @@
     </w:tbl>
     <w:p>
       <w:pPr>
-        <w:ind w:firstLine="567"/>
+        <w:spacing w:line="360" w:lineRule="auto" w:before="0" w:after="0"/>
+        <w:ind w:firstLine="720"/>
+        <w:jc w:val="both"/>
       </w:pPr>
       <w:r>
         <w:t>Tag xuất hiện trên dashboard sau 21,5 ± 2,3 giây. Giai đoạn chiếm nhiều thời gian nhất là provisioning ba Scanner, vì Gateway xử lý các phiên provisioning theo thứ tự dù các node cùng được cấp nguồn.</w:t>
@@ -23796,7 +24078,9 @@
     </w:p>
     <w:p>
       <w:pPr>
-        <w:ind w:firstLine="567"/>
+        <w:spacing w:line="360" w:lineRule="auto" w:before="0" w:after="0"/>
+        <w:ind w:firstLine="720"/>
+        <w:jc w:val="both"/>
       </w:pPr>
       <w:r>
         <w:t>Phép đánh giá sử dụng ba phiên và 36 cửa sổ phòng tại Mục 5.2. Mỗi cửa sổ lấy đúng 60 giây sau Grace 30 giây, tái lấy mẫu trên lưới 1 giây và áp dụng freshness ngoại tuyến 10 giây. Cả ba phiên giữ cùng bố trí Scanner, cùng một Tag, hysteresis 5 dB, debounce bằng 2 và SCANNER_VALID_MS = 5 000 ms.</w:t>
@@ -23804,7 +24088,9 @@
     </w:p>
     <w:p>
       <w:pPr>
-        <w:ind w:firstLine="567"/>
+        <w:spacing w:line="360" w:lineRule="auto" w:before="0" w:after="0"/>
+        <w:ind w:firstLine="720"/>
+        <w:jc w:val="both"/>
       </w:pPr>
       <w:r>
         <w:t xml:space="preserve">Coverage là tỷ lệ thời điểm có dự đoán hợp lệ. Độ chính xác trên mẫu quan sát chỉ dùng thời điểm có telemetry; độ chính xác nghiêm ngặt xem thời điểm thiếu là sai. </w:t>
@@ -23837,7 +24123,9 @@
     </w:p>
     <w:p>
       <w:pPr>
-        <w:ind w:firstLine="567"/>
+        <w:spacing w:line="360" w:lineRule="auto" w:before="0" w:after="0"/>
+        <w:ind w:firstLine="720"/>
+        <w:jc w:val="both"/>
       </w:pPr>
       <w:r>
         <w:t>Ba phiên tạo 2 160 thời điểm đủ điều kiện sau Grace. Có 2 153 thời điểm có telemetry hợp lệ và 7 thời điểm thiếu, tương ứng coverage 99,68%. Hệ thống dự đoán đúng 1 965/2 153 thời điểm quan sát, đạt độ chính xác gộp 91,27%; nếu xem thời điểm thiếu là sai, độ chính xác nghiêm ngặt đạt 90,97%. Độ chính xác trung bình giữa ba phiên là 91,27% với độ lệch chuẩn 4,38 điểm phần trăm.</w:t>
@@ -26712,7 +27000,9 @@
     </w:p>
     <w:p>
       <w:pPr>
-        <w:ind w:firstLine="567"/>
+        <w:spacing w:line="360" w:lineRule="auto" w:before="0" w:after="0"/>
+        <w:ind w:firstLine="720"/>
+        <w:jc w:val="both"/>
       </w:pPr>
       <w:r>
         <w:t>Sai số tập trung chủ yếu ở cặp Phòng 2–Phòng 3: 104 thời điểm thực tế thuộc Phòng 2 bị nhận thành Phòng 3 và 62 thời điểm thực tế thuộc Phòng 3 bị nhận thành Phòng 2. Tổng cộng 166/188 lỗi, tương đương 88,30%, nằm ở cặp ranh giới này. Phòng 1 đạt precision 99,71% và recall 97,20%, cho thấy được tách tương đối rõ khỏi hai phòng còn lại.</w:t>
@@ -26720,7 +27010,9 @@
     </w:p>
     <w:p>
       <w:pPr>
-        <w:ind w:firstLine="567"/>
+        <w:spacing w:line="360" w:lineRule="auto" w:before="0" w:after="0"/>
+        <w:ind w:firstLine="720"/>
+        <w:jc w:val="both"/>
       </w:pPr>
       <w:r>
         <w:t xml:space="preserve">Phòng 3 có precision thấp nhất, đạt 84,10%, do một số lượng đáng kể mẫu của Phòng 2 bị kéo sang Phòng 3. Phòng 2 có recall 85,28%, phản ánh hiện tượng tín hiệu của Scanner 03 cạnh tranh với Scanner 02 trong một số đoạn đo. Kết quả này phù hợp với bố trí thực </w:t>
@@ -26732,7 +27024,9 @@
     </w:p>
     <w:p>
       <w:pPr>
-        <w:ind w:firstLine="567"/>
+        <w:spacing w:line="360" w:lineRule="auto" w:before="0" w:after="0"/>
+        <w:ind w:firstLine="720"/>
+        <w:jc w:val="both"/>
       </w:pPr>
       <w:r>
         <w:t>Phiên 3 đạt độ chính xác 86,21%, thấp hơn hai phiên đầu. Ngoài dao động RSSI ở ranh giới Phòng 2–Phòng 3, phiên này còn chứa sai lệch thao tác nêu tại Mục 5.2.3. Kết quả vẫn được giữ trong thống kê gộp nhưng không được dùng riêng để suy luận latency hoặc flapping.</w:t>
@@ -26740,7 +27034,9 @@
     </w:p>
     <w:p>
       <w:pPr>
-        <w:ind w:firstLine="567"/>
+        <w:spacing w:line="360" w:lineRule="auto" w:before="0" w:after="0"/>
+        <w:ind w:firstLine="720"/>
+        <w:jc w:val="both"/>
       </w:pPr>
       <w:r>
         <w:t>Ba phiên đo cho thấy hệ thống có khả năng định vị mức phòng ổn định trong bố trí thử nghiệm hiện tại. Tuy nhiên, kết quả vẫn giới hạn ở một mặt bằng, một tag và ba scanner. Để khái quát hóa, cần lặp lại với nhiều vị trí đặt tag, thay đổi có kiểm soát chiều cao và hướng anten của scanner, đồng thời thực hiện phép đo độ trễ chuyển phòng và flapping theo giao thức riêng.</w:t>
@@ -26794,7 +27090,9 @@
     </w:p>
     <w:p>
       <w:pPr>
-        <w:ind w:firstLine="567"/>
+        <w:spacing w:line="360" w:lineRule="auto" w:before="0" w:after="0"/>
+        <w:ind w:firstLine="720"/>
+        <w:jc w:val="both"/>
       </w:pPr>
       <w:r>
         <w:t>P</w:t>
@@ -27143,7 +27441,9 @@
     </w:p>
     <w:p>
       <w:pPr>
-        <w:ind w:firstLine="567"/>
+        <w:spacing w:line="360" w:lineRule="auto" w:before="0" w:after="0"/>
+        <w:ind w:firstLine="720"/>
+        <w:jc w:val="both"/>
       </w:pPr>
       <w:r>
         <w:t>Với ngưỡng 5 dB, hai lần đổi zone ngoài ý muốn tạo thành một chu kỳ flapping hoàn chỉnh: hệ thống chuyển từ phòng đúng sang phòng sai rồi quay về phòng đúng sau 4,503 giây. Khi tăng hysteresis lên 8 dB và 12 dB, phép thử không ghi nhận flapping, nhưng chưa đủ dữ liệu để kết luận hai ngưỡng này tốt hơn vì độ trễ chuyển phòng chưa được đo đồng thời.</w:t>
@@ -27151,7 +27451,9 @@
     </w:p>
     <w:p>
       <w:pPr>
-        <w:ind w:firstLine="567"/>
+        <w:spacing w:line="360" w:lineRule="auto" w:before="0" w:after="0"/>
+        <w:ind w:firstLine="720"/>
+        <w:jc w:val="both"/>
       </w:pPr>
       <w:r>
         <w:lastRenderedPageBreak/>
@@ -27183,7 +27485,9 @@
     </w:p>
     <w:p>
       <w:pPr>
-        <w:ind w:firstLine="567"/>
+        <w:spacing w:line="360" w:lineRule="auto" w:before="0" w:after="0"/>
+        <w:ind w:firstLine="720"/>
+        <w:jc w:val="both"/>
       </w:pPr>
       <w:r>
         <w:rPr>
@@ -27597,7 +27901,9 @@
     </w:tbl>
     <w:p>
       <w:pPr>
-        <w:ind w:firstLine="567"/>
+        <w:spacing w:line="360" w:lineRule="auto" w:before="0" w:after="0"/>
+        <w:ind w:firstLine="720"/>
+        <w:jc w:val="both"/>
       </w:pPr>
       <w:r>
         <w:rPr>
@@ -27668,7 +27974,9 @@
     </w:p>
     <w:p>
       <w:pPr>
-        <w:ind w:firstLine="567"/>
+        <w:spacing w:line="360" w:lineRule="auto" w:before="0" w:after="0"/>
+        <w:ind w:firstLine="720"/>
+        <w:jc w:val="both"/>
       </w:pPr>
       <w:r>
         <w:rPr>
@@ -27702,7 +28010,9 @@
     </w:p>
     <w:p>
       <w:pPr>
-        <w:ind w:firstLine="567"/>
+        <w:spacing w:line="360" w:lineRule="auto" w:before="0" w:after="0"/>
+        <w:ind w:firstLine="720"/>
+        <w:jc w:val="both"/>
       </w:pPr>
       <w:r>
         <w:rPr>
@@ -28556,7 +28866,9 @@
     </w:tbl>
     <w:p>
       <w:pPr>
-        <w:ind w:firstLine="567"/>
+        <w:spacing w:line="360" w:lineRule="auto" w:before="0" w:after="0"/>
+        <w:ind w:firstLine="720"/>
+        <w:jc w:val="both"/>
       </w:pPr>
       <w:r>
         <w:rPr>
@@ -28614,7 +28926,9 @@
     </w:p>
     <w:p>
       <w:pPr>
-        <w:ind w:firstLine="567"/>
+        <w:spacing w:line="360" w:lineRule="auto" w:before="0" w:after="0"/>
+        <w:ind w:firstLine="720"/>
+        <w:jc w:val="both"/>
       </w:pPr>
       <w:r>
         <w:t>Kịch bản: hệ thống chạy ổn định, sau đó rút nguồn Gateway 60 s rồi cấp lại. Đo thời gian từ lúc cấp lại nguồn đến khi tag hiển thị lại trên dashboard.</w:t>
@@ -28622,7 +28936,9 @@
     </w:p>
     <w:p>
       <w:pPr>
-        <w:ind w:firstLine="567"/>
+        <w:spacing w:line="360" w:lineRule="auto" w:before="0" w:after="0"/>
+        <w:ind w:firstLine="720"/>
+        <w:jc w:val="both"/>
       </w:pPr>
       <w:r>
         <w:t>Sau khi cấp nguồn lại, Gateway khôi phục node table từ NVS, kết nối lại Wi-Fi và MQTTS; mesh không cần provisioning lại khi cấu hình còn hợp lệ. Thời gian phục hồi trung bình của ba lần thử là 8,7 giây.</w:t>
@@ -28653,7 +28969,9 @@
     </w:p>
     <w:p>
       <w:pPr>
-        <w:ind w:firstLine="567"/>
+        <w:spacing w:line="360" w:lineRule="auto" w:before="0" w:after="0"/>
+        <w:ind w:firstLine="720"/>
+        <w:jc w:val="both"/>
       </w:pPr>
       <w:r>
         <w:t>Khi Scanner 02 mất nguồn trong 2 phút, hệ thống không còn nguồn RSSI đại diện trực tiếp cho Phòng 2 nên khả năng phân loại tại phòng này suy giảm. Sau khi cấp nguồn lại, Scanner tự tham gia lại quy trình provisioning và Gateway cập nhật node table. Thời gian phục hồi ghi nhận là 12,4 giây.</w:t>
@@ -28684,7 +29002,9 @@
     </w:p>
     <w:p>
       <w:pPr>
-        <w:ind w:firstLine="567"/>
+        <w:spacing w:line="360" w:lineRule="auto" w:before="0" w:after="0"/>
+        <w:ind w:firstLine="720"/>
+        <w:jc w:val="both"/>
       </w:pPr>
       <w:r>
         <w:t>Khi Relay bị rút nguồn, các Scanner phụ thuộc đường chuyển tiếp có thể mất đường về Gateway. Sau 30 giây không nhận TAG_STATUS, watchdog phát RESET_CMD; khi Relay được cấp nguồn lại, mạng thực hiện provisioning lại. Tổng thời gian phục hồi ghi nhận là 38,2 giây, bao gồm thời gian chờ watchdog.</w:t>
@@ -28738,7 +29058,9 @@
     </w:p>
     <w:p>
       <w:pPr>
-        <w:ind w:firstLine="567"/>
+        <w:spacing w:line="360" w:lineRule="auto" w:before="0" w:after="0"/>
+        <w:ind w:firstLine="720"/>
+        <w:jc w:val="both"/>
         <w:rPr>
           <w:lang w:val="vi-VN"/>
         </w:rPr>
@@ -28962,7 +29284,9 @@
     </w:tbl>
     <w:p>
       <w:pPr>
-        <w:ind w:firstLine="567"/>
+        <w:spacing w:line="360" w:lineRule="auto" w:before="0" w:after="0"/>
+        <w:ind w:firstLine="720"/>
+        <w:jc w:val="both"/>
       </w:pPr>
       <w:r>
         <w:t>Cập nhật broadcast cho ba Scanner hoàn tất trong 24,6 giây; nếu cập nhật tuần tự với cùng điều kiện, tổng thời gian ước tính khoảng 75 giây. Kết quả cho thấy cơ chế song song giảm đáng kể thời gian bảo trì nhóm Scanner.</w:t>
@@ -28994,7 +29318,9 @@
     </w:p>
     <w:p>
       <w:pPr>
-        <w:ind w:firstLine="567"/>
+        <w:spacing w:line="360" w:lineRule="auto" w:before="0" w:after="0"/>
+        <w:ind w:firstLine="720"/>
+        <w:jc w:val="both"/>
       </w:pPr>
       <w:r>
         <w:t>Khi chạy lại OTA với cùng image, node so sánh SHA-256 trong header với firmware đang chạy và trả ota_result = skip mà không ghi lại flash. Thời gian trung bình là 0,8 giây.</w:t>
@@ -29025,7 +29351,9 @@
     </w:p>
     <w:p>
       <w:pPr>
-        <w:ind w:firstLine="567"/>
+        <w:spacing w:line="360" w:lineRule="auto" w:before="0" w:after="0"/>
+        <w:ind w:firstLine="720"/>
+        <w:jc w:val="both"/>
       </w:pPr>
       <w:r>
         <w:t>Kịch bản: cố ý copy firmware phiên bản cũ (20260501000000) đè lên file server, giữ nguyên tên. Node so version của header (20260501000000) với version đang chạy (20260615120000) và reject vì new &lt; cur. Ghi log ota_result = fail, dashboard hiển thị fail. Downgrade bị chặn ở lớp firmware trước khi bootloader chạy image mới, tránh chip bị rollback về bản có lỗi.</w:t>
@@ -29056,7 +29384,9 @@
     </w:p>
     <w:p>
       <w:pPr>
-        <w:ind w:firstLine="567"/>
+        <w:spacing w:line="360" w:lineRule="auto" w:before="0" w:after="0"/>
+        <w:ind w:firstLine="720"/>
+        <w:jc w:val="both"/>
       </w:pPr>
       <w:r>
         <w:t>Ba lỗi được inject:</w:t>
@@ -29134,7 +29464,9 @@
     </w:p>
     <w:p>
       <w:pPr>
-        <w:ind w:firstLine="567"/>
+        <w:spacing w:line="360" w:lineRule="auto" w:before="0" w:after="0"/>
+        <w:ind w:firstLine="720"/>
+        <w:jc w:val="both"/>
       </w:pPr>
       <w:r>
         <w:t>Ứng dụng RNF Digital Innovation Beacon Toolkit trên iOS phát một ADV có cùng CID 0x02E5, UUID, battery, Tag ID, tx_power và sequence như Tag thật nhưng dùng mac16 ngẫu nhiên. Scanner tính lại HMAC theo khóa epoch hiện hành; do mã không khớp, beacon bị loại với log hmac_reject. Cả 100/100 lần thử đều bị từ chối, tương ứng false-accept quan sát được bằng 0%.</w:t>
@@ -29165,7 +29497,9 @@
     </w:p>
     <w:p>
       <w:pPr>
-        <w:ind w:firstLine="567"/>
+        <w:spacing w:line="360" w:lineRule="auto" w:before="0" w:after="0"/>
+        <w:ind w:firstLine="720"/>
+        <w:jc w:val="both"/>
       </w:pPr>
       <w:r>
         <w:t xml:space="preserve">Trong phép thử, một ADV hợp lệ được ghi bằng btmon, phát lại sau 15 phút bằng RNF Digital Innovation Beacon Toolkit và không làm hệ thống chọn một trạng thái mới. Tuy nhiên, code hiện tại không loại mọi trường hợp replay theo sequence: bản tin trùng vẫn làm mới số đo, bản tin lùi gần bị loại, còn bước nhảy lớn làm khởi tạo lại trạng thái để dung sai với Tag khởi động lại. HMAC-16 xác thực nội dung nhưng không tự bảo đảm </w:t>
@@ -29200,7 +29534,9 @@
     </w:p>
     <w:p>
       <w:pPr>
-        <w:ind w:firstLine="567"/>
+        <w:spacing w:line="360" w:lineRule="auto" w:before="0" w:after="0"/>
+        <w:ind w:firstLine="720"/>
+        <w:jc w:val="both"/>
       </w:pPr>
       <w:r>
         <w:t>Hệ thống chạy liên tục 24 giờ và đếm beacon hợp lệ bị từ chối do HMAC mismatch sau khi lọc UUID trong danh sách cho phép. Có 34/28 654 beacon bị từ chối, tương ứng 0,12%. Với chu kỳ phát 900–1100 ms, tỷ lệ này không làm gián đoạn đáng kể chuỗi theo dõi nhưng vẫn cần được báo cáo như một giới hạn thực nghiệm.</w:t>
@@ -30218,7 +30554,9 @@
     <w:p/>
     <w:p>
       <w:pPr>
-        <w:ind w:firstLine="567"/>
+        <w:spacing w:line="360" w:lineRule="auto" w:before="0" w:after="0"/>
+        <w:ind w:firstLine="720"/>
+        <w:jc w:val="both"/>
       </w:pPr>
       <w:r>
         <w:t>Hệ thống không hướng tới độ chính xác tọa độ như UWB mà ưu tiên định vị mức phòng, khả năng tự host, tùy biến thuật toán và kiểm soát dữ liệu. Các số liệu thương mại và mức giá trong bảng chỉ là tham khảo; kết quả theo mét của sản phẩm thương mại không cùng metric với accuracy phân loại phòng của đề tài nên không được dùng để so sánh trực tiếp.</w:t>
@@ -30274,7 +30612,9 @@
     </w:p>
     <w:p>
       <w:pPr>
-        <w:ind w:firstLine="567"/>
+        <w:spacing w:line="360" w:lineRule="auto" w:before="0" w:after="0"/>
+        <w:ind w:firstLine="720"/>
+        <w:jc w:val="both"/>
       </w:pPr>
       <w:r>
         <w:t>Đề tài xây dựng một hệ thống định vị trong nhà mức phòng, mã nguồn mở và có thể tự host từ đầu tới cuối. Các đóng góp chính của hệ thống gồm:</w:t>
@@ -30344,7 +30684,9 @@
     </w:p>
     <w:p>
       <w:pPr>
-        <w:ind w:firstLine="567"/>
+        <w:spacing w:line="360" w:lineRule="auto" w:before="0" w:after="0"/>
+        <w:ind w:firstLine="720"/>
+        <w:jc w:val="both"/>
       </w:pPr>
       <w:r>
         <w:rPr>
@@ -30378,7 +30720,9 @@
     </w:p>
     <w:p>
       <w:pPr>
-        <w:ind w:firstLine="567"/>
+        <w:spacing w:line="360" w:lineRule="auto" w:before="0" w:after="0"/>
+        <w:ind w:firstLine="720"/>
+        <w:jc w:val="both"/>
       </w:pPr>
       <w:r>
         <w:t>Một số điểm chưa hoàn thiện trong phạm vi đề tài:</w:t>
@@ -30474,7 +30818,9 @@
     </w:p>
     <w:p>
       <w:pPr>
-        <w:ind w:firstLine="567"/>
+        <w:spacing w:line="360" w:lineRule="auto" w:before="0" w:after="0"/>
+        <w:ind w:firstLine="720"/>
+        <w:jc w:val="both"/>
       </w:pPr>
       <w:r>
         <w:t>Hiện chỉ 1 gateway trên 1 LAN. Mở rộng: nhiều gateway ở nhiều toà nhà, sync config (khóa HMAC, ngưỡng thuật toán) và telemetry qua cloud ThingsBoard PE (Professional Edition) hoặc self-host cluster. Đòi hỏi thêm cơ chế phân quyền theo tenant, dashboard cấp portfolio.</w:t>
@@ -30497,7 +30843,9 @@
     </w:p>
     <w:p>
       <w:pPr>
-        <w:ind w:firstLine="567"/>
+        <w:spacing w:line="360" w:lineRule="auto" w:before="0" w:after="0"/>
+        <w:ind w:firstLine="720"/>
+        <w:jc w:val="both"/>
       </w:pPr>
       <w:r>
         <w:t>Cần đánh giá khả năng cùng tồn tại với Wi-Fi bằng phép đo có kiểm soát lưu lượng 2,4 GHz và khảo sát Bluetooth LE Coded PHY nếu phần cứng hai phía hỗ trợ. Mỗi thay đổi phải được đo lại về tỷ lệ nhận gói, độ trễ và độ chính xác thay vì chỉ suy luận từ công suất phát.</w:t>

</xml_diff>

<commit_message>
[DOCS] remove part A validation results
</commit_message>
<xml_diff>
--- a/khoa-luan.docx
+++ b/khoa-luan.docx
@@ -29018,20 +29018,18 @@
           <w:rFonts w:ascii="Times New Roman" w:hAnsi="Times New Roman" w:cs="Times New Roman"/>
         </w:rPr>
       </w:pPr>
-      <w:bookmarkStart w:id="245" w:name="_Toc236264356"/>
-      <w:bookmarkStart w:id="246" w:name="_Toc236089478"/>
-      <w:bookmarkStart w:id="247" w:name="_Toc236340834"/>
-      <w:bookmarkStart w:id="248" w:name="_Toc236608079"/>
+      <w:bookmarkStart w:id="281" w:name="_Toc236264365"/>
+      <w:bookmarkStart w:id="282" w:name="_Toc236340843"/>
+      <w:bookmarkStart w:id="283" w:name="_Toc236608088"/>
       <w:r>
         <w:rPr>
           <w:rFonts w:ascii="Times New Roman" w:eastAsia="Times New Roman" w:hAnsi="Times New Roman" w:cs="Times New Roman"/>
         </w:rPr>
-        <w:t>5.8 OTA</w:t>
-      </w:r>
-      <w:bookmarkEnd w:id="245"/>
-      <w:bookmarkEnd w:id="246"/>
-      <w:bookmarkEnd w:id="247"/>
-      <w:bookmarkEnd w:id="248"/>
+        <w:t>5.10 Đánh giá tổng hợp</w:t>
+      </w:r>
+      <w:bookmarkEnd w:id="281"/>
+      <w:bookmarkEnd w:id="282"/>
+      <w:bookmarkEnd w:id="283"/>
     </w:p>
     <w:p>
       <w:pPr>
@@ -29041,536 +29039,6 @@
           <w:rFonts w:ascii="Times New Roman" w:hAnsi="Times New Roman" w:cs="Times New Roman"/>
         </w:rPr>
       </w:pPr>
-      <w:bookmarkStart w:id="249" w:name="_Toc236264357"/>
-      <w:bookmarkStart w:id="250" w:name="_Toc236089479"/>
-      <w:bookmarkStart w:id="251" w:name="_Toc236340835"/>
-      <w:bookmarkStart w:id="252" w:name="_Toc236608080"/>
-      <w:r>
-        <w:rPr>
-          <w:rFonts w:ascii="Times New Roman" w:eastAsia="Times New Roman" w:hAnsi="Times New Roman" w:cs="Times New Roman"/>
-        </w:rPr>
-        <w:t>5.8.1 Thời gian OTA</w:t>
-      </w:r>
-      <w:bookmarkEnd w:id="249"/>
-      <w:bookmarkEnd w:id="250"/>
-      <w:bookmarkEnd w:id="251"/>
-      <w:bookmarkEnd w:id="252"/>
-    </w:p>
-    <w:p>
-      <w:pPr>
-        <w:spacing w:line="360" w:lineRule="auto" w:before="0" w:after="0"/>
-        <w:ind w:firstLine="720"/>
-        <w:jc w:val="both"/>
-        <w:rPr>
-          <w:lang w:val="vi-VN"/>
-        </w:rPr>
-      </w:pPr>
-      <w:r>
-        <w:t>Thời gian OTA được tính từ lúc Gateway phát lệnh đến khi node gửi ota_result = success. Kích thước image firmware dùng trong phép thử xấp xỉ 1,1 MB.</w:t>
-      </w:r>
-    </w:p>
-    <w:p>
-      <w:pPr>
-        <w:pStyle w:val="Caption"/>
-        <w:keepNext/>
-        <w:spacing w:before="60" w:after="120"/>
-        <w:ind w:firstLine="0"/>
-        <w:jc w:val="center"/>
-        <w:rPr>
-          <w:bCs w:val="0"/>
-          <w:iCs/>
-          <w:color w:val="auto"/>
-          <w:szCs w:val="26"/>
-        </w:rPr>
-      </w:pPr>
-      <w:r>
-        <w:t>Bảng 18. Thời gian OTA (giây)</w:t>
-      </w:r>
-    </w:p>
-    <w:tbl>
-      <w:tblPr>
-        <w:tblStyle w:val="TableGrid"/>
-        <w:tblW w:w="9345" w:type="dxa"/>
-        <w:jc w:val="center"/>
-        <w:tblLayout w:type="fixed"/>
-        <w:tblCellMar>
-          <w:top w:w="100" w:type="dxa"/>
-          <w:left w:w="100" w:type="dxa"/>
-          <w:bottom w:w="100" w:type="dxa"/>
-          <w:right w:w="100" w:type="dxa"/>
-        </w:tblCellMar>
-        <w:tblLook w:val="04A0" w:firstRow="1" w:lastRow="0" w:firstColumn="1" w:lastColumn="0" w:noHBand="0" w:noVBand="1"/>
-      </w:tblPr>
-      <w:tblGrid>
-        <w:gridCol w:w="3115"/>
-        <w:gridCol w:w="3115"/>
-        <w:gridCol w:w="3115"/>
-      </w:tblGrid>
-      <w:tr>
-        <w:trPr>
-          <w:cantSplit/>
-          <w:tblHeader/>
-          <w:jc w:val="center"/>
-        </w:trPr>
-        <w:tc>
-          <w:tcPr>
-            <w:tcW w:w="3115" w:type="dxa"/>
-            <w:shd w:val="clear" w:color="auto" w:fill="DBE5F1" w:themeFill="accent1" w:themeFillTint="33"/>
-            <w:vAlign w:val="center"/>
-          </w:tcPr>
-          <w:p>
-            <w:pPr>
-              <w:spacing w:line="240" w:lineRule="auto"/>
-              <w:ind w:firstLine="0"/>
-              <w:jc w:val="center"/>
-            </w:pPr>
-            <w:r>
-              <w:rPr>
-                <w:b/>
-              </w:rPr>
-              <w:t>Loại</w:t>
-            </w:r>
-          </w:p>
-        </w:tc>
-        <w:tc>
-          <w:tcPr>
-            <w:tcW w:w="3115" w:type="dxa"/>
-            <w:shd w:val="clear" w:color="auto" w:fill="DBE5F1" w:themeFill="accent1" w:themeFillTint="33"/>
-            <w:vAlign w:val="center"/>
-          </w:tcPr>
-          <w:p>
-            <w:pPr>
-              <w:spacing w:line="240" w:lineRule="auto"/>
-              <w:ind w:firstLine="0"/>
-              <w:jc w:val="center"/>
-            </w:pPr>
-            <w:r>
-              <w:rPr>
-                <w:b/>
-              </w:rPr>
-              <w:t>Thời gian (s)</w:t>
-            </w:r>
-          </w:p>
-        </w:tc>
-        <w:tc>
-          <w:tcPr>
-            <w:tcW w:w="3115" w:type="dxa"/>
-            <w:shd w:val="clear" w:color="auto" w:fill="DBE5F1" w:themeFill="accent1" w:themeFillTint="33"/>
-            <w:vAlign w:val="center"/>
-          </w:tcPr>
-          <w:p>
-            <w:pPr>
-              <w:spacing w:line="240" w:lineRule="auto"/>
-              <w:ind w:firstLine="0"/>
-              <w:jc w:val="center"/>
-            </w:pPr>
-            <w:r>
-              <w:rPr>
-                <w:b/>
-              </w:rPr>
-              <w:t>Ghi chú</w:t>
-            </w:r>
-          </w:p>
-        </w:tc>
-      </w:tr>
-      <w:tr>
-        <w:trPr>
-          <w:cantSplit/>
-          <w:jc w:val="center"/>
-        </w:trPr>
-        <w:tc>
-          <w:tcPr>
-            <w:tcW w:w="3115" w:type="dxa"/>
-            <w:vAlign w:val="center"/>
-          </w:tcPr>
-          <w:p>
-            <w:pPr>
-              <w:spacing w:line="240" w:lineRule="auto"/>
-              <w:ind w:firstLine="0"/>
-              <w:jc w:val="center"/>
-            </w:pPr>
-            <w:r>
-              <w:t>Broadcast beacon (3 scanner song song)</w:t>
-            </w:r>
-          </w:p>
-        </w:tc>
-        <w:tc>
-          <w:tcPr>
-            <w:tcW w:w="3115" w:type="dxa"/>
-            <w:vAlign w:val="center"/>
-          </w:tcPr>
-          <w:p>
-            <w:pPr>
-              <w:spacing w:line="240" w:lineRule="auto"/>
-              <w:ind w:firstLine="0"/>
-              <w:jc w:val="center"/>
-            </w:pPr>
-            <w:r>
-              <w:t>24,6</w:t>
-            </w:r>
-          </w:p>
-        </w:tc>
-        <w:tc>
-          <w:tcPr>
-            <w:tcW w:w="3115" w:type="dxa"/>
-            <w:vAlign w:val="center"/>
-          </w:tcPr>
-          <w:p>
-            <w:pPr>
-              <w:spacing w:line="240" w:lineRule="auto"/>
-              <w:ind w:firstLine="0"/>
-              <w:jc w:val="center"/>
-            </w:pPr>
-            <w:r>
-              <w:t>Tổng thời gian cho cả 3.</w:t>
-            </w:r>
-          </w:p>
-        </w:tc>
-      </w:tr>
-      <w:tr>
-        <w:trPr>
-          <w:cantSplit/>
-          <w:jc w:val="center"/>
-        </w:trPr>
-        <w:tc>
-          <w:tcPr>
-            <w:tcW w:w="3115" w:type="dxa"/>
-            <w:vAlign w:val="center"/>
-          </w:tcPr>
-          <w:p>
-            <w:pPr>
-              <w:spacing w:line="240" w:lineRule="auto"/>
-              <w:ind w:firstLine="0"/>
-              <w:jc w:val="center"/>
-            </w:pPr>
-            <w:r>
-              <w:t>Unicast mesh (1 relay)</w:t>
-            </w:r>
-          </w:p>
-        </w:tc>
-        <w:tc>
-          <w:tcPr>
-            <w:tcW w:w="3115" w:type="dxa"/>
-            <w:vAlign w:val="center"/>
-          </w:tcPr>
-          <w:p>
-            <w:pPr>
-              <w:spacing w:line="240" w:lineRule="auto"/>
-              <w:ind w:firstLine="0"/>
-              <w:jc w:val="center"/>
-            </w:pPr>
-            <w:r>
-              <w:t>26,1</w:t>
-            </w:r>
-          </w:p>
-        </w:tc>
-        <w:tc>
-          <w:tcPr>
-            <w:tcW w:w="3115" w:type="dxa"/>
-            <w:vAlign w:val="center"/>
-          </w:tcPr>
-          <w:p>
-            <w:pPr>
-              <w:spacing w:line="240" w:lineRule="auto"/>
-              <w:ind w:firstLine="0"/>
-              <w:jc w:val="center"/>
-            </w:pPr>
-            <w:r>
-              <w:t>Tuần tự.</w:t>
-            </w:r>
-          </w:p>
-        </w:tc>
-      </w:tr>
-    </w:tbl>
-    <w:p>
-      <w:pPr>
-        <w:spacing w:line="360" w:lineRule="auto" w:before="0" w:after="0"/>
-        <w:ind w:firstLine="720"/>
-        <w:jc w:val="both"/>
-      </w:pPr>
-      <w:r>
-        <w:t>Cập nhật broadcast cho ba Scanner hoàn tất trong 24,6 giây; nếu cập nhật tuần tự với cùng điều kiện, tổng thời gian ước tính khoảng 75 giây. Kết quả cho thấy cơ chế song song giảm đáng kể thời gian bảo trì nhóm Scanner.</w:t>
-      </w:r>
-    </w:p>
-    <w:p>
-      <w:pPr>
-        <w:pStyle w:val="Heading3"/>
-        <w:spacing w:line="276" w:lineRule="auto"/>
-        <w:rPr>
-          <w:rFonts w:ascii="Times New Roman" w:hAnsi="Times New Roman" w:cs="Times New Roman"/>
-        </w:rPr>
-      </w:pPr>
-      <w:bookmarkStart w:id="253" w:name="_Toc236264358"/>
-      <w:bookmarkStart w:id="254" w:name="_Toc236089480"/>
-      <w:bookmarkStart w:id="255" w:name="_Toc236340836"/>
-      <w:bookmarkStart w:id="256" w:name="_Toc236608081"/>
-      <w:r>
-        <w:rPr>
-          <w:rFonts w:ascii="Times New Roman" w:eastAsia="Times New Roman" w:hAnsi="Times New Roman" w:cs="Times New Roman"/>
-        </w:rPr>
-        <w:lastRenderedPageBreak/>
-        <w:t>5.8.2 SHA256 skip</w:t>
-      </w:r>
-      <w:bookmarkEnd w:id="253"/>
-      <w:bookmarkEnd w:id="254"/>
-      <w:bookmarkEnd w:id="255"/>
-      <w:bookmarkEnd w:id="256"/>
-    </w:p>
-    <w:p>
-      <w:pPr>
-        <w:spacing w:line="360" w:lineRule="auto" w:before="0" w:after="0"/>
-        <w:ind w:firstLine="720"/>
-        <w:jc w:val="both"/>
-      </w:pPr>
-      <w:r>
-        <w:t>Khi chạy lại OTA với cùng image, node so sánh SHA-256 trong header với firmware đang chạy và trả ota_result = skip mà không ghi lại flash. Thời gian trung bình là 0,8 giây.</w:t>
-      </w:r>
-    </w:p>
-    <w:p>
-      <w:pPr>
-        <w:pStyle w:val="Heading3"/>
-        <w:spacing w:line="276" w:lineRule="auto"/>
-        <w:rPr>
-          <w:rFonts w:ascii="Times New Roman" w:hAnsi="Times New Roman" w:cs="Times New Roman"/>
-        </w:rPr>
-      </w:pPr>
-      <w:bookmarkStart w:id="257" w:name="_Toc236264359"/>
-      <w:bookmarkStart w:id="258" w:name="_Toc236089481"/>
-      <w:bookmarkStart w:id="259" w:name="_Toc236340837"/>
-      <w:bookmarkStart w:id="260" w:name="_Toc236608082"/>
-      <w:r>
-        <w:rPr>
-          <w:rFonts w:ascii="Times New Roman" w:eastAsia="Times New Roman" w:hAnsi="Times New Roman" w:cs="Times New Roman"/>
-        </w:rPr>
-        <w:t>5.8.3 Chống downgrade</w:t>
-      </w:r>
-      <w:bookmarkEnd w:id="257"/>
-      <w:bookmarkEnd w:id="258"/>
-      <w:bookmarkEnd w:id="259"/>
-      <w:bookmarkEnd w:id="260"/>
-    </w:p>
-    <w:p>
-      <w:pPr>
-        <w:spacing w:line="360" w:lineRule="auto" w:before="0" w:after="0"/>
-        <w:ind w:firstLine="720"/>
-        <w:jc w:val="both"/>
-      </w:pPr>
-      <w:r>
-        <w:t>Kịch bản: cố ý copy firmware phiên bản cũ (20260501000000) đè lên file server, giữ nguyên tên. Node so version của header (20260501000000) với version đang chạy (20260615120000) và reject vì new &lt; cur. Ghi log ota_result = fail, dashboard hiển thị fail. Downgrade bị chặn ở lớp firmware trước khi bootloader chạy image mới, tránh chip bị rollback về bản có lỗi.</w:t>
-      </w:r>
-    </w:p>
-    <w:p>
-      <w:pPr>
-        <w:pStyle w:val="Heading3"/>
-        <w:spacing w:line="276" w:lineRule="auto"/>
-        <w:rPr>
-          <w:rFonts w:ascii="Times New Roman" w:hAnsi="Times New Roman" w:cs="Times New Roman"/>
-        </w:rPr>
-      </w:pPr>
-      <w:bookmarkStart w:id="261" w:name="_Toc236264360"/>
-      <w:bookmarkStart w:id="262" w:name="_Toc236089482"/>
-      <w:bookmarkStart w:id="263" w:name="_Toc236340838"/>
-      <w:bookmarkStart w:id="264" w:name="_Toc236608083"/>
-      <w:r>
-        <w:rPr>
-          <w:rFonts w:ascii="Times New Roman" w:eastAsia="Times New Roman" w:hAnsi="Times New Roman" w:cs="Times New Roman"/>
-        </w:rPr>
-        <w:t>5.8.4 Fault injection</w:t>
-      </w:r>
-      <w:bookmarkEnd w:id="261"/>
-      <w:bookmarkEnd w:id="262"/>
-      <w:bookmarkEnd w:id="263"/>
-      <w:bookmarkEnd w:id="264"/>
-    </w:p>
-    <w:p>
-      <w:pPr>
-        <w:spacing w:line="360" w:lineRule="auto" w:before="0" w:after="0"/>
-        <w:ind w:firstLine="720"/>
-        <w:jc w:val="both"/>
-      </w:pPr>
-      <w:r>
-        <w:t>Ba lỗi được inject:</w:t>
-      </w:r>
-    </w:p>
-    <w:p>
-      <w:pPr>
-        <w:pStyle w:val="ListBullet"/>
-      </w:pPr>
-      <w:r>
-        <w:t>HTTP 404: xoá file firmware trên server. Node báo ota_result = fail, giữ nguyên phân vùng đang chạy. Không có downtime.</w:t>
-      </w:r>
-    </w:p>
-    <w:p>
-      <w:pPr>
-        <w:pStyle w:val="ListBullet"/>
-      </w:pPr>
-      <w:r>
-        <w:t>Wi-Fi timeout: chặn scanner khỏi Wi-Fi bằng cách tắt AP trong quá trình tải. Node timeout sau 30 s, fallback về mesh, tiếp tục hoạt động bình thường.</w:t>
-      </w:r>
-    </w:p>
-    <w:p>
-      <w:pPr>
-        <w:pStyle w:val="ListBullet"/>
-      </w:pPr>
-      <w:r>
-        <w:t>Concurrent OTA: gửi 2 lệnh OTA_TRIGGER liên tiếp cách nhau 100 ms. Lệnh thứ 2 bị chặn bởi atomic compare-and-swap s_ota_in_progress, log ota already running. Không có tình trạng chạy 2 phiên OTA song song trên cùng chip.</w:t>
-      </w:r>
-    </w:p>
-    <w:p>
-      <w:pPr>
-        <w:pStyle w:val="Heading2"/>
-        <w:spacing w:before="160" w:after="60" w:line="276" w:lineRule="auto"/>
-        <w:rPr>
-          <w:rFonts w:ascii="Times New Roman" w:hAnsi="Times New Roman" w:cs="Times New Roman"/>
-        </w:rPr>
-      </w:pPr>
-      <w:bookmarkStart w:id="265" w:name="_Toc236264361"/>
-      <w:bookmarkStart w:id="266" w:name="_Toc236089483"/>
-      <w:bookmarkStart w:id="267" w:name="_Toc236340839"/>
-      <w:bookmarkStart w:id="268" w:name="_Toc236608084"/>
-      <w:r>
-        <w:rPr>
-          <w:rFonts w:ascii="Times New Roman" w:eastAsia="Times New Roman" w:hAnsi="Times New Roman" w:cs="Times New Roman"/>
-        </w:rPr>
-        <w:t>5.9 Bảo mật beacon</w:t>
-      </w:r>
-      <w:bookmarkEnd w:id="265"/>
-      <w:bookmarkEnd w:id="266"/>
-      <w:bookmarkEnd w:id="267"/>
-      <w:bookmarkEnd w:id="268"/>
-    </w:p>
-    <w:p>
-      <w:pPr>
-        <w:pStyle w:val="Heading3"/>
-        <w:spacing w:line="276" w:lineRule="auto"/>
-        <w:rPr>
-          <w:rFonts w:ascii="Times New Roman" w:hAnsi="Times New Roman" w:cs="Times New Roman"/>
-        </w:rPr>
-      </w:pPr>
-      <w:bookmarkStart w:id="269" w:name="_Toc236264362"/>
-      <w:bookmarkStart w:id="270" w:name="_Toc236089484"/>
-      <w:bookmarkStart w:id="271" w:name="_Toc236340840"/>
-      <w:bookmarkStart w:id="272" w:name="_Toc236608085"/>
-      <w:r>
-        <w:rPr>
-          <w:rFonts w:ascii="Times New Roman" w:eastAsia="Times New Roman" w:hAnsi="Times New Roman" w:cs="Times New Roman"/>
-        </w:rPr>
-        <w:t>5.9.1 Giả beacon bằng smartphone</w:t>
-      </w:r>
-      <w:bookmarkEnd w:id="269"/>
-      <w:bookmarkEnd w:id="270"/>
-      <w:bookmarkEnd w:id="271"/>
-      <w:bookmarkEnd w:id="272"/>
-    </w:p>
-    <w:p>
-      <w:pPr>
-        <w:spacing w:line="360" w:lineRule="auto" w:before="0" w:after="0"/>
-        <w:ind w:firstLine="720"/>
-        <w:jc w:val="both"/>
-      </w:pPr>
-      <w:r>
-        <w:t>Ứng dụng RNF Digital Innovation Beacon Toolkit trên iOS phát một ADV có cùng CID 0x02E5, UUID, battery, Tag ID, tx_power và sequence như Tag thật nhưng dùng mac16 ngẫu nhiên. Scanner tính lại HMAC theo khóa epoch hiện hành; do mã không khớp, beacon bị loại với log hmac_reject. Cả 100/100 lần thử đều bị từ chối, tương ứng false-accept quan sát được bằng 0%.</w:t>
-      </w:r>
-    </w:p>
-    <w:p>
-      <w:pPr>
-        <w:pStyle w:val="Heading3"/>
-        <w:spacing w:line="276" w:lineRule="auto"/>
-        <w:rPr>
-          <w:rFonts w:ascii="Times New Roman" w:hAnsi="Times New Roman" w:cs="Times New Roman"/>
-        </w:rPr>
-      </w:pPr>
-      <w:bookmarkStart w:id="273" w:name="_Toc236264363"/>
-      <w:bookmarkStart w:id="274" w:name="_Toc236089485"/>
-      <w:bookmarkStart w:id="275" w:name="_Toc236340841"/>
-      <w:bookmarkStart w:id="276" w:name="_Toc236608086"/>
-      <w:r>
-        <w:rPr>
-          <w:rFonts w:ascii="Times New Roman" w:eastAsia="Times New Roman" w:hAnsi="Times New Roman" w:cs="Times New Roman"/>
-        </w:rPr>
-        <w:t>5.9.2 Replay attack</w:t>
-      </w:r>
-      <w:bookmarkEnd w:id="273"/>
-      <w:bookmarkEnd w:id="274"/>
-      <w:bookmarkEnd w:id="275"/>
-      <w:bookmarkEnd w:id="276"/>
-    </w:p>
-    <w:p>
-      <w:pPr>
-        <w:spacing w:line="360" w:lineRule="auto" w:before="0" w:after="0"/>
-        <w:ind w:firstLine="720"/>
-        <w:jc w:val="both"/>
-      </w:pPr>
-      <w:r>
-        <w:t xml:space="preserve">Trong phép thử, một ADV hợp lệ được ghi bằng btmon, phát lại sau 15 phút bằng RNF Digital Innovation Beacon Toolkit và không làm hệ thống chọn một trạng thái mới. Tuy nhiên, code hiện tại không loại mọi trường hợp replay theo sequence: bản tin trùng vẫn làm mới số đo, bản tin lùi gần bị loại, còn bước nhảy lớn làm khởi tạo lại trạng thái để dung sai với Tag khởi động lại. HMAC-16 xác thực nội dung nhưng không tự bảo đảm </w:t>
-      </w:r>
-      <w:r>
-        <w:lastRenderedPageBreak/>
-        <w:t>tính mới. Do đó kết quả này chỉ là quan sát của kịch bản thử nghiệm, chưa chứng minh khả năng chống replay toàn diện.</w:t>
-      </w:r>
-    </w:p>
-    <w:p>
-      <w:pPr>
-        <w:pStyle w:val="Heading3"/>
-        <w:spacing w:line="276" w:lineRule="auto"/>
-        <w:rPr>
-          <w:rFonts w:ascii="Times New Roman" w:hAnsi="Times New Roman" w:cs="Times New Roman"/>
-        </w:rPr>
-      </w:pPr>
-      <w:bookmarkStart w:id="277" w:name="_Toc236264364"/>
-      <w:bookmarkStart w:id="278" w:name="_Toc236089486"/>
-      <w:bookmarkStart w:id="279" w:name="_Toc236340842"/>
-      <w:bookmarkStart w:id="280" w:name="_Toc236608087"/>
-      <w:r>
-        <w:rPr>
-          <w:rFonts w:ascii="Times New Roman" w:eastAsia="Times New Roman" w:hAnsi="Times New Roman" w:cs="Times New Roman"/>
-        </w:rPr>
-        <w:t>5.9.3 Tỉ lệ false-negative HMAC</w:t>
-      </w:r>
-      <w:bookmarkEnd w:id="277"/>
-      <w:bookmarkEnd w:id="278"/>
-      <w:bookmarkEnd w:id="279"/>
-      <w:bookmarkEnd w:id="280"/>
-    </w:p>
-    <w:p>
-      <w:pPr>
-        <w:spacing w:line="360" w:lineRule="auto" w:before="0" w:after="0"/>
-        <w:ind w:firstLine="720"/>
-        <w:jc w:val="both"/>
-      </w:pPr>
-      <w:r>
-        <w:t>Hệ thống chạy liên tục 24 giờ và đếm beacon hợp lệ bị từ chối do HMAC mismatch sau khi lọc UUID trong danh sách cho phép. Có 34/28 654 beacon bị từ chối, tương ứng 0,12%. Với chu kỳ phát 900–1100 ms, tỷ lệ này không làm gián đoạn đáng kể chuỗi theo dõi nhưng vẫn cần được báo cáo như một giới hạn thực nghiệm.</w:t>
-      </w:r>
-    </w:p>
-    <w:p>
-      <w:pPr>
-        <w:pStyle w:val="Heading2"/>
-        <w:spacing w:before="160" w:after="60" w:line="276" w:lineRule="auto"/>
-        <w:rPr>
-          <w:rFonts w:ascii="Times New Roman" w:hAnsi="Times New Roman" w:cs="Times New Roman"/>
-        </w:rPr>
-      </w:pPr>
-      <w:bookmarkStart w:id="281" w:name="_Toc236264365"/>
-      <w:bookmarkStart w:id="282" w:name="_Toc236340843"/>
-      <w:bookmarkStart w:id="283" w:name="_Toc236608088"/>
-      <w:r>
-        <w:rPr>
-          <w:rFonts w:ascii="Times New Roman" w:eastAsia="Times New Roman" w:hAnsi="Times New Roman" w:cs="Times New Roman"/>
-        </w:rPr>
-        <w:t>5.10 Đánh giá tổng hợp</w:t>
-      </w:r>
-      <w:bookmarkEnd w:id="281"/>
-      <w:bookmarkEnd w:id="282"/>
-      <w:bookmarkEnd w:id="283"/>
-    </w:p>
-    <w:p>
-      <w:pPr>
-        <w:pStyle w:val="Heading3"/>
-        <w:spacing w:line="276" w:lineRule="auto"/>
-        <w:rPr>
-          <w:rFonts w:ascii="Times New Roman" w:hAnsi="Times New Roman" w:cs="Times New Roman"/>
-        </w:rPr>
-      </w:pPr>
       <w:bookmarkStart w:id="284" w:name="_Toc236264366"/>
       <w:bookmarkStart w:id="285" w:name="_Toc236089488"/>
       <w:bookmarkStart w:id="286" w:name="_Toc236340844"/>
@@ -29600,22 +29068,6 @@
       </w:pPr>
       <w:r>
         <w:t>Kiến trúc phân tầng edge–gateway–server. Firmware nhẹ, dễ mở rộng; rule chain trên server cho phép tinh chỉnh thuật toán không cần flash lại.</w:t>
-      </w:r>
-    </w:p>
-    <w:p>
-      <w:pPr>
-        <w:pStyle w:val="ListBullet"/>
-      </w:pPr>
-      <w:r>
-        <w:t>Bảo mật 2 lớp độc lập. HMAC-16 với khóa epoch cho beacon layer; MQTTS + HTTPS cho transport layer. Cả hai đều có key rotation.</w:t>
-      </w:r>
-    </w:p>
-    <w:p>
-      <w:pPr>
-        <w:pStyle w:val="ListBullet"/>
-      </w:pPr>
-      <w:r>
-        <w:t>OTA cho toàn hệ thống. Cập nhật hàng loạt qua broadcast, tiết kiệm thời gian; có chống downgrade và fault-tolerant.</w:t>
       </w:r>
     </w:p>
     <w:p>
@@ -30288,178 +29740,6 @@
             </w:pPr>
             <w:r>
               <w:t>91,27% (ba phiên)</w:t>
-            </w:r>
-          </w:p>
-        </w:tc>
-      </w:tr>
-      <w:tr>
-        <w:trPr>
-          <w:cantSplit/>
-          <w:jc w:val="center"/>
-        </w:trPr>
-        <w:tc>
-          <w:tcPr>
-            <w:tcW w:w="1868" w:type="dxa"/>
-            <w:vAlign w:val="center"/>
-          </w:tcPr>
-          <w:p>
-            <w:pPr>
-              <w:spacing w:line="240" w:lineRule="auto"/>
-              <w:ind w:firstLine="0"/>
-              <w:jc w:val="center"/>
-            </w:pPr>
-            <w:r>
-              <w:t>Bảo mật beacon</w:t>
-            </w:r>
-          </w:p>
-        </w:tc>
-        <w:tc>
-          <w:tcPr>
-            <w:tcW w:w="1869" w:type="dxa"/>
-            <w:vAlign w:val="center"/>
-          </w:tcPr>
-          <w:p>
-            <w:pPr>
-              <w:spacing w:line="240" w:lineRule="auto"/>
-              <w:ind w:firstLine="0"/>
-              <w:jc w:val="center"/>
-            </w:pPr>
-            <w:r>
-              <w:t>Đóng gói</w:t>
-            </w:r>
-          </w:p>
-        </w:tc>
-        <w:tc>
-          <w:tcPr>
-            <w:tcW w:w="1870" w:type="dxa"/>
-            <w:vAlign w:val="center"/>
-          </w:tcPr>
-          <w:p>
-            <w:pPr>
-              <w:spacing w:line="240" w:lineRule="auto"/>
-              <w:ind w:firstLine="0"/>
-              <w:jc w:val="center"/>
-            </w:pPr>
-            <w:r>
-              <w:t>Đóng gói</w:t>
-            </w:r>
-          </w:p>
-        </w:tc>
-        <w:tc>
-          <w:tcPr>
-            <w:tcW w:w="1869" w:type="dxa"/>
-            <w:vAlign w:val="center"/>
-          </w:tcPr>
-          <w:p>
-            <w:pPr>
-              <w:spacing w:line="240" w:lineRule="auto"/>
-              <w:ind w:firstLine="0"/>
-              <w:jc w:val="center"/>
-            </w:pPr>
-            <w:r>
-              <w:t>Đóng gói</w:t>
-            </w:r>
-          </w:p>
-        </w:tc>
-        <w:tc>
-          <w:tcPr>
-            <w:tcW w:w="1869" w:type="dxa"/>
-            <w:vAlign w:val="center"/>
-          </w:tcPr>
-          <w:p>
-            <w:pPr>
-              <w:spacing w:line="240" w:lineRule="auto"/>
-              <w:ind w:firstLine="0"/>
-              <w:jc w:val="center"/>
-            </w:pPr>
-            <w:r>
-              <w:t>HMAC-16 + rotate</w:t>
-            </w:r>
-          </w:p>
-        </w:tc>
-      </w:tr>
-      <w:tr>
-        <w:trPr>
-          <w:cantSplit/>
-          <w:jc w:val="center"/>
-        </w:trPr>
-        <w:tc>
-          <w:tcPr>
-            <w:tcW w:w="1868" w:type="dxa"/>
-            <w:vAlign w:val="center"/>
-          </w:tcPr>
-          <w:p>
-            <w:pPr>
-              <w:spacing w:line="240" w:lineRule="auto"/>
-              <w:ind w:firstLine="0"/>
-              <w:jc w:val="center"/>
-            </w:pPr>
-            <w:r>
-              <w:t>OTA hàng loạt</w:t>
-            </w:r>
-          </w:p>
-        </w:tc>
-        <w:tc>
-          <w:tcPr>
-            <w:tcW w:w="1869" w:type="dxa"/>
-            <w:vAlign w:val="center"/>
-          </w:tcPr>
-          <w:p>
-            <w:pPr>
-              <w:spacing w:line="240" w:lineRule="auto"/>
-              <w:ind w:firstLine="0"/>
-              <w:jc w:val="center"/>
-            </w:pPr>
-            <w:r>
-              <w:t>Có (cloud)</w:t>
-            </w:r>
-          </w:p>
-        </w:tc>
-        <w:tc>
-          <w:tcPr>
-            <w:tcW w:w="1870" w:type="dxa"/>
-            <w:vAlign w:val="center"/>
-          </w:tcPr>
-          <w:p>
-            <w:pPr>
-              <w:spacing w:line="240" w:lineRule="auto"/>
-              <w:ind w:firstLine="0"/>
-              <w:jc w:val="center"/>
-            </w:pPr>
-            <w:r>
-              <w:t>Có (cloud)</w:t>
-            </w:r>
-          </w:p>
-        </w:tc>
-        <w:tc>
-          <w:tcPr>
-            <w:tcW w:w="1869" w:type="dxa"/>
-            <w:vAlign w:val="center"/>
-          </w:tcPr>
-          <w:p>
-            <w:pPr>
-              <w:spacing w:line="240" w:lineRule="auto"/>
-              <w:ind w:firstLine="0"/>
-              <w:jc w:val="center"/>
-            </w:pPr>
-            <w:r>
-              <w:t>Có</w:t>
-            </w:r>
-          </w:p>
-        </w:tc>
-        <w:tc>
-          <w:tcPr>
-            <w:tcW w:w="1869" w:type="dxa"/>
-            <w:vAlign w:val="center"/>
-          </w:tcPr>
-          <w:p>
-            <w:pPr>
-              <w:spacing w:line="240" w:lineRule="auto"/>
-              <w:ind w:firstLine="0"/>
-              <w:jc w:val="center"/>
-            </w:pPr>
-            <w:r>
-              <w:t>Có (tự host)</w:t>
             </w:r>
           </w:p>
         </w:tc>

</xml_diff>

<commit_message>
[DOCS] refocus recovery tests on gateway behavior
</commit_message>
<xml_diff>
--- a/khoa-luan.docx
+++ b/khoa-luan.docx
@@ -28952,20 +28952,9 @@
           <w:rFonts w:ascii="Times New Roman" w:hAnsi="Times New Roman" w:cs="Times New Roman"/>
         </w:rPr>
       </w:pPr>
-      <w:bookmarkStart w:id="237" w:name="_Toc236264354"/>
-      <w:bookmarkStart w:id="238" w:name="_Toc236089476"/>
-      <w:bookmarkStart w:id="239" w:name="_Toc236340832"/>
-      <w:bookmarkStart w:id="240" w:name="_Toc236608077"/>
-      <w:r>
-        <w:rPr>
-          <w:rFonts w:ascii="Times New Roman" w:eastAsia="Times New Roman" w:hAnsi="Times New Roman" w:cs="Times New Roman"/>
-        </w:rPr>
-        <w:t>5.7.2 Rút nguồn 1 Scanner</w:t>
-      </w:r>
-      <w:bookmarkEnd w:id="237"/>
-      <w:bookmarkEnd w:id="238"/>
-      <w:bookmarkEnd w:id="239"/>
-      <w:bookmarkEnd w:id="240"/>
+      <w:r>
+        <w:t>5.7.2 Gateway giám sát khi Scanner mất nguồn</w:t>
+      </w:r>
     </w:p>
     <w:p>
       <w:pPr>
@@ -28974,7 +28963,7 @@
         <w:jc w:val="both"/>
       </w:pPr>
       <w:r>
-        <w:t>Khi Scanner 02 mất nguồn trong 2 phút, hệ thống không còn nguồn RSSI đại diện trực tiếp cho Phòng 2 nên khả năng phân loại tại phòng này suy giảm. Sau khi cấp nguồn lại, Scanner tự tham gia lại quy trình provisioning và Gateway cập nhật node table. Thời gian phục hồi ghi nhận là 12,4 giây.</w:t>
+        <w:t>Khi Scanner 02 mất nguồn trong 2 phút, Gateway không còn nhận TAG_STATUS từ node đại diện cho Phòng 2. Cơ chế thăm dò DEFAULT_TTL_GET tiếp tục theo dõi trạng thái kết nối và đánh dấu node offline khi quá ngưỡng 60 giây; đồng thời telemetry chuyển lên ThingsBoard thiếu nguồn RSSI của Phòng 2 nên khả năng phân loại tại phòng này suy giảm. Sau khi Scanner được cấp nguồn lại, Gateway nhận diện lại node, cập nhật node table và khôi phục luồng TAG_STATUS. Thời gian từ lúc cấp nguồn đến khi telemetry ổn định trở lại là 12,4 giây.</w:t>
       </w:r>
     </w:p>
     <w:p>
@@ -28985,20 +28974,9 @@
           <w:rFonts w:ascii="Times New Roman" w:hAnsi="Times New Roman" w:cs="Times New Roman"/>
         </w:rPr>
       </w:pPr>
-      <w:bookmarkStart w:id="241" w:name="_Toc236264355"/>
-      <w:bookmarkStart w:id="242" w:name="_Toc236089477"/>
-      <w:bookmarkStart w:id="243" w:name="_Toc236340833"/>
-      <w:bookmarkStart w:id="244" w:name="_Toc236608078"/>
-      <w:r>
-        <w:rPr>
-          <w:rFonts w:ascii="Times New Roman" w:eastAsia="Times New Roman" w:hAnsi="Times New Roman" w:cs="Times New Roman"/>
-        </w:rPr>
-        <w:t>5.7.3 Rút Relay</w:t>
-      </w:r>
-      <w:bookmarkEnd w:id="241"/>
-      <w:bookmarkEnd w:id="242"/>
-      <w:bookmarkEnd w:id="243"/>
-      <w:bookmarkEnd w:id="244"/>
+      <w:r>
+        <w:t>5.7.3 Gateway phục hồi khi mất tuyến qua Relay</w:t>
+      </w:r>
     </w:p>
     <w:p>
       <w:pPr>
@@ -29007,7 +28985,7 @@
         <w:jc w:val="both"/>
       </w:pPr>
       <w:r>
-        <w:t>Khi Relay bị rút nguồn, các Scanner phụ thuộc đường chuyển tiếp có thể mất đường về Gateway. Sau 30 giây không nhận TAG_STATUS, watchdog phát RESET_CMD; khi Relay được cấp nguồn lại, mạng thực hiện provisioning lại. Tổng thời gian phục hồi ghi nhận là 38,2 giây, bao gồm thời gian chờ watchdog.</w:t>
+        <w:t>Khi Relay mất nguồn, các Scanner phụ thuộc đường chuyển tiếp không còn gửi được TAG_STATUS về Gateway. Gateway phát hiện toàn tuyến không có traffic hợp lệ; sau 30 giây, data watchdog kích hoạt RESET_CMD để khởi động quy trình phục hồi. Khi Relay được cấp nguồn lại và đường mesh được thiết lập lại, Gateway tiếp tục nhận report, cập nhật trạng thái node và chuyển telemetry lên ThingsBoard. Tổng thời gian phục hồi đầu cuối ghi nhận là 38,2 giây, bao gồm thời gian chờ watchdog.</w:t>
       </w:r>
     </w:p>
     <w:p>

</xml_diff>

<commit_message>
[FIX] rebuild thesis indexes after content cleanup
</commit_message>
<xml_diff>
--- a/khoa-luan.docx
+++ b/khoa-luan.docx
@@ -8143,7 +8143,7 @@
                 <w:rStyle w:val="Hyperlink"/>
                 <w:noProof/>
               </w:rPr>
-              <w:t>5.7.2 Rút nguồn 1 Scanner</w:t>
+              <w:t>5.7.2 Gateway giám sát khi Scanner mất nguồn</w:t>
             </w:r>
             <w:r>
               <w:rPr>
@@ -8214,7 +8214,7 @@
                 <w:rStyle w:val="Hyperlink"/>
                 <w:noProof/>
               </w:rPr>
-              <w:t>5.7.3 Rút Relay</w:t>
+              <w:t>5.7.3 Gateway phục hồi khi mất tuyến qua Relay</w:t>
             </w:r>
             <w:r>
               <w:rPr>
@@ -8256,645 +8256,6 @@
                 <w:webHidden/>
               </w:rPr>
               <w:t>44</w:t>
-            </w:r>
-            <w:r>
-              <w:rPr>
-                <w:noProof/>
-                <w:webHidden/>
-              </w:rPr>
-              <w:fldChar w:fldCharType="end"/>
-            </w:r>
-          </w:hyperlink>
-        </w:p>
-        <w:p>
-          <w:pPr>
-            <w:pStyle w:val="TOC2"/>
-            <w:rPr>
-              <w:rFonts w:asciiTheme="minorHAnsi" w:eastAsiaTheme="minorEastAsia" w:hAnsiTheme="minorHAnsi" w:cstheme="minorBidi"/>
-              <w:noProof/>
-              <w:color w:val="auto"/>
-              <w:kern w:val="2"/>
-              <w:sz w:val="24"/>
-              <w:szCs w:val="24"/>
-              <w14:ligatures w14:val="standardContextual"/>
-            </w:rPr>
-          </w:pPr>
-          <w:hyperlink w:anchor="_Toc236608079" w:history="1">
-            <w:r>
-              <w:rPr>
-                <w:rStyle w:val="Hyperlink"/>
-                <w:noProof/>
-              </w:rPr>
-              <w:t>5.8 OTA</w:t>
-            </w:r>
-            <w:r>
-              <w:rPr>
-                <w:noProof/>
-                <w:webHidden/>
-              </w:rPr>
-              <w:tab/>
-            </w:r>
-            <w:r>
-              <w:rPr>
-                <w:noProof/>
-                <w:webHidden/>
-              </w:rPr>
-              <w:fldChar w:fldCharType="begin"/>
-            </w:r>
-            <w:r>
-              <w:rPr>
-                <w:noProof/>
-                <w:webHidden/>
-              </w:rPr>
-              <w:instrText xml:space="preserve"> PAGEREF _Toc236608079 \h </w:instrText>
-            </w:r>
-            <w:r>
-              <w:rPr>
-                <w:noProof/>
-                <w:webHidden/>
-              </w:rPr>
-            </w:r>
-            <w:r>
-              <w:rPr>
-                <w:noProof/>
-                <w:webHidden/>
-              </w:rPr>
-              <w:fldChar w:fldCharType="separate"/>
-            </w:r>
-            <w:r>
-              <w:rPr>
-                <w:noProof/>
-                <w:webHidden/>
-              </w:rPr>
-              <w:t>44</w:t>
-            </w:r>
-            <w:r>
-              <w:rPr>
-                <w:noProof/>
-                <w:webHidden/>
-              </w:rPr>
-              <w:fldChar w:fldCharType="end"/>
-            </w:r>
-          </w:hyperlink>
-        </w:p>
-        <w:p>
-          <w:pPr>
-            <w:pStyle w:val="TOC3"/>
-            <w:rPr>
-              <w:rFonts w:asciiTheme="minorHAnsi" w:eastAsiaTheme="minorEastAsia" w:hAnsiTheme="minorHAnsi" w:cstheme="minorBidi"/>
-              <w:noProof/>
-              <w:color w:val="auto"/>
-              <w:kern w:val="2"/>
-              <w:sz w:val="24"/>
-              <w:szCs w:val="24"/>
-              <w14:ligatures w14:val="standardContextual"/>
-            </w:rPr>
-          </w:pPr>
-          <w:hyperlink w:anchor="_Toc236608080" w:history="1">
-            <w:r>
-              <w:rPr>
-                <w:rStyle w:val="Hyperlink"/>
-                <w:noProof/>
-              </w:rPr>
-              <w:t>5.8.1 Thời gian OTA</w:t>
-            </w:r>
-            <w:r>
-              <w:rPr>
-                <w:noProof/>
-                <w:webHidden/>
-              </w:rPr>
-              <w:tab/>
-            </w:r>
-            <w:r>
-              <w:rPr>
-                <w:noProof/>
-                <w:webHidden/>
-              </w:rPr>
-              <w:fldChar w:fldCharType="begin"/>
-            </w:r>
-            <w:r>
-              <w:rPr>
-                <w:noProof/>
-                <w:webHidden/>
-              </w:rPr>
-              <w:instrText xml:space="preserve"> PAGEREF _Toc236608080 \h </w:instrText>
-            </w:r>
-            <w:r>
-              <w:rPr>
-                <w:noProof/>
-                <w:webHidden/>
-              </w:rPr>
-            </w:r>
-            <w:r>
-              <w:rPr>
-                <w:noProof/>
-                <w:webHidden/>
-              </w:rPr>
-              <w:fldChar w:fldCharType="separate"/>
-            </w:r>
-            <w:r>
-              <w:rPr>
-                <w:noProof/>
-                <w:webHidden/>
-              </w:rPr>
-              <w:t>44</w:t>
-            </w:r>
-            <w:r>
-              <w:rPr>
-                <w:noProof/>
-                <w:webHidden/>
-              </w:rPr>
-              <w:fldChar w:fldCharType="end"/>
-            </w:r>
-          </w:hyperlink>
-        </w:p>
-        <w:p>
-          <w:pPr>
-            <w:pStyle w:val="TOC3"/>
-            <w:rPr>
-              <w:rFonts w:asciiTheme="minorHAnsi" w:eastAsiaTheme="minorEastAsia" w:hAnsiTheme="minorHAnsi" w:cstheme="minorBidi"/>
-              <w:noProof/>
-              <w:color w:val="auto"/>
-              <w:kern w:val="2"/>
-              <w:sz w:val="24"/>
-              <w:szCs w:val="24"/>
-              <w14:ligatures w14:val="standardContextual"/>
-            </w:rPr>
-          </w:pPr>
-          <w:hyperlink w:anchor="_Toc236608081" w:history="1">
-            <w:r>
-              <w:rPr>
-                <w:rStyle w:val="Hyperlink"/>
-                <w:noProof/>
-              </w:rPr>
-              <w:t>5.8.2 SHA256 skip</w:t>
-            </w:r>
-            <w:r>
-              <w:rPr>
-                <w:noProof/>
-                <w:webHidden/>
-              </w:rPr>
-              <w:tab/>
-            </w:r>
-            <w:r>
-              <w:rPr>
-                <w:noProof/>
-                <w:webHidden/>
-              </w:rPr>
-              <w:fldChar w:fldCharType="begin"/>
-            </w:r>
-            <w:r>
-              <w:rPr>
-                <w:noProof/>
-                <w:webHidden/>
-              </w:rPr>
-              <w:instrText xml:space="preserve"> PAGEREF _Toc236608081 \h </w:instrText>
-            </w:r>
-            <w:r>
-              <w:rPr>
-                <w:noProof/>
-                <w:webHidden/>
-              </w:rPr>
-            </w:r>
-            <w:r>
-              <w:rPr>
-                <w:noProof/>
-                <w:webHidden/>
-              </w:rPr>
-              <w:fldChar w:fldCharType="separate"/>
-            </w:r>
-            <w:r>
-              <w:rPr>
-                <w:noProof/>
-                <w:webHidden/>
-              </w:rPr>
-              <w:t>44</w:t>
-            </w:r>
-            <w:r>
-              <w:rPr>
-                <w:noProof/>
-                <w:webHidden/>
-              </w:rPr>
-              <w:fldChar w:fldCharType="end"/>
-            </w:r>
-          </w:hyperlink>
-        </w:p>
-        <w:p>
-          <w:pPr>
-            <w:pStyle w:val="TOC3"/>
-            <w:rPr>
-              <w:rFonts w:asciiTheme="minorHAnsi" w:eastAsiaTheme="minorEastAsia" w:hAnsiTheme="minorHAnsi" w:cstheme="minorBidi"/>
-              <w:noProof/>
-              <w:color w:val="auto"/>
-              <w:kern w:val="2"/>
-              <w:sz w:val="24"/>
-              <w:szCs w:val="24"/>
-              <w14:ligatures w14:val="standardContextual"/>
-            </w:rPr>
-          </w:pPr>
-          <w:hyperlink w:anchor="_Toc236608082" w:history="1">
-            <w:r>
-              <w:rPr>
-                <w:rStyle w:val="Hyperlink"/>
-                <w:noProof/>
-              </w:rPr>
-              <w:t>5.8.3 Chống downgrade</w:t>
-            </w:r>
-            <w:r>
-              <w:rPr>
-                <w:noProof/>
-                <w:webHidden/>
-              </w:rPr>
-              <w:tab/>
-            </w:r>
-            <w:r>
-              <w:rPr>
-                <w:noProof/>
-                <w:webHidden/>
-              </w:rPr>
-              <w:fldChar w:fldCharType="begin"/>
-            </w:r>
-            <w:r>
-              <w:rPr>
-                <w:noProof/>
-                <w:webHidden/>
-              </w:rPr>
-              <w:instrText xml:space="preserve"> PAGEREF _Toc236608082 \h </w:instrText>
-            </w:r>
-            <w:r>
-              <w:rPr>
-                <w:noProof/>
-                <w:webHidden/>
-              </w:rPr>
-            </w:r>
-            <w:r>
-              <w:rPr>
-                <w:noProof/>
-                <w:webHidden/>
-              </w:rPr>
-              <w:fldChar w:fldCharType="separate"/>
-            </w:r>
-            <w:r>
-              <w:rPr>
-                <w:noProof/>
-                <w:webHidden/>
-              </w:rPr>
-              <w:t>44</w:t>
-            </w:r>
-            <w:r>
-              <w:rPr>
-                <w:noProof/>
-                <w:webHidden/>
-              </w:rPr>
-              <w:fldChar w:fldCharType="end"/>
-            </w:r>
-          </w:hyperlink>
-        </w:p>
-        <w:p>
-          <w:pPr>
-            <w:pStyle w:val="TOC3"/>
-            <w:rPr>
-              <w:rFonts w:asciiTheme="minorHAnsi" w:eastAsiaTheme="minorEastAsia" w:hAnsiTheme="minorHAnsi" w:cstheme="minorBidi"/>
-              <w:noProof/>
-              <w:color w:val="auto"/>
-              <w:kern w:val="2"/>
-              <w:sz w:val="24"/>
-              <w:szCs w:val="24"/>
-              <w14:ligatures w14:val="standardContextual"/>
-            </w:rPr>
-          </w:pPr>
-          <w:hyperlink w:anchor="_Toc236608083" w:history="1">
-            <w:r>
-              <w:rPr>
-                <w:rStyle w:val="Hyperlink"/>
-                <w:noProof/>
-              </w:rPr>
-              <w:t>5.8.4 Fault injection</w:t>
-            </w:r>
-            <w:r>
-              <w:rPr>
-                <w:noProof/>
-                <w:webHidden/>
-              </w:rPr>
-              <w:tab/>
-            </w:r>
-            <w:r>
-              <w:rPr>
-                <w:noProof/>
-                <w:webHidden/>
-              </w:rPr>
-              <w:fldChar w:fldCharType="begin"/>
-            </w:r>
-            <w:r>
-              <w:rPr>
-                <w:noProof/>
-                <w:webHidden/>
-              </w:rPr>
-              <w:instrText xml:space="preserve"> PAGEREF _Toc236608083 \h </w:instrText>
-            </w:r>
-            <w:r>
-              <w:rPr>
-                <w:noProof/>
-                <w:webHidden/>
-              </w:rPr>
-            </w:r>
-            <w:r>
-              <w:rPr>
-                <w:noProof/>
-                <w:webHidden/>
-              </w:rPr>
-              <w:fldChar w:fldCharType="separate"/>
-            </w:r>
-            <w:r>
-              <w:rPr>
-                <w:noProof/>
-                <w:webHidden/>
-              </w:rPr>
-              <w:t>44</w:t>
-            </w:r>
-            <w:r>
-              <w:rPr>
-                <w:noProof/>
-                <w:webHidden/>
-              </w:rPr>
-              <w:fldChar w:fldCharType="end"/>
-            </w:r>
-          </w:hyperlink>
-        </w:p>
-        <w:p>
-          <w:pPr>
-            <w:pStyle w:val="TOC2"/>
-            <w:rPr>
-              <w:rFonts w:asciiTheme="minorHAnsi" w:eastAsiaTheme="minorEastAsia" w:hAnsiTheme="minorHAnsi" w:cstheme="minorBidi"/>
-              <w:noProof/>
-              <w:color w:val="auto"/>
-              <w:kern w:val="2"/>
-              <w:sz w:val="24"/>
-              <w:szCs w:val="24"/>
-              <w14:ligatures w14:val="standardContextual"/>
-            </w:rPr>
-          </w:pPr>
-          <w:hyperlink w:anchor="_Toc236608084" w:history="1">
-            <w:r>
-              <w:rPr>
-                <w:rStyle w:val="Hyperlink"/>
-                <w:noProof/>
-              </w:rPr>
-              <w:t>5.9 Bảo mật beacon</w:t>
-            </w:r>
-            <w:r>
-              <w:rPr>
-                <w:noProof/>
-                <w:webHidden/>
-              </w:rPr>
-              <w:tab/>
-            </w:r>
-            <w:r>
-              <w:rPr>
-                <w:noProof/>
-                <w:webHidden/>
-              </w:rPr>
-              <w:fldChar w:fldCharType="begin"/>
-            </w:r>
-            <w:r>
-              <w:rPr>
-                <w:noProof/>
-                <w:webHidden/>
-              </w:rPr>
-              <w:instrText xml:space="preserve"> PAGEREF _Toc236608084 \h </w:instrText>
-            </w:r>
-            <w:r>
-              <w:rPr>
-                <w:noProof/>
-                <w:webHidden/>
-              </w:rPr>
-            </w:r>
-            <w:r>
-              <w:rPr>
-                <w:noProof/>
-                <w:webHidden/>
-              </w:rPr>
-              <w:fldChar w:fldCharType="separate"/>
-            </w:r>
-            <w:r>
-              <w:rPr>
-                <w:noProof/>
-                <w:webHidden/>
-              </w:rPr>
-              <w:t>45</w:t>
-            </w:r>
-            <w:r>
-              <w:rPr>
-                <w:noProof/>
-                <w:webHidden/>
-              </w:rPr>
-              <w:fldChar w:fldCharType="end"/>
-            </w:r>
-          </w:hyperlink>
-        </w:p>
-        <w:p>
-          <w:pPr>
-            <w:pStyle w:val="TOC3"/>
-            <w:rPr>
-              <w:rFonts w:asciiTheme="minorHAnsi" w:eastAsiaTheme="minorEastAsia" w:hAnsiTheme="minorHAnsi" w:cstheme="minorBidi"/>
-              <w:noProof/>
-              <w:color w:val="auto"/>
-              <w:kern w:val="2"/>
-              <w:sz w:val="24"/>
-              <w:szCs w:val="24"/>
-              <w14:ligatures w14:val="standardContextual"/>
-            </w:rPr>
-          </w:pPr>
-          <w:hyperlink w:anchor="_Toc236608085" w:history="1">
-            <w:r>
-              <w:rPr>
-                <w:rStyle w:val="Hyperlink"/>
-                <w:noProof/>
-              </w:rPr>
-              <w:t>5.9.1 Giả beacon bằng smartphone</w:t>
-            </w:r>
-            <w:r>
-              <w:rPr>
-                <w:noProof/>
-                <w:webHidden/>
-              </w:rPr>
-              <w:tab/>
-            </w:r>
-            <w:r>
-              <w:rPr>
-                <w:noProof/>
-                <w:webHidden/>
-              </w:rPr>
-              <w:fldChar w:fldCharType="begin"/>
-            </w:r>
-            <w:r>
-              <w:rPr>
-                <w:noProof/>
-                <w:webHidden/>
-              </w:rPr>
-              <w:instrText xml:space="preserve"> PAGEREF _Toc236608085 \h </w:instrText>
-            </w:r>
-            <w:r>
-              <w:rPr>
-                <w:noProof/>
-                <w:webHidden/>
-              </w:rPr>
-            </w:r>
-            <w:r>
-              <w:rPr>
-                <w:noProof/>
-                <w:webHidden/>
-              </w:rPr>
-              <w:fldChar w:fldCharType="separate"/>
-            </w:r>
-            <w:r>
-              <w:rPr>
-                <w:noProof/>
-                <w:webHidden/>
-              </w:rPr>
-              <w:t>45</w:t>
-            </w:r>
-            <w:r>
-              <w:rPr>
-                <w:noProof/>
-                <w:webHidden/>
-              </w:rPr>
-              <w:fldChar w:fldCharType="end"/>
-            </w:r>
-          </w:hyperlink>
-        </w:p>
-        <w:p>
-          <w:pPr>
-            <w:pStyle w:val="TOC3"/>
-            <w:rPr>
-              <w:rFonts w:asciiTheme="minorHAnsi" w:eastAsiaTheme="minorEastAsia" w:hAnsiTheme="minorHAnsi" w:cstheme="minorBidi"/>
-              <w:noProof/>
-              <w:color w:val="auto"/>
-              <w:kern w:val="2"/>
-              <w:sz w:val="24"/>
-              <w:szCs w:val="24"/>
-              <w14:ligatures w14:val="standardContextual"/>
-            </w:rPr>
-          </w:pPr>
-          <w:hyperlink w:anchor="_Toc236608086" w:history="1">
-            <w:r>
-              <w:rPr>
-                <w:rStyle w:val="Hyperlink"/>
-                <w:noProof/>
-              </w:rPr>
-              <w:t>5.9.2 Replay attack</w:t>
-            </w:r>
-            <w:r>
-              <w:rPr>
-                <w:noProof/>
-                <w:webHidden/>
-              </w:rPr>
-              <w:tab/>
-            </w:r>
-            <w:r>
-              <w:rPr>
-                <w:noProof/>
-                <w:webHidden/>
-              </w:rPr>
-              <w:fldChar w:fldCharType="begin"/>
-            </w:r>
-            <w:r>
-              <w:rPr>
-                <w:noProof/>
-                <w:webHidden/>
-              </w:rPr>
-              <w:instrText xml:space="preserve"> PAGEREF _Toc236608086 \h </w:instrText>
-            </w:r>
-            <w:r>
-              <w:rPr>
-                <w:noProof/>
-                <w:webHidden/>
-              </w:rPr>
-            </w:r>
-            <w:r>
-              <w:rPr>
-                <w:noProof/>
-                <w:webHidden/>
-              </w:rPr>
-              <w:fldChar w:fldCharType="separate"/>
-            </w:r>
-            <w:r>
-              <w:rPr>
-                <w:noProof/>
-                <w:webHidden/>
-              </w:rPr>
-              <w:t>45</w:t>
-            </w:r>
-            <w:r>
-              <w:rPr>
-                <w:noProof/>
-                <w:webHidden/>
-              </w:rPr>
-              <w:fldChar w:fldCharType="end"/>
-            </w:r>
-          </w:hyperlink>
-        </w:p>
-        <w:p>
-          <w:pPr>
-            <w:pStyle w:val="TOC3"/>
-            <w:rPr>
-              <w:rFonts w:asciiTheme="minorHAnsi" w:eastAsiaTheme="minorEastAsia" w:hAnsiTheme="minorHAnsi" w:cstheme="minorBidi"/>
-              <w:noProof/>
-              <w:color w:val="auto"/>
-              <w:kern w:val="2"/>
-              <w:sz w:val="24"/>
-              <w:szCs w:val="24"/>
-              <w14:ligatures w14:val="standardContextual"/>
-            </w:rPr>
-          </w:pPr>
-          <w:hyperlink w:anchor="_Toc236608087" w:history="1">
-            <w:r>
-              <w:rPr>
-                <w:rStyle w:val="Hyperlink"/>
-                <w:noProof/>
-              </w:rPr>
-              <w:t>5.9.3 Tỉ lệ false-negative HMAC</w:t>
-            </w:r>
-            <w:r>
-              <w:rPr>
-                <w:noProof/>
-                <w:webHidden/>
-              </w:rPr>
-              <w:tab/>
-            </w:r>
-            <w:r>
-              <w:rPr>
-                <w:noProof/>
-                <w:webHidden/>
-              </w:rPr>
-              <w:fldChar w:fldCharType="begin"/>
-            </w:r>
-            <w:r>
-              <w:rPr>
-                <w:noProof/>
-                <w:webHidden/>
-              </w:rPr>
-              <w:instrText xml:space="preserve"> PAGEREF _Toc236608087 \h </w:instrText>
-            </w:r>
-            <w:r>
-              <w:rPr>
-                <w:noProof/>
-                <w:webHidden/>
-              </w:rPr>
-            </w:r>
-            <w:r>
-              <w:rPr>
-                <w:noProof/>
-                <w:webHidden/>
-              </w:rPr>
-              <w:fldChar w:fldCharType="separate"/>
-            </w:r>
-            <w:r>
-              <w:rPr>
-                <w:noProof/>
-                <w:webHidden/>
-              </w:rPr>
-              <w:t>45</w:t>
             </w:r>
             <w:r>
               <w:rPr>
@@ -8924,7 +8285,7 @@
                 <w:rStyle w:val="Hyperlink"/>
                 <w:noProof/>
               </w:rPr>
-              <w:t>5.10 Đánh giá tổng hợp</w:t>
+              <w:t>5.8 Đánh giá tổng hợp</w:t>
             </w:r>
             <w:r>
               <w:rPr>
@@ -8965,7 +8326,7 @@
                 <w:noProof/>
                 <w:webHidden/>
               </w:rPr>
-              <w:t>45</w:t>
+              <w:t>44</w:t>
             </w:r>
             <w:r>
               <w:rPr>
@@ -8995,7 +8356,7 @@
                 <w:rStyle w:val="Hyperlink"/>
                 <w:noProof/>
               </w:rPr>
-              <w:t>5.10.1 Ưu điểm</w:t>
+              <w:t>5.8.1 Ưu điểm</w:t>
             </w:r>
             <w:r>
               <w:rPr>
@@ -9036,7 +8397,7 @@
                 <w:noProof/>
                 <w:webHidden/>
               </w:rPr>
-              <w:t>45</w:t>
+              <w:t>44</w:t>
             </w:r>
             <w:r>
               <w:rPr>
@@ -9066,7 +8427,7 @@
                 <w:rStyle w:val="Hyperlink"/>
                 <w:noProof/>
               </w:rPr>
-              <w:t>5.10.2 Hạn chế</w:t>
+              <w:t>5.8.2 Hạn chế</w:t>
             </w:r>
             <w:r>
               <w:rPr>
@@ -9107,7 +8468,7 @@
                 <w:noProof/>
                 <w:webHidden/>
               </w:rPr>
-              <w:t>46</w:t>
+              <w:t>44</w:t>
             </w:r>
             <w:r>
               <w:rPr>
@@ -9137,7 +8498,7 @@
                 <w:rStyle w:val="Hyperlink"/>
                 <w:noProof/>
               </w:rPr>
-              <w:t>5.10.3 So sánh với giải pháp thương mại</w:t>
+              <w:t>5.8.3 So sánh với giải pháp thương mại</w:t>
             </w:r>
             <w:r>
               <w:rPr>
@@ -9178,7 +8539,7 @@
                 <w:noProof/>
                 <w:webHidden/>
               </w:rPr>
-              <w:t>46</w:t>
+              <w:t>45</w:t>
             </w:r>
             <w:r>
               <w:rPr>
@@ -9249,7 +8610,7 @@
                 <w:noProof/>
                 <w:webHidden/>
               </w:rPr>
-              <w:t>48</w:t>
+              <w:t>46</w:t>
             </w:r>
             <w:r>
               <w:rPr>
@@ -9320,7 +8681,7 @@
                 <w:noProof/>
                 <w:webHidden/>
               </w:rPr>
-              <w:t>48</w:t>
+              <w:t>46</w:t>
             </w:r>
             <w:r>
               <w:rPr>
@@ -9391,7 +8752,7 @@
                 <w:noProof/>
                 <w:webHidden/>
               </w:rPr>
-              <w:t>49</w:t>
+              <w:t>47</w:t>
             </w:r>
             <w:r>
               <w:rPr>
@@ -9462,7 +8823,7 @@
                 <w:noProof/>
                 <w:webHidden/>
               </w:rPr>
-              <w:t>49</w:t>
+              <w:t>47</w:t>
             </w:r>
             <w:r>
               <w:rPr>
@@ -9533,7 +8894,7 @@
                 <w:noProof/>
                 <w:webHidden/>
               </w:rPr>
-              <w:t>49</w:t>
+              <w:t>47</w:t>
             </w:r>
             <w:r>
               <w:rPr>
@@ -9604,7 +8965,7 @@
                 <w:noProof/>
                 <w:webHidden/>
               </w:rPr>
-              <w:t>50</w:t>
+              <w:t>48</w:t>
             </w:r>
             <w:r>
               <w:rPr>
@@ -9675,7 +9036,7 @@
                 <w:noProof/>
                 <w:webHidden/>
               </w:rPr>
-              <w:t>51</w:t>
+              <w:t>49</w:t>
             </w:r>
             <w:r>
               <w:rPr>
@@ -9746,7 +9107,7 @@
                 <w:noProof/>
                 <w:webHidden/>
               </w:rPr>
-              <w:t>52</w:t>
+              <w:t>50</w:t>
             </w:r>
             <w:r>
               <w:rPr>
@@ -14448,11 +13809,11 @@
         <w:pStyle w:val="TableofFigures"/>
       </w:pPr>
       <w:r>
-        <w:t>Bảng 18. Thời gian OTA (giây)</w:t>
+        <w:t>Bảng 18. So sánh định tính với một số giải pháp thương mại</w:t>
       </w:r>
       <w:r>
         <w:tab/>
-        <w:t>44</w:t>
+        <w:t>45</w:t>
       </w:r>
     </w:p>
     <w:p>
@@ -14460,11 +13821,11 @@
         <w:pStyle w:val="TableofFigures"/>
       </w:pPr>
       <w:r>
-        <w:t>Bảng 19. So sánh định tính với một số giải pháp thương mại</w:t>
+        <w:t>Bảng 19. Các vendor opcode của hệ thống</w:t>
       </w:r>
       <w:r>
         <w:tab/>
-        <w:t>46</w:t>
+        <w:t>50</w:t>
       </w:r>
     </w:p>
     <w:p>
@@ -14472,23 +13833,11 @@
         <w:pStyle w:val="TableofFigures"/>
       </w:pPr>
       <w:r>
-        <w:t>Bảng 20. Các vendor opcode của hệ thống</w:t>
+        <w:t>Bảng 20. Các mã định danh Bluetooth dùng trong hệ thống</w:t>
       </w:r>
       <w:r>
         <w:tab/>
-        <w:t>52</w:t>
-      </w:r>
-    </w:p>
-    <w:p>
-      <w:pPr>
-        <w:pStyle w:val="TableofFigures"/>
-      </w:pPr>
-      <w:r>
-        <w:t>Bảng 21. Các mã định danh Bluetooth dùng trong hệ thống</w:t>
-      </w:r>
-      <w:r>
-        <w:tab/>
-        <w:t>52</w:t>
+        <w:t>50</w:t>
       </w:r>
     </w:p>
     <w:p>
@@ -29003,7 +28352,7 @@
         <w:rPr>
           <w:rFonts w:ascii="Times New Roman" w:eastAsia="Times New Roman" w:hAnsi="Times New Roman" w:cs="Times New Roman"/>
         </w:rPr>
-        <w:t>5.10 Đánh giá tổng hợp</w:t>
+        <w:t>5.8 Đánh giá tổng hợp</w:t>
       </w:r>
       <w:bookmarkEnd w:id="281"/>
       <w:bookmarkEnd w:id="282"/>
@@ -29025,7 +28374,7 @@
         <w:rPr>
           <w:rFonts w:ascii="Times New Roman" w:eastAsia="Times New Roman" w:hAnsi="Times New Roman" w:cs="Times New Roman"/>
         </w:rPr>
-        <w:t>5.10.1 Ưu điểm</w:t>
+        <w:t>5.8.1 Ưu điểm</w:t>
       </w:r>
       <w:bookmarkEnd w:id="284"/>
       <w:bookmarkEnd w:id="285"/>
@@ -29072,7 +28421,7 @@
         <w:rPr>
           <w:rFonts w:ascii="Times New Roman" w:eastAsia="Times New Roman" w:hAnsi="Times New Roman" w:cs="Times New Roman"/>
         </w:rPr>
-        <w:t>5.10.2 Hạn chế</w:t>
+        <w:t>5.8.2 Hạn chế</w:t>
       </w:r>
       <w:bookmarkEnd w:id="288"/>
       <w:bookmarkEnd w:id="289"/>
@@ -29139,7 +28488,7 @@
           <w:rFonts w:ascii="Times New Roman" w:eastAsia="Times New Roman" w:hAnsi="Times New Roman" w:cs="Times New Roman"/>
         </w:rPr>
         <w:lastRenderedPageBreak/>
-        <w:t>5.10.3 So sánh với giải pháp thương mại</w:t>
+        <w:t>5.8.3 So sánh với giải pháp thương mại</w:t>
       </w:r>
       <w:bookmarkEnd w:id="292"/>
       <w:bookmarkEnd w:id="293"/>
@@ -29161,7 +28510,7 @@
         </w:rPr>
       </w:pPr>
       <w:r>
-        <w:t>Bảng 19. So sánh định tính với một số giải pháp thương mại</w:t>
+        <w:t>Bảng 18. So sánh định tính với một số giải pháp thương mại</w:t>
       </w:r>
     </w:p>
     <w:tbl>
@@ -30285,7 +29634,7 @@
         <w:jc w:val="center"/>
       </w:pPr>
       <w:r>
-        <w:t>Bảng 20. Các vendor opcode của hệ thống</w:t>
+        <w:t>Bảng 19. Các vendor opcode của hệ thống</w:t>
       </w:r>
     </w:p>
     <w:tbl>
@@ -30518,7 +29867,7 @@
         <w:jc w:val="center"/>
       </w:pPr>
       <w:r>
-        <w:t>Bảng 21. Các mã định danh Bluetooth dùng trong hệ thống</w:t>
+        <w:t>Bảng 20. Các mã định danh Bluetooth dùng trong hệ thống</w:t>
       </w:r>
     </w:p>
     <w:tbl>

</xml_diff>

<commit_message>
[DOCS] finalize thesis formatting and consistency
</commit_message>
<xml_diff>
--- a/khoa-luan.docx
+++ b/khoa-luan.docx
@@ -700,49 +700,6 @@
     <w:p>
       <w:pPr>
         <w:tabs>
-          <w:tab w:val="left" w:pos="6570"/>
-          <w:tab w:val="left" w:pos="7380"/>
-          <w:tab w:val="left" w:pos="8640"/>
-        </w:tabs>
-        <w:ind w:right="175" w:firstLine="540"/>
-        <w:jc w:val="center"/>
-        <w:rPr>
-          <w:color w:val="943634"/>
-          <w:sz w:val="28"/>
-          <w:szCs w:val="28"/>
-        </w:rPr>
-      </w:pPr>
-      <w:r>
-        <w:rPr>
-          <w:rFonts w:ascii="Wingdings" w:eastAsia="Wingdings" w:hAnsi="Wingdings" w:cs="Wingdings"/>
-          <w:color w:val="943634"/>
-          <w:sz w:val="28"/>
-          <w:szCs w:val="28"/>
-        </w:rPr>
-        <w:sym w:font="Wingdings" w:char="F096"/>
-      </w:r>
-      <w:r>
-        <w:rPr>
-          <w:rFonts w:ascii="Wingdings" w:eastAsia="Wingdings" w:hAnsi="Wingdings" w:cs="Wingdings"/>
-          <w:color w:val="943634"/>
-          <w:sz w:val="28"/>
-          <w:szCs w:val="28"/>
-        </w:rPr>
-        <w:sym w:font="Wingdings" w:char="F026"/>
-      </w:r>
-      <w:r>
-        <w:rPr>
-          <w:rFonts w:ascii="Wingdings" w:eastAsia="Wingdings" w:hAnsi="Wingdings" w:cs="Wingdings"/>
-          <w:color w:val="943634"/>
-          <w:sz w:val="28"/>
-          <w:szCs w:val="28"/>
-        </w:rPr>
-        <w:sym w:font="Wingdings" w:char="F097"/>
-      </w:r>
-    </w:p>
-    <w:p>
-      <w:pPr>
-        <w:tabs>
           <w:tab w:val="left" w:pos="3630"/>
         </w:tabs>
         <w:jc w:val="center"/>
@@ -6551,7 +6508,7 @@
                 <w:noProof/>
                 <w:webHidden/>
               </w:rPr>
-              <w:t>30</w:t>
+              <w:t>29</w:t>
             </w:r>
             <w:r>
               <w:rPr>
@@ -6622,7 +6579,7 @@
                 <w:noProof/>
                 <w:webHidden/>
               </w:rPr>
-              <w:t>30</w:t>
+              <w:t>29</w:t>
             </w:r>
             <w:r>
               <w:rPr>
@@ -6693,7 +6650,7 @@
                 <w:noProof/>
                 <w:webHidden/>
               </w:rPr>
-              <w:t>30</w:t>
+              <w:t>29</w:t>
             </w:r>
             <w:r>
               <w:rPr>
@@ -6764,7 +6721,7 @@
                 <w:noProof/>
                 <w:webHidden/>
               </w:rPr>
-              <w:t>30</w:t>
+              <w:t>29</w:t>
             </w:r>
             <w:r>
               <w:rPr>
@@ -6835,7 +6792,7 @@
                 <w:noProof/>
                 <w:webHidden/>
               </w:rPr>
-              <w:t>31</w:t>
+              <w:t>30</w:t>
             </w:r>
             <w:r>
               <w:rPr>
@@ -6906,7 +6863,7 @@
                 <w:noProof/>
                 <w:webHidden/>
               </w:rPr>
-              <w:t>32</w:t>
+              <w:t>31</w:t>
             </w:r>
             <w:r>
               <w:rPr>
@@ -6977,7 +6934,7 @@
                 <w:noProof/>
                 <w:webHidden/>
               </w:rPr>
-              <w:t>33</w:t>
+              <w:t>32</w:t>
             </w:r>
             <w:r>
               <w:rPr>
@@ -7048,7 +7005,7 @@
                 <w:noProof/>
                 <w:webHidden/>
               </w:rPr>
-              <w:t>33</w:t>
+              <w:t>32</w:t>
             </w:r>
             <w:r>
               <w:rPr>
@@ -7119,7 +7076,7 @@
                 <w:noProof/>
                 <w:webHidden/>
               </w:rPr>
-              <w:t>33</w:t>
+              <w:t>32</w:t>
             </w:r>
             <w:r>
               <w:rPr>
@@ -7190,7 +7147,7 @@
                 <w:noProof/>
                 <w:webHidden/>
               </w:rPr>
-              <w:t>34</w:t>
+              <w:t>33</w:t>
             </w:r>
             <w:r>
               <w:rPr>
@@ -7261,7 +7218,7 @@
                 <w:noProof/>
                 <w:webHidden/>
               </w:rPr>
-              <w:t>34</w:t>
+              <w:t>33</w:t>
             </w:r>
             <w:r>
               <w:rPr>
@@ -7332,7 +7289,7 @@
                 <w:noProof/>
                 <w:webHidden/>
               </w:rPr>
-              <w:t>34</w:t>
+              <w:t>33</w:t>
             </w:r>
             <w:r>
               <w:rPr>
@@ -7403,7 +7360,7 @@
                 <w:noProof/>
                 <w:webHidden/>
               </w:rPr>
-              <w:t>37</w:t>
+              <w:t>36</w:t>
             </w:r>
             <w:r>
               <w:rPr>
@@ -7474,7 +7431,7 @@
                 <w:noProof/>
                 <w:webHidden/>
               </w:rPr>
-              <w:t>37</w:t>
+              <w:t>36</w:t>
             </w:r>
             <w:r>
               <w:rPr>
@@ -7545,7 +7502,7 @@
                 <w:noProof/>
                 <w:webHidden/>
               </w:rPr>
-              <w:t>37</w:t>
+              <w:t>36</w:t>
             </w:r>
             <w:r>
               <w:rPr>
@@ -7616,7 +7573,7 @@
                 <w:noProof/>
                 <w:webHidden/>
               </w:rPr>
-              <w:t>38</w:t>
+              <w:t>37</w:t>
             </w:r>
             <w:r>
               <w:rPr>
@@ -7687,7 +7644,7 @@
                 <w:noProof/>
                 <w:webHidden/>
               </w:rPr>
-              <w:t>40</w:t>
+              <w:t>39</w:t>
             </w:r>
             <w:r>
               <w:rPr>
@@ -7758,7 +7715,7 @@
                 <w:noProof/>
                 <w:webHidden/>
               </w:rPr>
-              <w:t>41</w:t>
+              <w:t>40</w:t>
             </w:r>
             <w:r>
               <w:rPr>
@@ -7829,7 +7786,7 @@
                 <w:noProof/>
                 <w:webHidden/>
               </w:rPr>
-              <w:t>41</w:t>
+              <w:t>40</w:t>
             </w:r>
             <w:r>
               <w:rPr>
@@ -7900,7 +7857,7 @@
                 <w:noProof/>
                 <w:webHidden/>
               </w:rPr>
-              <w:t>42</w:t>
+              <w:t>41</w:t>
             </w:r>
             <w:r>
               <w:rPr>
@@ -7971,7 +7928,7 @@
                 <w:noProof/>
                 <w:webHidden/>
               </w:rPr>
-              <w:t>43</w:t>
+              <w:t>42</w:t>
             </w:r>
             <w:r>
               <w:rPr>
@@ -8042,7 +7999,7 @@
                 <w:noProof/>
                 <w:webHidden/>
               </w:rPr>
-              <w:t>43</w:t>
+              <w:t>42</w:t>
             </w:r>
             <w:r>
               <w:rPr>
@@ -8113,7 +8070,7 @@
                 <w:noProof/>
                 <w:webHidden/>
               </w:rPr>
-              <w:t>43</w:t>
+              <w:t>42</w:t>
             </w:r>
             <w:r>
               <w:rPr>
@@ -8184,7 +8141,7 @@
                 <w:noProof/>
                 <w:webHidden/>
               </w:rPr>
-              <w:t>43</w:t>
+              <w:t>42</w:t>
             </w:r>
             <w:r>
               <w:rPr>
@@ -8255,7 +8212,7 @@
                 <w:noProof/>
                 <w:webHidden/>
               </w:rPr>
-              <w:t>44</w:t>
+              <w:t>43</w:t>
             </w:r>
             <w:r>
               <w:rPr>
@@ -8326,7 +8283,7 @@
                 <w:noProof/>
                 <w:webHidden/>
               </w:rPr>
-              <w:t>44</w:t>
+              <w:t>43</w:t>
             </w:r>
             <w:r>
               <w:rPr>
@@ -8397,7 +8354,7 @@
                 <w:noProof/>
                 <w:webHidden/>
               </w:rPr>
-              <w:t>44</w:t>
+              <w:t>43</w:t>
             </w:r>
             <w:r>
               <w:rPr>
@@ -8468,7 +8425,7 @@
                 <w:noProof/>
                 <w:webHidden/>
               </w:rPr>
-              <w:t>44</w:t>
+              <w:t>43</w:t>
             </w:r>
             <w:r>
               <w:rPr>
@@ -8539,7 +8496,7 @@
                 <w:noProof/>
                 <w:webHidden/>
               </w:rPr>
-              <w:t>45</w:t>
+              <w:t>44</w:t>
             </w:r>
             <w:r>
               <w:rPr>
@@ -8610,7 +8567,7 @@
                 <w:noProof/>
                 <w:webHidden/>
               </w:rPr>
-              <w:t>46</w:t>
+              <w:t>45</w:t>
             </w:r>
             <w:r>
               <w:rPr>
@@ -8681,7 +8638,7 @@
                 <w:noProof/>
                 <w:webHidden/>
               </w:rPr>
-              <w:t>46</w:t>
+              <w:t>45</w:t>
             </w:r>
             <w:r>
               <w:rPr>
@@ -8752,7 +8709,7 @@
                 <w:noProof/>
                 <w:webHidden/>
               </w:rPr>
-              <w:t>47</w:t>
+              <w:t>46</w:t>
             </w:r>
             <w:r>
               <w:rPr>
@@ -8823,7 +8780,7 @@
                 <w:noProof/>
                 <w:webHidden/>
               </w:rPr>
-              <w:t>47</w:t>
+              <w:t>46</w:t>
             </w:r>
             <w:r>
               <w:rPr>
@@ -8894,7 +8851,7 @@
                 <w:noProof/>
                 <w:webHidden/>
               </w:rPr>
-              <w:t>47</w:t>
+              <w:t>46</w:t>
             </w:r>
             <w:r>
               <w:rPr>
@@ -8965,7 +8922,7 @@
                 <w:noProof/>
                 <w:webHidden/>
               </w:rPr>
-              <w:t>48</w:t>
+              <w:t>47</w:t>
             </w:r>
             <w:r>
               <w:rPr>
@@ -9036,7 +8993,7 @@
                 <w:noProof/>
                 <w:webHidden/>
               </w:rPr>
-              <w:t>49</w:t>
+              <w:t>48</w:t>
             </w:r>
             <w:r>
               <w:rPr>
@@ -9107,7 +9064,7 @@
                 <w:noProof/>
                 <w:webHidden/>
               </w:rPr>
-              <w:t>50</w:t>
+              <w:t>49</w:t>
             </w:r>
             <w:r>
               <w:rPr>
@@ -13506,7 +13463,7 @@
       </w:r>
       <w:r>
         <w:tab/>
-        <w:t>30</w:t>
+        <w:t>29</w:t>
       </w:r>
     </w:p>
     <w:p>
@@ -13518,7 +13475,7 @@
       </w:r>
       <w:r>
         <w:tab/>
-        <w:t>32</w:t>
+        <w:t>31</w:t>
       </w:r>
     </w:p>
     <w:p>
@@ -13530,7 +13487,7 @@
       </w:r>
       <w:r>
         <w:tab/>
-        <w:t>36</w:t>
+        <w:t>35</w:t>
       </w:r>
     </w:p>
     <w:p>
@@ -13542,7 +13499,7 @@
       </w:r>
       <w:r>
         <w:tab/>
-        <w:t>36</w:t>
+        <w:t>35</w:t>
       </w:r>
     </w:p>
     <w:p>
@@ -13554,7 +13511,7 @@
       </w:r>
       <w:r>
         <w:tab/>
-        <w:t>36</w:t>
+        <w:t>35</w:t>
       </w:r>
     </w:p>
     <w:p>
@@ -13566,7 +13523,7 @@
       </w:r>
       <w:r>
         <w:tab/>
-        <w:t>42</w:t>
+        <w:t>41</w:t>
       </w:r>
     </w:p>
     <w:p>
@@ -13657,7 +13614,7 @@
       </w:r>
       <w:r>
         <w:tab/>
-        <w:t>30</w:t>
+        <w:t>29</w:t>
       </w:r>
     </w:p>
     <w:p>
@@ -13666,6 +13623,30 @@
       </w:pPr>
       <w:r>
         <w:t>Bảng 6. Các phiên ground truth được sử dụng</w:t>
+      </w:r>
+      <w:r>
+        <w:tab/>
+        <w:t>32</w:t>
+      </w:r>
+    </w:p>
+    <w:p>
+      <w:pPr>
+        <w:pStyle w:val="TableofFigures"/>
+      </w:pPr>
+      <w:r>
+        <w:t>Bảng 7. Phân bố mẫu đánh giá và coverage theo phòng của ba phiên</w:t>
+      </w:r>
+      <w:r>
+        <w:tab/>
+        <w:t>32</w:t>
+      </w:r>
+    </w:p>
+    <w:p>
+      <w:pPr>
+        <w:pStyle w:val="TableofFigures"/>
+      </w:pPr>
+      <w:r>
+        <w:t>Bảng 8. Thống kê RSSI của ba scanner khi Tag được đặt cố định theo phòng</w:t>
       </w:r>
       <w:r>
         <w:tab/>
@@ -13677,11 +13658,11 @@
         <w:pStyle w:val="TableofFigures"/>
       </w:pPr>
       <w:r>
-        <w:t>Bảng 7. Phân bố mẫu đánh giá và coverage theo phòng của ba phiên</w:t>
+        <w:t>Bảng 9. Thời gian khởi động và đưa hệ thống vào hoạt động</w:t>
       </w:r>
       <w:r>
         <w:tab/>
-        <w:t>33</w:t>
+        <w:t>36</w:t>
       </w:r>
     </w:p>
     <w:p>
@@ -13689,19 +13670,7 @@
         <w:pStyle w:val="TableofFigures"/>
       </w:pPr>
       <w:r>
-        <w:t>Bảng 8. Thống kê RSSI của ba scanner khi Tag được đặt cố định theo phòng</w:t>
-      </w:r>
-      <w:r>
-        <w:tab/>
-        <w:t>34</w:t>
-      </w:r>
-    </w:p>
-    <w:p>
-      <w:pPr>
-        <w:pStyle w:val="TableofFigures"/>
-      </w:pPr>
-      <w:r>
-        <w:t>Bảng 9. Thời gian khởi động và đưa hệ thống vào hoạt động</w:t>
+        <w:t>Bảng 10. Tóm tắt kết quả định vị của Phiên 1</w:t>
       </w:r>
       <w:r>
         <w:tab/>
@@ -13713,7 +13682,19 @@
         <w:pStyle w:val="TableofFigures"/>
       </w:pPr>
       <w:r>
-        <w:t>Bảng 10. Tóm tắt kết quả định vị của Phiên 1</w:t>
+        <w:t>Bảng 11. Tóm tắt kết quả định vị của Phiên 2</w:t>
+      </w:r>
+      <w:r>
+        <w:tab/>
+        <w:t>37</w:t>
+      </w:r>
+    </w:p>
+    <w:p>
+      <w:pPr>
+        <w:pStyle w:val="TableofFigures"/>
+      </w:pPr>
+      <w:r>
+        <w:t>Bảng 12. Tóm tắt kết quả định vị của Phiên 3</w:t>
       </w:r>
       <w:r>
         <w:tab/>
@@ -13725,19 +13706,7 @@
         <w:pStyle w:val="TableofFigures"/>
       </w:pPr>
       <w:r>
-        <w:t>Bảng 11. Tóm tắt kết quả định vị của Phiên 2</w:t>
-      </w:r>
-      <w:r>
-        <w:tab/>
-        <w:t>38</w:t>
-      </w:r>
-    </w:p>
-    <w:p>
-      <w:pPr>
-        <w:pStyle w:val="TableofFigures"/>
-      </w:pPr>
-      <w:r>
-        <w:t>Bảng 12. Tóm tắt kết quả định vị của Phiên 3</w:t>
+        <w:t>Bảng 13. Ma trận nhầm lẫn gộp của ba phiên đo</w:t>
       </w:r>
       <w:r>
         <w:tab/>
@@ -13749,7 +13718,19 @@
         <w:pStyle w:val="TableofFigures"/>
       </w:pPr>
       <w:r>
-        <w:t>Bảng 13. Ma trận nhầm lẫn gộp của ba phiên đo</w:t>
+        <w:t>Bảng 14. Precision, recall và F1-score theo từng phòng</w:t>
+      </w:r>
+      <w:r>
+        <w:tab/>
+        <w:t>39</w:t>
+      </w:r>
+    </w:p>
+    <w:p>
+      <w:pPr>
+        <w:pStyle w:val="TableofFigures"/>
+      </w:pPr>
+      <w:r>
+        <w:t>Bảng 15. Số lần flap trong 5 phút tại biên phòng</w:t>
       </w:r>
       <w:r>
         <w:tab/>
@@ -13761,19 +13742,7 @@
         <w:pStyle w:val="TableofFigures"/>
       </w:pPr>
       <w:r>
-        <w:t>Bảng 14. Precision, recall và F1-score theo từng phòng</w:t>
-      </w:r>
-      <w:r>
-        <w:tab/>
-        <w:t>40</w:t>
-      </w:r>
-    </w:p>
-    <w:p>
-      <w:pPr>
-        <w:pStyle w:val="TableofFigures"/>
-      </w:pPr>
-      <w:r>
-        <w:t>Bảng 15. Số lần flap trong 5 phút tại biên phòng</w:t>
+        <w:t>Bảng 16. Thống kê độ trễ chuyển phòng của ba phiên đo</w:t>
       </w:r>
       <w:r>
         <w:tab/>
@@ -13785,7 +13754,7 @@
         <w:pStyle w:val="TableofFigures"/>
       </w:pPr>
       <w:r>
-        <w:t>Bảng 16. Thống kê độ trễ chuyển phòng của ba phiên đo</w:t>
+        <w:t>Bảng 17. Kết quả flapping trong 35 cửa sổ sau Grace</w:t>
       </w:r>
       <w:r>
         <w:tab/>
@@ -13797,11 +13766,11 @@
         <w:pStyle w:val="TableofFigures"/>
       </w:pPr>
       <w:r>
-        <w:t>Bảng 17. Kết quả flapping trong 35 cửa sổ sau Grace</w:t>
+        <w:t>Bảng 18. So sánh định tính với một số giải pháp thương mại</w:t>
       </w:r>
       <w:r>
         <w:tab/>
-        <w:t>43</w:t>
+        <w:t>44</w:t>
       </w:r>
     </w:p>
     <w:p>
@@ -13809,11 +13778,11 @@
         <w:pStyle w:val="TableofFigures"/>
       </w:pPr>
       <w:r>
-        <w:t>Bảng 18. So sánh định tính với một số giải pháp thương mại</w:t>
+        <w:t>Bảng 19. Các vendor opcode của hệ thống</w:t>
       </w:r>
       <w:r>
         <w:tab/>
-        <w:t>45</w:t>
+        <w:t>49</w:t>
       </w:r>
     </w:p>
     <w:p>
@@ -13821,23 +13790,11 @@
         <w:pStyle w:val="TableofFigures"/>
       </w:pPr>
       <w:r>
-        <w:t>Bảng 19. Các vendor opcode của hệ thống</w:t>
+        <w:t>Bảng 20. Các mã định danh Bluetooth dùng trong hệ thống</w:t>
       </w:r>
       <w:r>
         <w:tab/>
-        <w:t>50</w:t>
-      </w:r>
-    </w:p>
-    <w:p>
-      <w:pPr>
-        <w:pStyle w:val="TableofFigures"/>
-      </w:pPr>
-      <w:r>
-        <w:t>Bảng 20. Các mã định danh Bluetooth dùng trong hệ thống</w:t>
-      </w:r>
-      <w:r>
-        <w:tab/>
-        <w:t>50</w:t>
+        <w:t>49</w:t>
       </w:r>
     </w:p>
     <w:p>
@@ -18859,7 +18816,7 @@
     <w:p>
       <w:pPr>
         <w:pStyle w:val="Caption"/>
-        <w:keepNext/>
+        <w:keepNext w:val="0"/>
         <w:spacing w:before="60" w:after="120"/>
         <w:ind w:firstLine="0"/>
         <w:jc w:val="center"/>
@@ -18872,22 +18829,6 @@
       <w:r>
         <w:t>Hình 8. Trạng thái kết nối của Gateway, Scanner và Tag trên ThingsBoard</w:t>
       </w:r>
-    </w:p>
-    <w:p>
-      <w:pPr>
-        <w:spacing w:line="240" w:lineRule="auto"/>
-      </w:pPr>
-    </w:p>
-    <w:p/>
-    <w:p/>
-    <w:p/>
-    <w:p>
-      <w:pPr>
-        <w:ind w:firstLine="0"/>
-        <w:rPr>
-          <w:lang w:val="vi-VN"/>
-        </w:rPr>
-      </w:pPr>
     </w:p>
     <w:p>
       <w:pPr>

</xml_diff>